<commit_message>
Project state snapshot on Kevin branch
</commit_message>
<xml_diff>
--- a/dokumentacio/alakulodokumentacio.docx
+++ b/dokumentacio/alakulodokumentacio.docx
@@ -179,6 +179,13 @@
     </w:p>
     <w:sdt>
       <w:sdtPr>
+        <w:rPr>
+          <w:rFonts w:asciiTheme="minorHAnsi" w:eastAsiaTheme="minorEastAsia" w:hAnsiTheme="minorHAnsi" w:cstheme="minorHAnsi"/>
+          <w:color w:val="auto"/>
+          <w:sz w:val="24"/>
+          <w:szCs w:val="20"/>
+          <w:lang w:eastAsia="en-US"/>
+        </w:rPr>
         <w:id w:val="1272205547"/>
         <w:docPartObj>
           <w:docPartGallery w:val="Table of Contents"/>
@@ -187,13 +194,8 @@
       </w:sdtPr>
       <w:sdtEndPr>
         <w:rPr>
-          <w:rFonts w:asciiTheme="minorHAnsi" w:eastAsiaTheme="minorEastAsia" w:hAnsiTheme="minorHAnsi" w:cstheme="minorHAnsi"/>
           <w:b/>
           <w:bCs/>
-          <w:color w:val="auto"/>
-          <w:sz w:val="24"/>
-          <w:szCs w:val="20"/>
-          <w:lang w:eastAsia="en-US"/>
         </w:rPr>
       </w:sdtEndPr>
       <w:sdtContent>
@@ -3258,6 +3260,7 @@
         <w:rPr>
           <w:b/>
           <w:bCs/>
+          <w:noProof/>
         </w:rPr>
         <w:drawing>
           <wp:inline distT="0" distB="0" distL="0" distR="0" wp14:anchorId="42A30D0D" wp14:editId="335A3E58">
@@ -3330,6 +3333,7 @@
       <w:r>
         <w:rPr>
           <w:rStyle w:val="Cmsor3Char"/>
+          <w:noProof/>
         </w:rPr>
         <w:drawing>
           <wp:anchor distT="0" distB="0" distL="114300" distR="114300" simplePos="0" relativeHeight="251658240" behindDoc="0" locked="0" layoutInCell="1" allowOverlap="1" wp14:anchorId="78DBE305" wp14:editId="417D13F0">
@@ -3600,13 +3604,7 @@
         <w:rPr>
           <w:rStyle w:val="Cmsor3Char"/>
         </w:rPr>
-        <w:t> </w:t>
-      </w:r>
-      <w:r>
-        <w:rPr>
-          <w:rStyle w:val="Cmsor3Char"/>
-        </w:rPr>
-        <w:t>tábla</w:t>
+        <w:t> tábla</w:t>
       </w:r>
       <w:r>
         <w:rPr>
@@ -3868,6 +3866,9 @@
     </w:p>
     <w:p>
       <w:r>
+        <w:rPr>
+          <w:noProof/>
+        </w:rPr>
         <w:drawing>
           <wp:anchor distT="0" distB="0" distL="114300" distR="114300" simplePos="0" relativeHeight="251660288" behindDoc="0" locked="0" layoutInCell="1" allowOverlap="1" wp14:anchorId="7F46E36F" wp14:editId="21236D48">
             <wp:simplePos x="0" y="0"/>
@@ -4015,13 +4016,8 @@
       </w:r>
       <w:proofErr w:type="spellEnd"/>
       <w:r>
-        <w:t xml:space="preserve"> mezőben pedig további megjegyzések adhatók </w:t>
-      </w:r>
-      <w:proofErr w:type="spellStart"/>
-      <w:r>
-        <w:t>meg.</w:t>
-      </w:r>
-      <w:proofErr w:type="spellEnd"/>
+        <w:t> mezőben pedig további megjegyzések adhatók meg.</w:t>
+      </w:r>
     </w:p>
     <w:p>
       <w:r>
@@ -4081,6 +4077,9 @@
     </w:p>
     <w:p>
       <w:r>
+        <w:rPr>
+          <w:noProof/>
+        </w:rPr>
         <w:drawing>
           <wp:anchor distT="0" distB="0" distL="114300" distR="114300" simplePos="0" relativeHeight="251661312" behindDoc="0" locked="0" layoutInCell="1" allowOverlap="1" wp14:anchorId="6DACD3EF" wp14:editId="1445B5EA">
             <wp:simplePos x="0" y="0"/>
@@ -4263,6 +4262,9 @@
     </w:p>
     <w:p>
       <w:r>
+        <w:rPr>
+          <w:noProof/>
+        </w:rPr>
         <w:drawing>
           <wp:anchor distT="0" distB="0" distL="114300" distR="114300" simplePos="0" relativeHeight="251662336" behindDoc="0" locked="0" layoutInCell="1" allowOverlap="1" wp14:anchorId="5D623AE4" wp14:editId="5DE640F3">
             <wp:simplePos x="0" y="0"/>
@@ -5099,10 +5101,25 @@
     </w:p>
     <w:p>
       <w:pPr>
+        <w:spacing w:before="0" w:after="160" w:line="278" w:lineRule="auto"/>
+        <w:rPr>
+          <w:rFonts w:asciiTheme="majorHAnsi" w:eastAsiaTheme="majorEastAsia" w:hAnsiTheme="majorHAnsi" w:cstheme="majorBidi"/>
+          <w:color w:val="0F4761" w:themeColor="accent1" w:themeShade="BF"/>
+          <w:sz w:val="40"/>
+          <w:szCs w:val="40"/>
+        </w:rPr>
+      </w:pPr>
+      <w:bookmarkStart w:id="14" w:name="_Toc225302256"/>
+      <w:r>
+        <w:br w:type="page"/>
+      </w:r>
+    </w:p>
+    <w:p>
+      <w:pPr>
         <w:pStyle w:val="Cmsor1"/>
       </w:pPr>
-      <w:bookmarkStart w:id="14" w:name="_Toc225302256"/>
-      <w:r>
+      <w:r>
+        <w:lastRenderedPageBreak/>
         <w:t>9. TESZTELÉS</w:t>
       </w:r>
       <w:bookmarkEnd w:id="14"/>
@@ -5194,7 +5211,6 @@
           <w:p>
             <w:proofErr w:type="spellStart"/>
             <w:r>
-              <w:lastRenderedPageBreak/>
               <w:t>tesztauto@test</w:t>
             </w:r>
             <w:proofErr w:type="spellEnd"/>
@@ -5523,255 +5539,254 @@
         </w:numPr>
       </w:pPr>
       <w:r>
+        <w:t>adatbázis-tervezésben,</w:t>
+      </w:r>
+    </w:p>
+    <w:p>
+      <w:pPr>
+        <w:pStyle w:val="Listaszerbekezds"/>
+        <w:numPr>
+          <w:ilvl w:val="0"/>
+          <w:numId w:val="15"/>
+        </w:numPr>
+      </w:pPr>
+      <w:r>
+        <w:t>backend API-fejlesztésben,</w:t>
+      </w:r>
+    </w:p>
+    <w:p>
+      <w:pPr>
+        <w:pStyle w:val="Listaszerbekezds"/>
+        <w:numPr>
+          <w:ilvl w:val="0"/>
+          <w:numId w:val="15"/>
+        </w:numPr>
+      </w:pPr>
+      <w:r>
+        <w:t>frontend felhasználói felületek kialakításában,</w:t>
+      </w:r>
+    </w:p>
+    <w:p>
+      <w:pPr>
+        <w:pStyle w:val="Listaszerbekezds"/>
+        <w:numPr>
+          <w:ilvl w:val="0"/>
+          <w:numId w:val="15"/>
+        </w:numPr>
+      </w:pPr>
+      <w:r>
+        <w:t>térképes és helyalapú szolgáltatások integrálásában,</w:t>
+      </w:r>
+    </w:p>
+    <w:p>
+      <w:pPr>
+        <w:pStyle w:val="Listaszerbekezds"/>
+        <w:numPr>
+          <w:ilvl w:val="0"/>
+          <w:numId w:val="15"/>
+        </w:numPr>
+      </w:pPr>
+      <w:r>
+        <w:t>együttműködésen alapuló projektmunkában.</w:t>
+      </w:r>
+    </w:p>
+    <w:p>
+      <w:r>
+        <w:t xml:space="preserve">A </w:t>
+      </w:r>
+      <w:proofErr w:type="spellStart"/>
+      <w:r>
+        <w:t>ResQ</w:t>
+      </w:r>
+      <w:proofErr w:type="spellEnd"/>
+      <w:r>
+        <w:t xml:space="preserve"> számunkra nemcsak egy sikeres vizsgaprojekt, hanem olyan szakmai mérföldkő is, amelyre a jövőbeli tanulmányaink és munkánk során is tudunk építeni.</w:t>
+      </w:r>
+    </w:p>
+    <w:p/>
+    <w:p>
+      <w:pPr>
+        <w:pStyle w:val="Cmsor1"/>
+      </w:pPr>
+      <w:bookmarkStart w:id="16" w:name="_Toc225302258"/>
+      <w:r>
+        <w:t>11. BIZTONSÁG</w:t>
+      </w:r>
+      <w:bookmarkEnd w:id="16"/>
+    </w:p>
+    <w:p>
+      <w:r>
+        <w:t>A rendszer tervezésénél kiemelt szempont volt az adatvédelem, a jogosultságok ellenőrzése és a megbízható működés.</w:t>
+      </w:r>
+    </w:p>
+    <w:p/>
+    <w:p>
+      <w:pPr>
+        <w:pStyle w:val="Cmsor2"/>
+      </w:pPr>
+      <w:bookmarkStart w:id="17" w:name="_Toc225302259"/>
+      <w:r>
+        <w:t>11.1 Hitelesítés és jogosultság</w:t>
+      </w:r>
+      <w:bookmarkEnd w:id="17"/>
+    </w:p>
+    <w:p>
+      <w:r>
+        <w:t xml:space="preserve">JWT </w:t>
+      </w:r>
+      <w:proofErr w:type="spellStart"/>
+      <w:r>
+        <w:t>token</w:t>
+      </w:r>
+      <w:proofErr w:type="spellEnd"/>
+      <w:r>
+        <w:t xml:space="preserve"> alapú hitelesítés</w:t>
+      </w:r>
+    </w:p>
+    <w:p>
+      <w:r>
+        <w:t>szerepkör-alapú hozzáférés (</w:t>
+      </w:r>
+      <w:proofErr w:type="spellStart"/>
+      <w:r>
+        <w:t>User</w:t>
+      </w:r>
+      <w:proofErr w:type="spellEnd"/>
+      <w:r>
+        <w:t xml:space="preserve">, </w:t>
+      </w:r>
+      <w:proofErr w:type="spellStart"/>
+      <w:r>
+        <w:t>Provider</w:t>
+      </w:r>
+      <w:proofErr w:type="spellEnd"/>
+      <w:r>
+        <w:t xml:space="preserve">, </w:t>
+      </w:r>
+      <w:proofErr w:type="spellStart"/>
+      <w:r>
+        <w:t>Admin</w:t>
+      </w:r>
+      <w:proofErr w:type="spellEnd"/>
+      <w:r>
+        <w:t>)</w:t>
+      </w:r>
+    </w:p>
+    <w:p>
+      <w:r>
+        <w:t xml:space="preserve">védett API-végpontok </w:t>
+      </w:r>
+      <w:proofErr w:type="spellStart"/>
+      <w:r>
+        <w:t>tokenellenőrzéssel</w:t>
+      </w:r>
+      <w:proofErr w:type="spellEnd"/>
+    </w:p>
+    <w:p>
+      <w:pPr>
+        <w:pStyle w:val="Cmsor2"/>
+      </w:pPr>
+      <w:bookmarkStart w:id="18" w:name="_Toc225302260"/>
+      <w:r>
+        <w:t>11.2 Jelszó- és fiókbiztonság</w:t>
+      </w:r>
+      <w:bookmarkEnd w:id="18"/>
+    </w:p>
+    <w:p>
+      <w:r>
+        <w:t xml:space="preserve">jelszavak </w:t>
+      </w:r>
+      <w:proofErr w:type="spellStart"/>
+      <w:r>
+        <w:t>hash</w:t>
+      </w:r>
+      <w:proofErr w:type="spellEnd"/>
+      <w:r>
+        <w:t xml:space="preserve"> formában tárolva</w:t>
+      </w:r>
+    </w:p>
+    <w:p>
+      <w:r>
+        <w:t xml:space="preserve">jelszó-visszaállítás ideiglenes </w:t>
+      </w:r>
+      <w:proofErr w:type="spellStart"/>
+      <w:r>
+        <w:t>tokenekkel</w:t>
+      </w:r>
+      <w:proofErr w:type="spellEnd"/>
+    </w:p>
+    <w:p>
+      <w:proofErr w:type="spellStart"/>
+      <w:r>
+        <w:t>token</w:t>
+      </w:r>
+      <w:proofErr w:type="spellEnd"/>
+      <w:r>
+        <w:t xml:space="preserve"> lejárati idő kezelése</w:t>
+      </w:r>
+    </w:p>
+    <w:p>
+      <w:pPr>
+        <w:pStyle w:val="Cmsor2"/>
+      </w:pPr>
+      <w:bookmarkStart w:id="19" w:name="_Toc225302261"/>
+      <w:r>
+        <w:t>11.3 Bemeneti ellenőrzés</w:t>
+      </w:r>
+      <w:bookmarkEnd w:id="19"/>
+    </w:p>
+    <w:p>
+      <w:r>
+        <w:t xml:space="preserve">kötelező mezők </w:t>
+      </w:r>
+      <w:proofErr w:type="spellStart"/>
+      <w:r>
+        <w:t>validálása</w:t>
+      </w:r>
+      <w:proofErr w:type="spellEnd"/>
+    </w:p>
+    <w:p>
+      <w:r>
+        <w:t>adattípus-ellenőrzés</w:t>
+      </w:r>
+    </w:p>
+    <w:p>
+      <w:r>
+        <w:t>jogosultság és státuszátmenet ellenőrzése</w:t>
+      </w:r>
+    </w:p>
+    <w:p>
+      <w:pPr>
+        <w:pStyle w:val="Cmsor2"/>
+      </w:pPr>
+      <w:bookmarkStart w:id="20" w:name="_Toc225302262"/>
+      <w:r>
         <w:lastRenderedPageBreak/>
-        <w:t>adatbázis-tervezésben,</w:t>
-      </w:r>
-    </w:p>
-    <w:p>
-      <w:pPr>
-        <w:pStyle w:val="Listaszerbekezds"/>
-        <w:numPr>
-          <w:ilvl w:val="0"/>
-          <w:numId w:val="15"/>
-        </w:numPr>
-      </w:pPr>
-      <w:r>
-        <w:t>backend API-fejlesztésben,</w:t>
-      </w:r>
-    </w:p>
-    <w:p>
-      <w:pPr>
-        <w:pStyle w:val="Listaszerbekezds"/>
-        <w:numPr>
-          <w:ilvl w:val="0"/>
-          <w:numId w:val="15"/>
-        </w:numPr>
-      </w:pPr>
-      <w:r>
-        <w:t>frontend felhasználói felületek kialakításában,</w:t>
-      </w:r>
-    </w:p>
-    <w:p>
-      <w:pPr>
-        <w:pStyle w:val="Listaszerbekezds"/>
-        <w:numPr>
-          <w:ilvl w:val="0"/>
-          <w:numId w:val="15"/>
-        </w:numPr>
-      </w:pPr>
-      <w:r>
-        <w:t>térképes és helyalapú szolgáltatások integrálásában,</w:t>
-      </w:r>
-    </w:p>
-    <w:p>
-      <w:pPr>
-        <w:pStyle w:val="Listaszerbekezds"/>
-        <w:numPr>
-          <w:ilvl w:val="0"/>
-          <w:numId w:val="15"/>
-        </w:numPr>
-      </w:pPr>
-      <w:r>
-        <w:t>együttműködésen alapuló projektmunkában.</w:t>
-      </w:r>
-    </w:p>
-    <w:p>
-      <w:r>
-        <w:t xml:space="preserve">A </w:t>
-      </w:r>
-      <w:proofErr w:type="spellStart"/>
-      <w:r>
-        <w:t>ResQ</w:t>
-      </w:r>
-      <w:proofErr w:type="spellEnd"/>
-      <w:r>
-        <w:t xml:space="preserve"> számunkra nemcsak egy sikeres vizsgaprojekt, hanem olyan szakmai mérföldkő is, amelyre a jövőbeli tanulmányaink és munkánk során is tudunk építeni.</w:t>
-      </w:r>
-    </w:p>
-    <w:p/>
+        <w:t>11.4 Adatintegritás</w:t>
+      </w:r>
+      <w:bookmarkEnd w:id="20"/>
+    </w:p>
+    <w:p>
+      <w:r>
+        <w:t>relációs kulcsok és megszorítások</w:t>
+      </w:r>
+    </w:p>
+    <w:p>
+      <w:r>
+        <w:t>konzisztens állapotkezelés</w:t>
+      </w:r>
+    </w:p>
+    <w:p>
+      <w:r>
+        <w:t>naplózható státusz- és üzenetműveletek</w:t>
+      </w:r>
+    </w:p>
     <w:p>
       <w:pPr>
         <w:pStyle w:val="Cmsor1"/>
       </w:pPr>
-      <w:bookmarkStart w:id="16" w:name="_Toc225302258"/>
-      <w:r>
-        <w:t>11. BIZTONSÁG</w:t>
-      </w:r>
-      <w:bookmarkEnd w:id="16"/>
-    </w:p>
-    <w:p>
-      <w:r>
-        <w:t>A rendszer tervezésénél kiemelt szempont volt az adatvédelem, a jogosultságok ellenőrzése és a megbízható működés.</w:t>
-      </w:r>
-    </w:p>
-    <w:p/>
-    <w:p>
-      <w:pPr>
-        <w:pStyle w:val="Cmsor2"/>
-      </w:pPr>
-      <w:bookmarkStart w:id="17" w:name="_Toc225302259"/>
-      <w:r>
-        <w:t>11.1 Hitelesítés és jogosultság</w:t>
-      </w:r>
-      <w:bookmarkEnd w:id="17"/>
-    </w:p>
-    <w:p>
-      <w:r>
-        <w:t xml:space="preserve">JWT </w:t>
-      </w:r>
-      <w:proofErr w:type="spellStart"/>
-      <w:r>
-        <w:t>token</w:t>
-      </w:r>
-      <w:proofErr w:type="spellEnd"/>
-      <w:r>
-        <w:t xml:space="preserve"> alapú hitelesítés</w:t>
-      </w:r>
-    </w:p>
-    <w:p>
-      <w:r>
-        <w:t>szerepkör-alapú hozzáférés (</w:t>
-      </w:r>
-      <w:proofErr w:type="spellStart"/>
-      <w:r>
-        <w:t>User</w:t>
-      </w:r>
-      <w:proofErr w:type="spellEnd"/>
-      <w:r>
-        <w:t xml:space="preserve">, </w:t>
-      </w:r>
-      <w:proofErr w:type="spellStart"/>
-      <w:r>
-        <w:t>Provider</w:t>
-      </w:r>
-      <w:proofErr w:type="spellEnd"/>
-      <w:r>
-        <w:t xml:space="preserve">, </w:t>
-      </w:r>
-      <w:proofErr w:type="spellStart"/>
-      <w:r>
-        <w:t>Admin</w:t>
-      </w:r>
-      <w:proofErr w:type="spellEnd"/>
-      <w:r>
-        <w:t>)</w:t>
-      </w:r>
-    </w:p>
-    <w:p>
-      <w:r>
-        <w:t xml:space="preserve">védett API-végpontok </w:t>
-      </w:r>
-      <w:proofErr w:type="spellStart"/>
-      <w:r>
-        <w:t>tokenellenőrzéssel</w:t>
-      </w:r>
-      <w:proofErr w:type="spellEnd"/>
-    </w:p>
-    <w:p>
-      <w:pPr>
-        <w:pStyle w:val="Cmsor2"/>
-      </w:pPr>
-      <w:bookmarkStart w:id="18" w:name="_Toc225302260"/>
-      <w:r>
-        <w:t>11.2 Jelszó- és fiókbiztonság</w:t>
-      </w:r>
-      <w:bookmarkEnd w:id="18"/>
-    </w:p>
-    <w:p>
-      <w:r>
-        <w:t xml:space="preserve">jelszavak </w:t>
-      </w:r>
-      <w:proofErr w:type="spellStart"/>
-      <w:r>
-        <w:t>hash</w:t>
-      </w:r>
-      <w:proofErr w:type="spellEnd"/>
-      <w:r>
-        <w:t xml:space="preserve"> formában tárolva</w:t>
-      </w:r>
-    </w:p>
-    <w:p>
-      <w:r>
-        <w:t xml:space="preserve">jelszó-visszaállítás ideiglenes </w:t>
-      </w:r>
-      <w:proofErr w:type="spellStart"/>
-      <w:r>
-        <w:t>tokenekkel</w:t>
-      </w:r>
-      <w:proofErr w:type="spellEnd"/>
-    </w:p>
-    <w:p>
-      <w:proofErr w:type="spellStart"/>
-      <w:r>
-        <w:t>token</w:t>
-      </w:r>
-      <w:proofErr w:type="spellEnd"/>
-      <w:r>
-        <w:t xml:space="preserve"> lejárati idő kezelése</w:t>
-      </w:r>
-    </w:p>
-    <w:p>
-      <w:pPr>
-        <w:pStyle w:val="Cmsor2"/>
-      </w:pPr>
-      <w:bookmarkStart w:id="19" w:name="_Toc225302261"/>
-      <w:r>
-        <w:t>11.3 Bemeneti ellenőrzés</w:t>
-      </w:r>
-      <w:bookmarkEnd w:id="19"/>
-    </w:p>
-    <w:p>
-      <w:r>
-        <w:t xml:space="preserve">kötelező mezők </w:t>
-      </w:r>
-      <w:proofErr w:type="spellStart"/>
-      <w:r>
-        <w:t>validálása</w:t>
-      </w:r>
-      <w:proofErr w:type="spellEnd"/>
-    </w:p>
-    <w:p>
-      <w:r>
-        <w:t>adattípus-ellenőrzés</w:t>
-      </w:r>
-    </w:p>
-    <w:p>
-      <w:r>
-        <w:t>jogosultság és státuszátmenet ellenőrzése</w:t>
-      </w:r>
-    </w:p>
-    <w:p>
-      <w:pPr>
-        <w:pStyle w:val="Cmsor2"/>
-      </w:pPr>
-      <w:bookmarkStart w:id="20" w:name="_Toc225302262"/>
-      <w:r>
-        <w:t>11.4 Adatintegritás</w:t>
-      </w:r>
-      <w:bookmarkEnd w:id="20"/>
-    </w:p>
-    <w:p>
-      <w:r>
-        <w:t>relációs kulcsok és megszorítások</w:t>
-      </w:r>
-    </w:p>
-    <w:p>
-      <w:r>
-        <w:t>konzisztens állapotkezelés</w:t>
-      </w:r>
-    </w:p>
-    <w:p>
-      <w:r>
-        <w:t>naplózható státusz- és üzenetműveletek</w:t>
-      </w:r>
-    </w:p>
-    <w:p>
-      <w:pPr>
-        <w:pStyle w:val="Cmsor1"/>
-      </w:pPr>
       <w:bookmarkStart w:id="21" w:name="_Toc225302263"/>
       <w:r>
-        <w:lastRenderedPageBreak/>
         <w:t>12. API-DOKUMENTÁCIÓ ÖSSZEFOGLALÓ</w:t>
       </w:r>
       <w:bookmarkEnd w:id="21"/>
@@ -6274,6 +6289,7 @@
       </w:pPr>
       <w:proofErr w:type="spellStart"/>
       <w:r>
+        <w:lastRenderedPageBreak/>
         <w:t>push</w:t>
       </w:r>
       <w:proofErr w:type="spellEnd"/>
@@ -6363,241 +6379,240 @@
       </w:pPr>
       <w:bookmarkStart w:id="23" w:name="_Toc225302265"/>
       <w:r>
+        <w:t>14. MELLÉKLETEK</w:t>
+      </w:r>
+      <w:bookmarkEnd w:id="23"/>
+    </w:p>
+    <w:p>
+      <w:pPr>
+        <w:pStyle w:val="Cmsor2"/>
+      </w:pPr>
+      <w:bookmarkStart w:id="24" w:name="_Toc225302266"/>
+      <w:r>
+        <w:t>14.1 Javasolt képernyőképek</w:t>
+      </w:r>
+      <w:bookmarkEnd w:id="24"/>
+    </w:p>
+    <w:p>
+      <w:r>
+        <w:t>bejelentkezés/regisztráció,</w:t>
+      </w:r>
+    </w:p>
+    <w:p>
+      <w:r>
+        <w:t>felhasználói térképes nézet,</w:t>
+      </w:r>
+    </w:p>
+    <w:p>
+      <w:r>
+        <w:t>szolgáltatói kezelőpanel,</w:t>
+      </w:r>
+    </w:p>
+    <w:p>
+      <w:r>
+        <w:t>aktív mentés státusz nézet,</w:t>
+      </w:r>
+    </w:p>
+    <w:p>
+      <w:r>
+        <w:t>chatfelület,</w:t>
+      </w:r>
+    </w:p>
+    <w:p>
+      <w:proofErr w:type="spellStart"/>
+      <w:r>
+        <w:t>admin</w:t>
+      </w:r>
+      <w:proofErr w:type="spellEnd"/>
+      <w:r>
+        <w:t xml:space="preserve"> </w:t>
+      </w:r>
+      <w:proofErr w:type="spellStart"/>
+      <w:r>
+        <w:t>support</w:t>
+      </w:r>
+      <w:proofErr w:type="spellEnd"/>
+      <w:r>
+        <w:t xml:space="preserve"> felület.</w:t>
+      </w:r>
+    </w:p>
+    <w:p>
+      <w:pPr>
+        <w:pStyle w:val="Cmsor2"/>
+      </w:pPr>
+      <w:bookmarkStart w:id="25" w:name="_Toc225302267"/>
+      <w:r>
+        <w:t>14.2 Mentési folyamat rövid folyamatábrája (szöveges)</w:t>
+      </w:r>
+      <w:bookmarkEnd w:id="25"/>
+    </w:p>
+    <w:p>
+      <w:r>
+        <w:t>Bejelentkezés</w:t>
+      </w:r>
+    </w:p>
+    <w:p>
+      <w:r>
+        <w:t>Helymeghatározás</w:t>
+      </w:r>
+    </w:p>
+    <w:p>
+      <w:r>
+        <w:t>Szolgáltató kiválasztása</w:t>
+      </w:r>
+    </w:p>
+    <w:p>
+      <w:r>
+        <w:t>Mentési kérés létrehozása</w:t>
+      </w:r>
+    </w:p>
+    <w:p>
+      <w:r>
+        <w:t>Elfogadás</w:t>
+      </w:r>
+    </w:p>
+    <w:p>
+      <w:r>
+        <w:t>Úton</w:t>
+      </w:r>
+    </w:p>
+    <w:p>
+      <w:r>
+        <w:t>Megérkezett</w:t>
+      </w:r>
+    </w:p>
+    <w:p>
+      <w:r>
+        <w:t>Kész / lezárt</w:t>
+      </w:r>
+    </w:p>
+    <w:p>
+      <w:r>
+        <w:t>Értékelés</w:t>
+      </w:r>
+    </w:p>
+    <w:p>
+      <w:pPr>
+        <w:pStyle w:val="Cmsor2"/>
+      </w:pPr>
+      <w:bookmarkStart w:id="26" w:name="_Toc225302268"/>
+      <w:r>
+        <w:t>14.3 ER-diagram leírás</w:t>
+      </w:r>
+      <w:bookmarkEnd w:id="26"/>
+    </w:p>
+    <w:p>
+      <w:proofErr w:type="spellStart"/>
+      <w:r>
+        <w:t>Users</w:t>
+      </w:r>
+      <w:proofErr w:type="spellEnd"/>
+      <w:r>
+        <w:t xml:space="preserve"> -&gt; </w:t>
+      </w:r>
+      <w:proofErr w:type="spellStart"/>
+      <w:r>
+        <w:t>ServiceRequests</w:t>
+      </w:r>
+      <w:proofErr w:type="spellEnd"/>
+    </w:p>
+    <w:p>
+      <w:proofErr w:type="spellStart"/>
+      <w:r>
+        <w:t>Providers</w:t>
+      </w:r>
+      <w:proofErr w:type="spellEnd"/>
+      <w:r>
+        <w:t xml:space="preserve"> -&gt; </w:t>
+      </w:r>
+      <w:proofErr w:type="spellStart"/>
+      <w:r>
+        <w:t>Offers</w:t>
+      </w:r>
+      <w:proofErr w:type="spellEnd"/>
+    </w:p>
+    <w:p>
+      <w:proofErr w:type="spellStart"/>
+      <w:r>
         <w:lastRenderedPageBreak/>
-        <w:t>14. MELLÉKLETEK</w:t>
-      </w:r>
-      <w:bookmarkEnd w:id="23"/>
+        <w:t>ServiceRequests</w:t>
+      </w:r>
+      <w:proofErr w:type="spellEnd"/>
+      <w:r>
+        <w:t xml:space="preserve"> -&gt; </w:t>
+      </w:r>
+      <w:proofErr w:type="spellStart"/>
+      <w:r>
+        <w:t>Offers</w:t>
+      </w:r>
+      <w:proofErr w:type="spellEnd"/>
+    </w:p>
+    <w:p>
+      <w:proofErr w:type="spellStart"/>
+      <w:r>
+        <w:t>ServiceRequests</w:t>
+      </w:r>
+      <w:proofErr w:type="spellEnd"/>
+      <w:r>
+        <w:t xml:space="preserve"> -&gt; </w:t>
+      </w:r>
+      <w:proofErr w:type="spellStart"/>
+      <w:r>
+        <w:t>Jobs</w:t>
+      </w:r>
+      <w:proofErr w:type="spellEnd"/>
+    </w:p>
+    <w:p>
+      <w:proofErr w:type="spellStart"/>
+      <w:r>
+        <w:t>ServiceRequests</w:t>
+      </w:r>
+      <w:proofErr w:type="spellEnd"/>
+      <w:r>
+        <w:t xml:space="preserve"> -&gt; </w:t>
+      </w:r>
+      <w:proofErr w:type="spellStart"/>
+      <w:r>
+        <w:t>RequestMessages</w:t>
+      </w:r>
+      <w:proofErr w:type="spellEnd"/>
+    </w:p>
+    <w:p>
+      <w:proofErr w:type="spellStart"/>
+      <w:r>
+        <w:t>SupportConversations</w:t>
+      </w:r>
+      <w:proofErr w:type="spellEnd"/>
+      <w:r>
+        <w:t xml:space="preserve"> -&gt; </w:t>
+      </w:r>
+      <w:proofErr w:type="spellStart"/>
+      <w:r>
+        <w:t>SupportMessages</w:t>
+      </w:r>
+      <w:proofErr w:type="spellEnd"/>
+    </w:p>
+    <w:p>
+      <w:proofErr w:type="spellStart"/>
+      <w:r>
+        <w:t>Jobs</w:t>
+      </w:r>
+      <w:proofErr w:type="spellEnd"/>
+      <w:r>
+        <w:t xml:space="preserve"> -&gt; </w:t>
+      </w:r>
+      <w:proofErr w:type="spellStart"/>
+      <w:r>
+        <w:t>Ratings</w:t>
+      </w:r>
+      <w:proofErr w:type="spellEnd"/>
     </w:p>
     <w:p>
       <w:pPr>
         <w:pStyle w:val="Cmsor2"/>
       </w:pPr>
-      <w:bookmarkStart w:id="24" w:name="_Toc225302266"/>
-      <w:r>
-        <w:t>14.1 Javasolt képernyőképek</w:t>
-      </w:r>
-      <w:bookmarkEnd w:id="24"/>
-    </w:p>
-    <w:p>
-      <w:r>
-        <w:t>bejelentkezés/regisztráció,</w:t>
-      </w:r>
-    </w:p>
-    <w:p>
-      <w:r>
-        <w:t>felhasználói térképes nézet,</w:t>
-      </w:r>
-    </w:p>
-    <w:p>
-      <w:r>
-        <w:t>szolgáltatói kezelőpanel,</w:t>
-      </w:r>
-    </w:p>
-    <w:p>
-      <w:r>
-        <w:t>aktív mentés státusz nézet,</w:t>
-      </w:r>
-    </w:p>
-    <w:p>
-      <w:r>
-        <w:t>chatfelület,</w:t>
-      </w:r>
-    </w:p>
-    <w:p>
-      <w:proofErr w:type="spellStart"/>
-      <w:r>
-        <w:t>admin</w:t>
-      </w:r>
-      <w:proofErr w:type="spellEnd"/>
-      <w:r>
-        <w:t xml:space="preserve"> </w:t>
-      </w:r>
-      <w:proofErr w:type="spellStart"/>
-      <w:r>
-        <w:t>support</w:t>
-      </w:r>
-      <w:proofErr w:type="spellEnd"/>
-      <w:r>
-        <w:t xml:space="preserve"> felület.</w:t>
-      </w:r>
-    </w:p>
-    <w:p>
-      <w:pPr>
-        <w:pStyle w:val="Cmsor2"/>
-      </w:pPr>
-      <w:bookmarkStart w:id="25" w:name="_Toc225302267"/>
-      <w:r>
-        <w:t>14.2 Mentési folyamat rövid folyamatábrája (szöveges)</w:t>
-      </w:r>
-      <w:bookmarkEnd w:id="25"/>
-    </w:p>
-    <w:p>
-      <w:r>
-        <w:t>Bejelentkezés</w:t>
-      </w:r>
-    </w:p>
-    <w:p>
-      <w:r>
-        <w:t>Helymeghatározás</w:t>
-      </w:r>
-    </w:p>
-    <w:p>
-      <w:r>
-        <w:t>Szolgáltató kiválasztása</w:t>
-      </w:r>
-    </w:p>
-    <w:p>
-      <w:r>
-        <w:t>Mentési kérés létrehozása</w:t>
-      </w:r>
-    </w:p>
-    <w:p>
-      <w:r>
-        <w:t>Elfogadás</w:t>
-      </w:r>
-    </w:p>
-    <w:p>
-      <w:r>
-        <w:t>Úton</w:t>
-      </w:r>
-    </w:p>
-    <w:p>
-      <w:r>
-        <w:t>Megérkezett</w:t>
-      </w:r>
-    </w:p>
-    <w:p>
-      <w:r>
-        <w:t>Kész / lezárt</w:t>
-      </w:r>
-    </w:p>
-    <w:p>
-      <w:r>
-        <w:t>Értékelés</w:t>
-      </w:r>
-    </w:p>
-    <w:p>
-      <w:pPr>
-        <w:pStyle w:val="Cmsor2"/>
-      </w:pPr>
-      <w:bookmarkStart w:id="26" w:name="_Toc225302268"/>
-      <w:r>
-        <w:t>14.3 ER-diagram leírás</w:t>
-      </w:r>
-      <w:bookmarkEnd w:id="26"/>
-    </w:p>
-    <w:p>
-      <w:proofErr w:type="spellStart"/>
-      <w:r>
-        <w:t>Users</w:t>
-      </w:r>
-      <w:proofErr w:type="spellEnd"/>
-      <w:r>
-        <w:t xml:space="preserve"> -&gt; </w:t>
-      </w:r>
-      <w:proofErr w:type="spellStart"/>
-      <w:r>
-        <w:t>ServiceRequests</w:t>
-      </w:r>
-      <w:proofErr w:type="spellEnd"/>
-    </w:p>
-    <w:p>
-      <w:proofErr w:type="spellStart"/>
-      <w:r>
-        <w:t>Providers</w:t>
-      </w:r>
-      <w:proofErr w:type="spellEnd"/>
-      <w:r>
-        <w:t xml:space="preserve"> -&gt; </w:t>
-      </w:r>
-      <w:proofErr w:type="spellStart"/>
-      <w:r>
-        <w:t>Offers</w:t>
-      </w:r>
-      <w:proofErr w:type="spellEnd"/>
-    </w:p>
-    <w:p>
-      <w:proofErr w:type="spellStart"/>
-      <w:r>
-        <w:t>ServiceRequests</w:t>
-      </w:r>
-      <w:proofErr w:type="spellEnd"/>
-      <w:r>
-        <w:t xml:space="preserve"> -&gt; </w:t>
-      </w:r>
-      <w:proofErr w:type="spellStart"/>
-      <w:r>
-        <w:t>Offers</w:t>
-      </w:r>
-      <w:proofErr w:type="spellEnd"/>
-    </w:p>
-    <w:p>
-      <w:proofErr w:type="spellStart"/>
-      <w:r>
-        <w:t>ServiceRequests</w:t>
-      </w:r>
-      <w:proofErr w:type="spellEnd"/>
-      <w:r>
-        <w:t xml:space="preserve"> -&gt; </w:t>
-      </w:r>
-      <w:proofErr w:type="spellStart"/>
-      <w:r>
-        <w:t>Jobs</w:t>
-      </w:r>
-      <w:proofErr w:type="spellEnd"/>
-    </w:p>
-    <w:p>
-      <w:proofErr w:type="spellStart"/>
-      <w:r>
-        <w:t>ServiceRequests</w:t>
-      </w:r>
-      <w:proofErr w:type="spellEnd"/>
-      <w:r>
-        <w:t xml:space="preserve"> -&gt; </w:t>
-      </w:r>
-      <w:proofErr w:type="spellStart"/>
-      <w:r>
-        <w:t>RequestMessages</w:t>
-      </w:r>
-      <w:proofErr w:type="spellEnd"/>
-    </w:p>
-    <w:p>
-      <w:proofErr w:type="spellStart"/>
-      <w:r>
-        <w:t>SupportConversations</w:t>
-      </w:r>
-      <w:proofErr w:type="spellEnd"/>
-      <w:r>
-        <w:t xml:space="preserve"> -&gt; </w:t>
-      </w:r>
-      <w:proofErr w:type="spellStart"/>
-      <w:r>
-        <w:t>SupportMessages</w:t>
-      </w:r>
-      <w:proofErr w:type="spellEnd"/>
-    </w:p>
-    <w:p>
-      <w:proofErr w:type="spellStart"/>
-      <w:r>
-        <w:t>Jobs</w:t>
-      </w:r>
-      <w:proofErr w:type="spellEnd"/>
-      <w:r>
-        <w:t xml:space="preserve"> -&gt; </w:t>
-      </w:r>
-      <w:proofErr w:type="spellStart"/>
-      <w:r>
-        <w:t>Ratings</w:t>
-      </w:r>
-      <w:proofErr w:type="spellEnd"/>
-    </w:p>
-    <w:p>
-      <w:pPr>
-        <w:pStyle w:val="Cmsor2"/>
-      </w:pPr>
       <w:bookmarkStart w:id="27" w:name="_Toc225302269"/>
       <w:r>
-        <w:lastRenderedPageBreak/>
         <w:t>14.4 Tesztjegyzőkönyv minta mezők</w:t>
       </w:r>
       <w:bookmarkEnd w:id="27"/>
@@ -9235,6 +9250,7 @@
   <w:style w:type="character" w:default="1" w:styleId="Bekezdsalapbettpusa">
     <w:name w:val="Default Paragraph Font"/>
     <w:uiPriority w:val="1"/>
+    <w:semiHidden/>
     <w:unhideWhenUsed/>
   </w:style>
   <w:style w:type="table" w:default="1" w:styleId="Normltblzat">

</xml_diff>

<commit_message>
Projektállapot rögzítése a Kevin ágon
</commit_message>
<xml_diff>
--- a/dokumentacio/alakulodokumentacio.docx
+++ b/dokumentacio/alakulodokumentacio.docx
@@ -179,6 +179,13 @@
     </w:p>
     <w:sdt>
       <w:sdtPr>
+        <w:rPr>
+          <w:rFonts w:asciiTheme="minorHAnsi" w:eastAsiaTheme="minorEastAsia" w:hAnsiTheme="minorHAnsi" w:cstheme="minorHAnsi"/>
+          <w:color w:val="auto"/>
+          <w:sz w:val="24"/>
+          <w:szCs w:val="20"/>
+          <w:lang w:eastAsia="en-US"/>
+        </w:rPr>
         <w:id w:val="1272205547"/>
         <w:docPartObj>
           <w:docPartGallery w:val="Table of Contents"/>
@@ -187,13 +194,8 @@
       </w:sdtPr>
       <w:sdtEndPr>
         <w:rPr>
-          <w:rFonts w:asciiTheme="minorHAnsi" w:eastAsiaTheme="minorEastAsia" w:hAnsiTheme="minorHAnsi" w:cstheme="minorHAnsi"/>
           <w:b/>
           <w:bCs/>
-          <w:color w:val="auto"/>
-          <w:sz w:val="24"/>
-          <w:szCs w:val="20"/>
-          <w:lang w:eastAsia="en-US"/>
         </w:rPr>
       </w:sdtEndPr>
       <w:sdtContent>
@@ -3258,6 +3260,7 @@
         <w:rPr>
           <w:b/>
           <w:bCs/>
+          <w:noProof/>
         </w:rPr>
         <w:drawing>
           <wp:inline distT="0" distB="0" distL="0" distR="0" wp14:anchorId="42A30D0D" wp14:editId="335A3E58">
@@ -3330,6 +3333,7 @@
       <w:r>
         <w:rPr>
           <w:rStyle w:val="Cmsor3Char"/>
+          <w:noProof/>
         </w:rPr>
         <w:drawing>
           <wp:anchor distT="0" distB="0" distL="114300" distR="114300" simplePos="0" relativeHeight="251658240" behindDoc="0" locked="0" layoutInCell="1" allowOverlap="1" wp14:anchorId="78DBE305" wp14:editId="417D13F0">
@@ -3600,13 +3604,7 @@
         <w:rPr>
           <w:rStyle w:val="Cmsor3Char"/>
         </w:rPr>
-        <w:t> </w:t>
-      </w:r>
-      <w:r>
-        <w:rPr>
-          <w:rStyle w:val="Cmsor3Char"/>
-        </w:rPr>
-        <w:t>tábla</w:t>
+        <w:t> tábla</w:t>
       </w:r>
       <w:r>
         <w:rPr>
@@ -3868,6 +3866,9 @@
     </w:p>
     <w:p>
       <w:r>
+        <w:rPr>
+          <w:noProof/>
+        </w:rPr>
         <w:drawing>
           <wp:anchor distT="0" distB="0" distL="114300" distR="114300" simplePos="0" relativeHeight="251660288" behindDoc="0" locked="0" layoutInCell="1" allowOverlap="1" wp14:anchorId="7F46E36F" wp14:editId="21236D48">
             <wp:simplePos x="0" y="0"/>
@@ -4015,13 +4016,8 @@
       </w:r>
       <w:proofErr w:type="spellEnd"/>
       <w:r>
-        <w:t xml:space="preserve"> mezőben pedig további megjegyzések adhatók </w:t>
-      </w:r>
-      <w:proofErr w:type="spellStart"/>
-      <w:r>
-        <w:t>meg.</w:t>
-      </w:r>
-      <w:proofErr w:type="spellEnd"/>
+        <w:t> mezőben pedig további megjegyzések adhatók meg.</w:t>
+      </w:r>
     </w:p>
     <w:p>
       <w:r>
@@ -4081,6 +4077,9 @@
     </w:p>
     <w:p>
       <w:r>
+        <w:rPr>
+          <w:noProof/>
+        </w:rPr>
         <w:drawing>
           <wp:anchor distT="0" distB="0" distL="114300" distR="114300" simplePos="0" relativeHeight="251661312" behindDoc="0" locked="0" layoutInCell="1" allowOverlap="1" wp14:anchorId="6DACD3EF" wp14:editId="1445B5EA">
             <wp:simplePos x="0" y="0"/>
@@ -4263,6 +4262,9 @@
     </w:p>
     <w:p>
       <w:r>
+        <w:rPr>
+          <w:noProof/>
+        </w:rPr>
         <w:drawing>
           <wp:anchor distT="0" distB="0" distL="114300" distR="114300" simplePos="0" relativeHeight="251662336" behindDoc="0" locked="0" layoutInCell="1" allowOverlap="1" wp14:anchorId="5D623AE4" wp14:editId="5DE640F3">
             <wp:simplePos x="0" y="0"/>
@@ -5099,10 +5101,25 @@
     </w:p>
     <w:p>
       <w:pPr>
+        <w:spacing w:before="0" w:after="160" w:line="278" w:lineRule="auto"/>
+        <w:rPr>
+          <w:rFonts w:asciiTheme="majorHAnsi" w:eastAsiaTheme="majorEastAsia" w:hAnsiTheme="majorHAnsi" w:cstheme="majorBidi"/>
+          <w:color w:val="0F4761" w:themeColor="accent1" w:themeShade="BF"/>
+          <w:sz w:val="40"/>
+          <w:szCs w:val="40"/>
+        </w:rPr>
+      </w:pPr>
+      <w:bookmarkStart w:id="14" w:name="_Toc225302256"/>
+      <w:r>
+        <w:br w:type="page"/>
+      </w:r>
+    </w:p>
+    <w:p>
+      <w:pPr>
         <w:pStyle w:val="Cmsor1"/>
       </w:pPr>
-      <w:bookmarkStart w:id="14" w:name="_Toc225302256"/>
-      <w:r>
+      <w:r>
+        <w:lastRenderedPageBreak/>
         <w:t>9. TESZTELÉS</w:t>
       </w:r>
       <w:bookmarkEnd w:id="14"/>
@@ -5194,7 +5211,6 @@
           <w:p>
             <w:proofErr w:type="spellStart"/>
             <w:r>
-              <w:lastRenderedPageBreak/>
               <w:t>tesztauto@test</w:t>
             </w:r>
             <w:proofErr w:type="spellEnd"/>
@@ -5523,255 +5539,254 @@
         </w:numPr>
       </w:pPr>
       <w:r>
+        <w:t>adatbázis-tervezésben,</w:t>
+      </w:r>
+    </w:p>
+    <w:p>
+      <w:pPr>
+        <w:pStyle w:val="Listaszerbekezds"/>
+        <w:numPr>
+          <w:ilvl w:val="0"/>
+          <w:numId w:val="15"/>
+        </w:numPr>
+      </w:pPr>
+      <w:r>
+        <w:t>backend API-fejlesztésben,</w:t>
+      </w:r>
+    </w:p>
+    <w:p>
+      <w:pPr>
+        <w:pStyle w:val="Listaszerbekezds"/>
+        <w:numPr>
+          <w:ilvl w:val="0"/>
+          <w:numId w:val="15"/>
+        </w:numPr>
+      </w:pPr>
+      <w:r>
+        <w:t>frontend felhasználói felületek kialakításában,</w:t>
+      </w:r>
+    </w:p>
+    <w:p>
+      <w:pPr>
+        <w:pStyle w:val="Listaszerbekezds"/>
+        <w:numPr>
+          <w:ilvl w:val="0"/>
+          <w:numId w:val="15"/>
+        </w:numPr>
+      </w:pPr>
+      <w:r>
+        <w:t>térképes és helyalapú szolgáltatások integrálásában,</w:t>
+      </w:r>
+    </w:p>
+    <w:p>
+      <w:pPr>
+        <w:pStyle w:val="Listaszerbekezds"/>
+        <w:numPr>
+          <w:ilvl w:val="0"/>
+          <w:numId w:val="15"/>
+        </w:numPr>
+      </w:pPr>
+      <w:r>
+        <w:t>együttműködésen alapuló projektmunkában.</w:t>
+      </w:r>
+    </w:p>
+    <w:p>
+      <w:r>
+        <w:t xml:space="preserve">A </w:t>
+      </w:r>
+      <w:proofErr w:type="spellStart"/>
+      <w:r>
+        <w:t>ResQ</w:t>
+      </w:r>
+      <w:proofErr w:type="spellEnd"/>
+      <w:r>
+        <w:t xml:space="preserve"> számunkra nemcsak egy sikeres vizsgaprojekt, hanem olyan szakmai mérföldkő is, amelyre a jövőbeli tanulmányaink és munkánk során is tudunk építeni.</w:t>
+      </w:r>
+    </w:p>
+    <w:p/>
+    <w:p>
+      <w:pPr>
+        <w:pStyle w:val="Cmsor1"/>
+      </w:pPr>
+      <w:bookmarkStart w:id="16" w:name="_Toc225302258"/>
+      <w:r>
+        <w:t>11. BIZTONSÁG</w:t>
+      </w:r>
+      <w:bookmarkEnd w:id="16"/>
+    </w:p>
+    <w:p>
+      <w:r>
+        <w:t>A rendszer tervezésénél kiemelt szempont volt az adatvédelem, a jogosultságok ellenőrzése és a megbízható működés.</w:t>
+      </w:r>
+    </w:p>
+    <w:p/>
+    <w:p>
+      <w:pPr>
+        <w:pStyle w:val="Cmsor2"/>
+      </w:pPr>
+      <w:bookmarkStart w:id="17" w:name="_Toc225302259"/>
+      <w:r>
+        <w:t>11.1 Hitelesítés és jogosultság</w:t>
+      </w:r>
+      <w:bookmarkEnd w:id="17"/>
+    </w:p>
+    <w:p>
+      <w:r>
+        <w:t xml:space="preserve">JWT </w:t>
+      </w:r>
+      <w:proofErr w:type="spellStart"/>
+      <w:r>
+        <w:t>token</w:t>
+      </w:r>
+      <w:proofErr w:type="spellEnd"/>
+      <w:r>
+        <w:t xml:space="preserve"> alapú hitelesítés</w:t>
+      </w:r>
+    </w:p>
+    <w:p>
+      <w:r>
+        <w:t>szerepkör-alapú hozzáférés (</w:t>
+      </w:r>
+      <w:proofErr w:type="spellStart"/>
+      <w:r>
+        <w:t>User</w:t>
+      </w:r>
+      <w:proofErr w:type="spellEnd"/>
+      <w:r>
+        <w:t xml:space="preserve">, </w:t>
+      </w:r>
+      <w:proofErr w:type="spellStart"/>
+      <w:r>
+        <w:t>Provider</w:t>
+      </w:r>
+      <w:proofErr w:type="spellEnd"/>
+      <w:r>
+        <w:t xml:space="preserve">, </w:t>
+      </w:r>
+      <w:proofErr w:type="spellStart"/>
+      <w:r>
+        <w:t>Admin</w:t>
+      </w:r>
+      <w:proofErr w:type="spellEnd"/>
+      <w:r>
+        <w:t>)</w:t>
+      </w:r>
+    </w:p>
+    <w:p>
+      <w:r>
+        <w:t xml:space="preserve">védett API-végpontok </w:t>
+      </w:r>
+      <w:proofErr w:type="spellStart"/>
+      <w:r>
+        <w:t>tokenellenőrzéssel</w:t>
+      </w:r>
+      <w:proofErr w:type="spellEnd"/>
+    </w:p>
+    <w:p>
+      <w:pPr>
+        <w:pStyle w:val="Cmsor2"/>
+      </w:pPr>
+      <w:bookmarkStart w:id="18" w:name="_Toc225302260"/>
+      <w:r>
+        <w:t>11.2 Jelszó- és fiókbiztonság</w:t>
+      </w:r>
+      <w:bookmarkEnd w:id="18"/>
+    </w:p>
+    <w:p>
+      <w:r>
+        <w:t xml:space="preserve">jelszavak </w:t>
+      </w:r>
+      <w:proofErr w:type="spellStart"/>
+      <w:r>
+        <w:t>hash</w:t>
+      </w:r>
+      <w:proofErr w:type="spellEnd"/>
+      <w:r>
+        <w:t xml:space="preserve"> formában tárolva</w:t>
+      </w:r>
+    </w:p>
+    <w:p>
+      <w:r>
+        <w:t xml:space="preserve">jelszó-visszaállítás ideiglenes </w:t>
+      </w:r>
+      <w:proofErr w:type="spellStart"/>
+      <w:r>
+        <w:t>tokenekkel</w:t>
+      </w:r>
+      <w:proofErr w:type="spellEnd"/>
+    </w:p>
+    <w:p>
+      <w:proofErr w:type="spellStart"/>
+      <w:r>
+        <w:t>token</w:t>
+      </w:r>
+      <w:proofErr w:type="spellEnd"/>
+      <w:r>
+        <w:t xml:space="preserve"> lejárati idő kezelése</w:t>
+      </w:r>
+    </w:p>
+    <w:p>
+      <w:pPr>
+        <w:pStyle w:val="Cmsor2"/>
+      </w:pPr>
+      <w:bookmarkStart w:id="19" w:name="_Toc225302261"/>
+      <w:r>
+        <w:t>11.3 Bemeneti ellenőrzés</w:t>
+      </w:r>
+      <w:bookmarkEnd w:id="19"/>
+    </w:p>
+    <w:p>
+      <w:r>
+        <w:t xml:space="preserve">kötelező mezők </w:t>
+      </w:r>
+      <w:proofErr w:type="spellStart"/>
+      <w:r>
+        <w:t>validálása</w:t>
+      </w:r>
+      <w:proofErr w:type="spellEnd"/>
+    </w:p>
+    <w:p>
+      <w:r>
+        <w:t>adattípus-ellenőrzés</w:t>
+      </w:r>
+    </w:p>
+    <w:p>
+      <w:r>
+        <w:t>jogosultság és státuszátmenet ellenőrzése</w:t>
+      </w:r>
+    </w:p>
+    <w:p>
+      <w:pPr>
+        <w:pStyle w:val="Cmsor2"/>
+      </w:pPr>
+      <w:bookmarkStart w:id="20" w:name="_Toc225302262"/>
+      <w:r>
         <w:lastRenderedPageBreak/>
-        <w:t>adatbázis-tervezésben,</w:t>
-      </w:r>
-    </w:p>
-    <w:p>
-      <w:pPr>
-        <w:pStyle w:val="Listaszerbekezds"/>
-        <w:numPr>
-          <w:ilvl w:val="0"/>
-          <w:numId w:val="15"/>
-        </w:numPr>
-      </w:pPr>
-      <w:r>
-        <w:t>backend API-fejlesztésben,</w:t>
-      </w:r>
-    </w:p>
-    <w:p>
-      <w:pPr>
-        <w:pStyle w:val="Listaszerbekezds"/>
-        <w:numPr>
-          <w:ilvl w:val="0"/>
-          <w:numId w:val="15"/>
-        </w:numPr>
-      </w:pPr>
-      <w:r>
-        <w:t>frontend felhasználói felületek kialakításában,</w:t>
-      </w:r>
-    </w:p>
-    <w:p>
-      <w:pPr>
-        <w:pStyle w:val="Listaszerbekezds"/>
-        <w:numPr>
-          <w:ilvl w:val="0"/>
-          <w:numId w:val="15"/>
-        </w:numPr>
-      </w:pPr>
-      <w:r>
-        <w:t>térképes és helyalapú szolgáltatások integrálásában,</w:t>
-      </w:r>
-    </w:p>
-    <w:p>
-      <w:pPr>
-        <w:pStyle w:val="Listaszerbekezds"/>
-        <w:numPr>
-          <w:ilvl w:val="0"/>
-          <w:numId w:val="15"/>
-        </w:numPr>
-      </w:pPr>
-      <w:r>
-        <w:t>együttműködésen alapuló projektmunkában.</w:t>
-      </w:r>
-    </w:p>
-    <w:p>
-      <w:r>
-        <w:t xml:space="preserve">A </w:t>
-      </w:r>
-      <w:proofErr w:type="spellStart"/>
-      <w:r>
-        <w:t>ResQ</w:t>
-      </w:r>
-      <w:proofErr w:type="spellEnd"/>
-      <w:r>
-        <w:t xml:space="preserve"> számunkra nemcsak egy sikeres vizsgaprojekt, hanem olyan szakmai mérföldkő is, amelyre a jövőbeli tanulmányaink és munkánk során is tudunk építeni.</w:t>
-      </w:r>
-    </w:p>
-    <w:p/>
+        <w:t>11.4 Adatintegritás</w:t>
+      </w:r>
+      <w:bookmarkEnd w:id="20"/>
+    </w:p>
+    <w:p>
+      <w:r>
+        <w:t>relációs kulcsok és megszorítások</w:t>
+      </w:r>
+    </w:p>
+    <w:p>
+      <w:r>
+        <w:t>konzisztens állapotkezelés</w:t>
+      </w:r>
+    </w:p>
+    <w:p>
+      <w:r>
+        <w:t>naplózható státusz- és üzenetműveletek</w:t>
+      </w:r>
+    </w:p>
     <w:p>
       <w:pPr>
         <w:pStyle w:val="Cmsor1"/>
       </w:pPr>
-      <w:bookmarkStart w:id="16" w:name="_Toc225302258"/>
-      <w:r>
-        <w:t>11. BIZTONSÁG</w:t>
-      </w:r>
-      <w:bookmarkEnd w:id="16"/>
-    </w:p>
-    <w:p>
-      <w:r>
-        <w:t>A rendszer tervezésénél kiemelt szempont volt az adatvédelem, a jogosultságok ellenőrzése és a megbízható működés.</w:t>
-      </w:r>
-    </w:p>
-    <w:p/>
-    <w:p>
-      <w:pPr>
-        <w:pStyle w:val="Cmsor2"/>
-      </w:pPr>
-      <w:bookmarkStart w:id="17" w:name="_Toc225302259"/>
-      <w:r>
-        <w:t>11.1 Hitelesítés és jogosultság</w:t>
-      </w:r>
-      <w:bookmarkEnd w:id="17"/>
-    </w:p>
-    <w:p>
-      <w:r>
-        <w:t xml:space="preserve">JWT </w:t>
-      </w:r>
-      <w:proofErr w:type="spellStart"/>
-      <w:r>
-        <w:t>token</w:t>
-      </w:r>
-      <w:proofErr w:type="spellEnd"/>
-      <w:r>
-        <w:t xml:space="preserve"> alapú hitelesítés</w:t>
-      </w:r>
-    </w:p>
-    <w:p>
-      <w:r>
-        <w:t>szerepkör-alapú hozzáférés (</w:t>
-      </w:r>
-      <w:proofErr w:type="spellStart"/>
-      <w:r>
-        <w:t>User</w:t>
-      </w:r>
-      <w:proofErr w:type="spellEnd"/>
-      <w:r>
-        <w:t xml:space="preserve">, </w:t>
-      </w:r>
-      <w:proofErr w:type="spellStart"/>
-      <w:r>
-        <w:t>Provider</w:t>
-      </w:r>
-      <w:proofErr w:type="spellEnd"/>
-      <w:r>
-        <w:t xml:space="preserve">, </w:t>
-      </w:r>
-      <w:proofErr w:type="spellStart"/>
-      <w:r>
-        <w:t>Admin</w:t>
-      </w:r>
-      <w:proofErr w:type="spellEnd"/>
-      <w:r>
-        <w:t>)</w:t>
-      </w:r>
-    </w:p>
-    <w:p>
-      <w:r>
-        <w:t xml:space="preserve">védett API-végpontok </w:t>
-      </w:r>
-      <w:proofErr w:type="spellStart"/>
-      <w:r>
-        <w:t>tokenellenőrzéssel</w:t>
-      </w:r>
-      <w:proofErr w:type="spellEnd"/>
-    </w:p>
-    <w:p>
-      <w:pPr>
-        <w:pStyle w:val="Cmsor2"/>
-      </w:pPr>
-      <w:bookmarkStart w:id="18" w:name="_Toc225302260"/>
-      <w:r>
-        <w:t>11.2 Jelszó- és fiókbiztonság</w:t>
-      </w:r>
-      <w:bookmarkEnd w:id="18"/>
-    </w:p>
-    <w:p>
-      <w:r>
-        <w:t xml:space="preserve">jelszavak </w:t>
-      </w:r>
-      <w:proofErr w:type="spellStart"/>
-      <w:r>
-        <w:t>hash</w:t>
-      </w:r>
-      <w:proofErr w:type="spellEnd"/>
-      <w:r>
-        <w:t xml:space="preserve"> formában tárolva</w:t>
-      </w:r>
-    </w:p>
-    <w:p>
-      <w:r>
-        <w:t xml:space="preserve">jelszó-visszaállítás ideiglenes </w:t>
-      </w:r>
-      <w:proofErr w:type="spellStart"/>
-      <w:r>
-        <w:t>tokenekkel</w:t>
-      </w:r>
-      <w:proofErr w:type="spellEnd"/>
-    </w:p>
-    <w:p>
-      <w:proofErr w:type="spellStart"/>
-      <w:r>
-        <w:t>token</w:t>
-      </w:r>
-      <w:proofErr w:type="spellEnd"/>
-      <w:r>
-        <w:t xml:space="preserve"> lejárati idő kezelése</w:t>
-      </w:r>
-    </w:p>
-    <w:p>
-      <w:pPr>
-        <w:pStyle w:val="Cmsor2"/>
-      </w:pPr>
-      <w:bookmarkStart w:id="19" w:name="_Toc225302261"/>
-      <w:r>
-        <w:t>11.3 Bemeneti ellenőrzés</w:t>
-      </w:r>
-      <w:bookmarkEnd w:id="19"/>
-    </w:p>
-    <w:p>
-      <w:r>
-        <w:t xml:space="preserve">kötelező mezők </w:t>
-      </w:r>
-      <w:proofErr w:type="spellStart"/>
-      <w:r>
-        <w:t>validálása</w:t>
-      </w:r>
-      <w:proofErr w:type="spellEnd"/>
-    </w:p>
-    <w:p>
-      <w:r>
-        <w:t>adattípus-ellenőrzés</w:t>
-      </w:r>
-    </w:p>
-    <w:p>
-      <w:r>
-        <w:t>jogosultság és státuszátmenet ellenőrzése</w:t>
-      </w:r>
-    </w:p>
-    <w:p>
-      <w:pPr>
-        <w:pStyle w:val="Cmsor2"/>
-      </w:pPr>
-      <w:bookmarkStart w:id="20" w:name="_Toc225302262"/>
-      <w:r>
-        <w:t>11.4 Adatintegritás</w:t>
-      </w:r>
-      <w:bookmarkEnd w:id="20"/>
-    </w:p>
-    <w:p>
-      <w:r>
-        <w:t>relációs kulcsok és megszorítások</w:t>
-      </w:r>
-    </w:p>
-    <w:p>
-      <w:r>
-        <w:t>konzisztens állapotkezelés</w:t>
-      </w:r>
-    </w:p>
-    <w:p>
-      <w:r>
-        <w:t>naplózható státusz- és üzenetműveletek</w:t>
-      </w:r>
-    </w:p>
-    <w:p>
-      <w:pPr>
-        <w:pStyle w:val="Cmsor1"/>
-      </w:pPr>
       <w:bookmarkStart w:id="21" w:name="_Toc225302263"/>
       <w:r>
-        <w:lastRenderedPageBreak/>
         <w:t>12. API-DOKUMENTÁCIÓ ÖSSZEFOGLALÓ</w:t>
       </w:r>
       <w:bookmarkEnd w:id="21"/>
@@ -6274,6 +6289,7 @@
       </w:pPr>
       <w:proofErr w:type="spellStart"/>
       <w:r>
+        <w:lastRenderedPageBreak/>
         <w:t>push</w:t>
       </w:r>
       <w:proofErr w:type="spellEnd"/>
@@ -6363,241 +6379,240 @@
       </w:pPr>
       <w:bookmarkStart w:id="23" w:name="_Toc225302265"/>
       <w:r>
+        <w:t>14. MELLÉKLETEK</w:t>
+      </w:r>
+      <w:bookmarkEnd w:id="23"/>
+    </w:p>
+    <w:p>
+      <w:pPr>
+        <w:pStyle w:val="Cmsor2"/>
+      </w:pPr>
+      <w:bookmarkStart w:id="24" w:name="_Toc225302266"/>
+      <w:r>
+        <w:t>14.1 Javasolt képernyőképek</w:t>
+      </w:r>
+      <w:bookmarkEnd w:id="24"/>
+    </w:p>
+    <w:p>
+      <w:r>
+        <w:t>bejelentkezés/regisztráció,</w:t>
+      </w:r>
+    </w:p>
+    <w:p>
+      <w:r>
+        <w:t>felhasználói térképes nézet,</w:t>
+      </w:r>
+    </w:p>
+    <w:p>
+      <w:r>
+        <w:t>szolgáltatói kezelőpanel,</w:t>
+      </w:r>
+    </w:p>
+    <w:p>
+      <w:r>
+        <w:t>aktív mentés státusz nézet,</w:t>
+      </w:r>
+    </w:p>
+    <w:p>
+      <w:r>
+        <w:t>chatfelület,</w:t>
+      </w:r>
+    </w:p>
+    <w:p>
+      <w:proofErr w:type="spellStart"/>
+      <w:r>
+        <w:t>admin</w:t>
+      </w:r>
+      <w:proofErr w:type="spellEnd"/>
+      <w:r>
+        <w:t xml:space="preserve"> </w:t>
+      </w:r>
+      <w:proofErr w:type="spellStart"/>
+      <w:r>
+        <w:t>support</w:t>
+      </w:r>
+      <w:proofErr w:type="spellEnd"/>
+      <w:r>
+        <w:t xml:space="preserve"> felület.</w:t>
+      </w:r>
+    </w:p>
+    <w:p>
+      <w:pPr>
+        <w:pStyle w:val="Cmsor2"/>
+      </w:pPr>
+      <w:bookmarkStart w:id="25" w:name="_Toc225302267"/>
+      <w:r>
+        <w:t>14.2 Mentési folyamat rövid folyamatábrája (szöveges)</w:t>
+      </w:r>
+      <w:bookmarkEnd w:id="25"/>
+    </w:p>
+    <w:p>
+      <w:r>
+        <w:t>Bejelentkezés</w:t>
+      </w:r>
+    </w:p>
+    <w:p>
+      <w:r>
+        <w:t>Helymeghatározás</w:t>
+      </w:r>
+    </w:p>
+    <w:p>
+      <w:r>
+        <w:t>Szolgáltató kiválasztása</w:t>
+      </w:r>
+    </w:p>
+    <w:p>
+      <w:r>
+        <w:t>Mentési kérés létrehozása</w:t>
+      </w:r>
+    </w:p>
+    <w:p>
+      <w:r>
+        <w:t>Elfogadás</w:t>
+      </w:r>
+    </w:p>
+    <w:p>
+      <w:r>
+        <w:t>Úton</w:t>
+      </w:r>
+    </w:p>
+    <w:p>
+      <w:r>
+        <w:t>Megérkezett</w:t>
+      </w:r>
+    </w:p>
+    <w:p>
+      <w:r>
+        <w:t>Kész / lezárt</w:t>
+      </w:r>
+    </w:p>
+    <w:p>
+      <w:r>
+        <w:t>Értékelés</w:t>
+      </w:r>
+    </w:p>
+    <w:p>
+      <w:pPr>
+        <w:pStyle w:val="Cmsor2"/>
+      </w:pPr>
+      <w:bookmarkStart w:id="26" w:name="_Toc225302268"/>
+      <w:r>
+        <w:t>14.3 ER-diagram leírás</w:t>
+      </w:r>
+      <w:bookmarkEnd w:id="26"/>
+    </w:p>
+    <w:p>
+      <w:proofErr w:type="spellStart"/>
+      <w:r>
+        <w:t>Users</w:t>
+      </w:r>
+      <w:proofErr w:type="spellEnd"/>
+      <w:r>
+        <w:t xml:space="preserve"> -&gt; </w:t>
+      </w:r>
+      <w:proofErr w:type="spellStart"/>
+      <w:r>
+        <w:t>ServiceRequests</w:t>
+      </w:r>
+      <w:proofErr w:type="spellEnd"/>
+    </w:p>
+    <w:p>
+      <w:proofErr w:type="spellStart"/>
+      <w:r>
+        <w:t>Providers</w:t>
+      </w:r>
+      <w:proofErr w:type="spellEnd"/>
+      <w:r>
+        <w:t xml:space="preserve"> -&gt; </w:t>
+      </w:r>
+      <w:proofErr w:type="spellStart"/>
+      <w:r>
+        <w:t>Offers</w:t>
+      </w:r>
+      <w:proofErr w:type="spellEnd"/>
+    </w:p>
+    <w:p>
+      <w:proofErr w:type="spellStart"/>
+      <w:r>
         <w:lastRenderedPageBreak/>
-        <w:t>14. MELLÉKLETEK</w:t>
-      </w:r>
-      <w:bookmarkEnd w:id="23"/>
+        <w:t>ServiceRequests</w:t>
+      </w:r>
+      <w:proofErr w:type="spellEnd"/>
+      <w:r>
+        <w:t xml:space="preserve"> -&gt; </w:t>
+      </w:r>
+      <w:proofErr w:type="spellStart"/>
+      <w:r>
+        <w:t>Offers</w:t>
+      </w:r>
+      <w:proofErr w:type="spellEnd"/>
+    </w:p>
+    <w:p>
+      <w:proofErr w:type="spellStart"/>
+      <w:r>
+        <w:t>ServiceRequests</w:t>
+      </w:r>
+      <w:proofErr w:type="spellEnd"/>
+      <w:r>
+        <w:t xml:space="preserve"> -&gt; </w:t>
+      </w:r>
+      <w:proofErr w:type="spellStart"/>
+      <w:r>
+        <w:t>Jobs</w:t>
+      </w:r>
+      <w:proofErr w:type="spellEnd"/>
+    </w:p>
+    <w:p>
+      <w:proofErr w:type="spellStart"/>
+      <w:r>
+        <w:t>ServiceRequests</w:t>
+      </w:r>
+      <w:proofErr w:type="spellEnd"/>
+      <w:r>
+        <w:t xml:space="preserve"> -&gt; </w:t>
+      </w:r>
+      <w:proofErr w:type="spellStart"/>
+      <w:r>
+        <w:t>RequestMessages</w:t>
+      </w:r>
+      <w:proofErr w:type="spellEnd"/>
+    </w:p>
+    <w:p>
+      <w:proofErr w:type="spellStart"/>
+      <w:r>
+        <w:t>SupportConversations</w:t>
+      </w:r>
+      <w:proofErr w:type="spellEnd"/>
+      <w:r>
+        <w:t xml:space="preserve"> -&gt; </w:t>
+      </w:r>
+      <w:proofErr w:type="spellStart"/>
+      <w:r>
+        <w:t>SupportMessages</w:t>
+      </w:r>
+      <w:proofErr w:type="spellEnd"/>
+    </w:p>
+    <w:p>
+      <w:proofErr w:type="spellStart"/>
+      <w:r>
+        <w:t>Jobs</w:t>
+      </w:r>
+      <w:proofErr w:type="spellEnd"/>
+      <w:r>
+        <w:t xml:space="preserve"> -&gt; </w:t>
+      </w:r>
+      <w:proofErr w:type="spellStart"/>
+      <w:r>
+        <w:t>Ratings</w:t>
+      </w:r>
+      <w:proofErr w:type="spellEnd"/>
     </w:p>
     <w:p>
       <w:pPr>
         <w:pStyle w:val="Cmsor2"/>
       </w:pPr>
-      <w:bookmarkStart w:id="24" w:name="_Toc225302266"/>
-      <w:r>
-        <w:t>14.1 Javasolt képernyőképek</w:t>
-      </w:r>
-      <w:bookmarkEnd w:id="24"/>
-    </w:p>
-    <w:p>
-      <w:r>
-        <w:t>bejelentkezés/regisztráció,</w:t>
-      </w:r>
-    </w:p>
-    <w:p>
-      <w:r>
-        <w:t>felhasználói térképes nézet,</w:t>
-      </w:r>
-    </w:p>
-    <w:p>
-      <w:r>
-        <w:t>szolgáltatói kezelőpanel,</w:t>
-      </w:r>
-    </w:p>
-    <w:p>
-      <w:r>
-        <w:t>aktív mentés státusz nézet,</w:t>
-      </w:r>
-    </w:p>
-    <w:p>
-      <w:r>
-        <w:t>chatfelület,</w:t>
-      </w:r>
-    </w:p>
-    <w:p>
-      <w:proofErr w:type="spellStart"/>
-      <w:r>
-        <w:t>admin</w:t>
-      </w:r>
-      <w:proofErr w:type="spellEnd"/>
-      <w:r>
-        <w:t xml:space="preserve"> </w:t>
-      </w:r>
-      <w:proofErr w:type="spellStart"/>
-      <w:r>
-        <w:t>support</w:t>
-      </w:r>
-      <w:proofErr w:type="spellEnd"/>
-      <w:r>
-        <w:t xml:space="preserve"> felület.</w:t>
-      </w:r>
-    </w:p>
-    <w:p>
-      <w:pPr>
-        <w:pStyle w:val="Cmsor2"/>
-      </w:pPr>
-      <w:bookmarkStart w:id="25" w:name="_Toc225302267"/>
-      <w:r>
-        <w:t>14.2 Mentési folyamat rövid folyamatábrája (szöveges)</w:t>
-      </w:r>
-      <w:bookmarkEnd w:id="25"/>
-    </w:p>
-    <w:p>
-      <w:r>
-        <w:t>Bejelentkezés</w:t>
-      </w:r>
-    </w:p>
-    <w:p>
-      <w:r>
-        <w:t>Helymeghatározás</w:t>
-      </w:r>
-    </w:p>
-    <w:p>
-      <w:r>
-        <w:t>Szolgáltató kiválasztása</w:t>
-      </w:r>
-    </w:p>
-    <w:p>
-      <w:r>
-        <w:t>Mentési kérés létrehozása</w:t>
-      </w:r>
-    </w:p>
-    <w:p>
-      <w:r>
-        <w:t>Elfogadás</w:t>
-      </w:r>
-    </w:p>
-    <w:p>
-      <w:r>
-        <w:t>Úton</w:t>
-      </w:r>
-    </w:p>
-    <w:p>
-      <w:r>
-        <w:t>Megérkezett</w:t>
-      </w:r>
-    </w:p>
-    <w:p>
-      <w:r>
-        <w:t>Kész / lezárt</w:t>
-      </w:r>
-    </w:p>
-    <w:p>
-      <w:r>
-        <w:t>Értékelés</w:t>
-      </w:r>
-    </w:p>
-    <w:p>
-      <w:pPr>
-        <w:pStyle w:val="Cmsor2"/>
-      </w:pPr>
-      <w:bookmarkStart w:id="26" w:name="_Toc225302268"/>
-      <w:r>
-        <w:t>14.3 ER-diagram leírás</w:t>
-      </w:r>
-      <w:bookmarkEnd w:id="26"/>
-    </w:p>
-    <w:p>
-      <w:proofErr w:type="spellStart"/>
-      <w:r>
-        <w:t>Users</w:t>
-      </w:r>
-      <w:proofErr w:type="spellEnd"/>
-      <w:r>
-        <w:t xml:space="preserve"> -&gt; </w:t>
-      </w:r>
-      <w:proofErr w:type="spellStart"/>
-      <w:r>
-        <w:t>ServiceRequests</w:t>
-      </w:r>
-      <w:proofErr w:type="spellEnd"/>
-    </w:p>
-    <w:p>
-      <w:proofErr w:type="spellStart"/>
-      <w:r>
-        <w:t>Providers</w:t>
-      </w:r>
-      <w:proofErr w:type="spellEnd"/>
-      <w:r>
-        <w:t xml:space="preserve"> -&gt; </w:t>
-      </w:r>
-      <w:proofErr w:type="spellStart"/>
-      <w:r>
-        <w:t>Offers</w:t>
-      </w:r>
-      <w:proofErr w:type="spellEnd"/>
-    </w:p>
-    <w:p>
-      <w:proofErr w:type="spellStart"/>
-      <w:r>
-        <w:t>ServiceRequests</w:t>
-      </w:r>
-      <w:proofErr w:type="spellEnd"/>
-      <w:r>
-        <w:t xml:space="preserve"> -&gt; </w:t>
-      </w:r>
-      <w:proofErr w:type="spellStart"/>
-      <w:r>
-        <w:t>Offers</w:t>
-      </w:r>
-      <w:proofErr w:type="spellEnd"/>
-    </w:p>
-    <w:p>
-      <w:proofErr w:type="spellStart"/>
-      <w:r>
-        <w:t>ServiceRequests</w:t>
-      </w:r>
-      <w:proofErr w:type="spellEnd"/>
-      <w:r>
-        <w:t xml:space="preserve"> -&gt; </w:t>
-      </w:r>
-      <w:proofErr w:type="spellStart"/>
-      <w:r>
-        <w:t>Jobs</w:t>
-      </w:r>
-      <w:proofErr w:type="spellEnd"/>
-    </w:p>
-    <w:p>
-      <w:proofErr w:type="spellStart"/>
-      <w:r>
-        <w:t>ServiceRequests</w:t>
-      </w:r>
-      <w:proofErr w:type="spellEnd"/>
-      <w:r>
-        <w:t xml:space="preserve"> -&gt; </w:t>
-      </w:r>
-      <w:proofErr w:type="spellStart"/>
-      <w:r>
-        <w:t>RequestMessages</w:t>
-      </w:r>
-      <w:proofErr w:type="spellEnd"/>
-    </w:p>
-    <w:p>
-      <w:proofErr w:type="spellStart"/>
-      <w:r>
-        <w:t>SupportConversations</w:t>
-      </w:r>
-      <w:proofErr w:type="spellEnd"/>
-      <w:r>
-        <w:t xml:space="preserve"> -&gt; </w:t>
-      </w:r>
-      <w:proofErr w:type="spellStart"/>
-      <w:r>
-        <w:t>SupportMessages</w:t>
-      </w:r>
-      <w:proofErr w:type="spellEnd"/>
-    </w:p>
-    <w:p>
-      <w:proofErr w:type="spellStart"/>
-      <w:r>
-        <w:t>Jobs</w:t>
-      </w:r>
-      <w:proofErr w:type="spellEnd"/>
-      <w:r>
-        <w:t xml:space="preserve"> -&gt; </w:t>
-      </w:r>
-      <w:proofErr w:type="spellStart"/>
-      <w:r>
-        <w:t>Ratings</w:t>
-      </w:r>
-      <w:proofErr w:type="spellEnd"/>
-    </w:p>
-    <w:p>
-      <w:pPr>
-        <w:pStyle w:val="Cmsor2"/>
-      </w:pPr>
       <w:bookmarkStart w:id="27" w:name="_Toc225302269"/>
       <w:r>
-        <w:lastRenderedPageBreak/>
         <w:t>14.4 Tesztjegyzőkönyv minta mezők</w:t>
       </w:r>
       <w:bookmarkEnd w:id="27"/>
@@ -9235,6 +9250,7 @@
   <w:style w:type="character" w:default="1" w:styleId="Bekezdsalapbettpusa">
     <w:name w:val="Default Paragraph Font"/>
     <w:uiPriority w:val="1"/>
+    <w:semiHidden/>
     <w:unhideWhenUsed/>
   </w:style>
   <w:style w:type="table" w:default="1" w:styleId="Normltblzat">

</xml_diff>

<commit_message>
Projekt frissítése az aktuális helyi állapotra
</commit_message>
<xml_diff>
--- a/dokumentacio/alakulodokumentacio.docx
+++ b/dokumentacio/alakulodokumentacio.docx
@@ -321,7 +321,7 @@
           <w:r>
             <w:fldChar w:fldCharType="separate"/>
           </w:r>
-          <w:hyperlink w:anchor="_Toc225437700" w:history="1">
+          <w:hyperlink w:anchor="_Toc225478164" w:history="1">
             <w:r>
               <w:rPr>
                 <w:rStyle w:val="Hiperhivatkozs"/>
@@ -348,7 +348,7 @@
                 <w:noProof/>
                 <w:webHidden/>
               </w:rPr>
-              <w:instrText xml:space="preserve"> PAGEREF _Toc225437700 \h </w:instrText>
+              <w:instrText xml:space="preserve"> PAGEREF _Toc225478164 \h </w:instrText>
             </w:r>
             <w:r>
               <w:rPr>
@@ -394,7 +394,7 @@
               <w14:ligatures w14:val="standardContextual"/>
             </w:rPr>
           </w:pPr>
-          <w:hyperlink w:anchor="_Toc225437701" w:history="1">
+          <w:hyperlink w:anchor="_Toc225478165" w:history="1">
             <w:r>
               <w:rPr>
                 <w:rStyle w:val="Hiperhivatkozs"/>
@@ -421,7 +421,7 @@
                 <w:noProof/>
                 <w:webHidden/>
               </w:rPr>
-              <w:instrText xml:space="preserve"> PAGEREF _Toc225437701 \h </w:instrText>
+              <w:instrText xml:space="preserve"> PAGEREF _Toc225478165 \h </w:instrText>
             </w:r>
             <w:r>
               <w:rPr>
@@ -467,7 +467,7 @@
               <w14:ligatures w14:val="standardContextual"/>
             </w:rPr>
           </w:pPr>
-          <w:hyperlink w:anchor="_Toc225437702" w:history="1">
+          <w:hyperlink w:anchor="_Toc225478166" w:history="1">
             <w:r>
               <w:rPr>
                 <w:rStyle w:val="Hiperhivatkozs"/>
@@ -494,7 +494,7 @@
                 <w:noProof/>
                 <w:webHidden/>
               </w:rPr>
-              <w:instrText xml:space="preserve"> PAGEREF _Toc225437702 \h </w:instrText>
+              <w:instrText xml:space="preserve"> PAGEREF _Toc225478166 \h </w:instrText>
             </w:r>
             <w:r>
               <w:rPr>
@@ -540,7 +540,7 @@
               <w14:ligatures w14:val="standardContextual"/>
             </w:rPr>
           </w:pPr>
-          <w:hyperlink w:anchor="_Toc225437703" w:history="1">
+          <w:hyperlink w:anchor="_Toc225478167" w:history="1">
             <w:r>
               <w:rPr>
                 <w:rStyle w:val="Hiperhivatkozs"/>
@@ -567,7 +567,7 @@
                 <w:noProof/>
                 <w:webHidden/>
               </w:rPr>
-              <w:instrText xml:space="preserve"> PAGEREF _Toc225437703 \h </w:instrText>
+              <w:instrText xml:space="preserve"> PAGEREF _Toc225478167 \h </w:instrText>
             </w:r>
             <w:r>
               <w:rPr>
@@ -613,7 +613,7 @@
               <w14:ligatures w14:val="standardContextual"/>
             </w:rPr>
           </w:pPr>
-          <w:hyperlink w:anchor="_Toc225437704" w:history="1">
+          <w:hyperlink w:anchor="_Toc225478168" w:history="1">
             <w:r>
               <w:rPr>
                 <w:rStyle w:val="Hiperhivatkozs"/>
@@ -640,7 +640,7 @@
                 <w:noProof/>
                 <w:webHidden/>
               </w:rPr>
-              <w:instrText xml:space="preserve"> PAGEREF _Toc225437704 \h </w:instrText>
+              <w:instrText xml:space="preserve"> PAGEREF _Toc225478168 \h </w:instrText>
             </w:r>
             <w:r>
               <w:rPr>
@@ -686,7 +686,7 @@
               <w14:ligatures w14:val="standardContextual"/>
             </w:rPr>
           </w:pPr>
-          <w:hyperlink w:anchor="_Toc225437705" w:history="1">
+          <w:hyperlink w:anchor="_Toc225478169" w:history="1">
             <w:r>
               <w:rPr>
                 <w:rStyle w:val="Hiperhivatkozs"/>
@@ -713,7 +713,7 @@
                 <w:noProof/>
                 <w:webHidden/>
               </w:rPr>
-              <w:instrText xml:space="preserve"> PAGEREF _Toc225437705 \h </w:instrText>
+              <w:instrText xml:space="preserve"> PAGEREF _Toc225478169 \h </w:instrText>
             </w:r>
             <w:r>
               <w:rPr>
@@ -759,7 +759,7 @@
               <w14:ligatures w14:val="standardContextual"/>
             </w:rPr>
           </w:pPr>
-          <w:hyperlink w:anchor="_Toc225437706" w:history="1">
+          <w:hyperlink w:anchor="_Toc225478170" w:history="1">
             <w:r>
               <w:rPr>
                 <w:rStyle w:val="Hiperhivatkozs"/>
@@ -786,7 +786,7 @@
                 <w:noProof/>
                 <w:webHidden/>
               </w:rPr>
-              <w:instrText xml:space="preserve"> PAGEREF _Toc225437706 \h </w:instrText>
+              <w:instrText xml:space="preserve"> PAGEREF _Toc225478170 \h </w:instrText>
             </w:r>
             <w:r>
               <w:rPr>
@@ -832,7 +832,7 @@
               <w14:ligatures w14:val="standardContextual"/>
             </w:rPr>
           </w:pPr>
-          <w:hyperlink w:anchor="_Toc225437707" w:history="1">
+          <w:hyperlink w:anchor="_Toc225478171" w:history="1">
             <w:r>
               <w:rPr>
                 <w:rStyle w:val="Hiperhivatkozs"/>
@@ -859,7 +859,7 @@
                 <w:noProof/>
                 <w:webHidden/>
               </w:rPr>
-              <w:instrText xml:space="preserve"> PAGEREF _Toc225437707 \h </w:instrText>
+              <w:instrText xml:space="preserve"> PAGEREF _Toc225478171 \h </w:instrText>
             </w:r>
             <w:r>
               <w:rPr>
@@ -905,7 +905,7 @@
               <w14:ligatures w14:val="standardContextual"/>
             </w:rPr>
           </w:pPr>
-          <w:hyperlink w:anchor="_Toc225437708" w:history="1">
+          <w:hyperlink w:anchor="_Toc225478172" w:history="1">
             <w:r>
               <w:rPr>
                 <w:rStyle w:val="Hiperhivatkozs"/>
@@ -932,7 +932,7 @@
                 <w:noProof/>
                 <w:webHidden/>
               </w:rPr>
-              <w:instrText xml:space="preserve"> PAGEREF _Toc225437708 \h </w:instrText>
+              <w:instrText xml:space="preserve"> PAGEREF _Toc225478172 \h </w:instrText>
             </w:r>
             <w:r>
               <w:rPr>
@@ -978,7 +978,7 @@
               <w14:ligatures w14:val="standardContextual"/>
             </w:rPr>
           </w:pPr>
-          <w:hyperlink w:anchor="_Toc225437709" w:history="1">
+          <w:hyperlink w:anchor="_Toc225478173" w:history="1">
             <w:r>
               <w:rPr>
                 <w:rStyle w:val="Hiperhivatkozs"/>
@@ -1005,7 +1005,7 @@
                 <w:noProof/>
                 <w:webHidden/>
               </w:rPr>
-              <w:instrText xml:space="preserve"> PAGEREF _Toc225437709 \h </w:instrText>
+              <w:instrText xml:space="preserve"> PAGEREF _Toc225478173 \h </w:instrText>
             </w:r>
             <w:r>
               <w:rPr>
@@ -1051,7 +1051,7 @@
               <w14:ligatures w14:val="standardContextual"/>
             </w:rPr>
           </w:pPr>
-          <w:hyperlink w:anchor="_Toc225437710" w:history="1">
+          <w:hyperlink w:anchor="_Toc225478174" w:history="1">
             <w:r>
               <w:rPr>
                 <w:rStyle w:val="Hiperhivatkozs"/>
@@ -1078,7 +1078,7 @@
                 <w:noProof/>
                 <w:webHidden/>
               </w:rPr>
-              <w:instrText xml:space="preserve"> PAGEREF _Toc225437710 \h </w:instrText>
+              <w:instrText xml:space="preserve"> PAGEREF _Toc225478174 \h </w:instrText>
             </w:r>
             <w:r>
               <w:rPr>
@@ -1124,7 +1124,7 @@
               <w14:ligatures w14:val="standardContextual"/>
             </w:rPr>
           </w:pPr>
-          <w:hyperlink w:anchor="_Toc225437711" w:history="1">
+          <w:hyperlink w:anchor="_Toc225478175" w:history="1">
             <w:r>
               <w:rPr>
                 <w:rStyle w:val="Hiperhivatkozs"/>
@@ -1151,7 +1151,7 @@
                 <w:noProof/>
                 <w:webHidden/>
               </w:rPr>
-              <w:instrText xml:space="preserve"> PAGEREF _Toc225437711 \h </w:instrText>
+              <w:instrText xml:space="preserve"> PAGEREF _Toc225478175 \h </w:instrText>
             </w:r>
             <w:r>
               <w:rPr>
@@ -1197,7 +1197,7 @@
               <w14:ligatures w14:val="standardContextual"/>
             </w:rPr>
           </w:pPr>
-          <w:hyperlink w:anchor="_Toc225437712" w:history="1">
+          <w:hyperlink w:anchor="_Toc225478176" w:history="1">
             <w:r>
               <w:rPr>
                 <w:rStyle w:val="Hiperhivatkozs"/>
@@ -1224,7 +1224,7 @@
                 <w:noProof/>
                 <w:webHidden/>
               </w:rPr>
-              <w:instrText xml:space="preserve"> PAGEREF _Toc225437712 \h </w:instrText>
+              <w:instrText xml:space="preserve"> PAGEREF _Toc225478176 \h </w:instrText>
             </w:r>
             <w:r>
               <w:rPr>
@@ -1270,7 +1270,7 @@
               <w14:ligatures w14:val="standardContextual"/>
             </w:rPr>
           </w:pPr>
-          <w:hyperlink w:anchor="_Toc225437713" w:history="1">
+          <w:hyperlink w:anchor="_Toc225478177" w:history="1">
             <w:r>
               <w:rPr>
                 <w:rStyle w:val="Hiperhivatkozs"/>
@@ -1297,7 +1297,7 @@
                 <w:noProof/>
                 <w:webHidden/>
               </w:rPr>
-              <w:instrText xml:space="preserve"> PAGEREF _Toc225437713 \h </w:instrText>
+              <w:instrText xml:space="preserve"> PAGEREF _Toc225478177 \h </w:instrText>
             </w:r>
             <w:r>
               <w:rPr>
@@ -1343,7 +1343,7 @@
               <w14:ligatures w14:val="standardContextual"/>
             </w:rPr>
           </w:pPr>
-          <w:hyperlink w:anchor="_Toc225437714" w:history="1">
+          <w:hyperlink w:anchor="_Toc225478178" w:history="1">
             <w:r>
               <w:rPr>
                 <w:rStyle w:val="Hiperhivatkozs"/>
@@ -1370,7 +1370,7 @@
                 <w:noProof/>
                 <w:webHidden/>
               </w:rPr>
-              <w:instrText xml:space="preserve"> PAGEREF _Toc225437714 \h </w:instrText>
+              <w:instrText xml:space="preserve"> PAGEREF _Toc225478178 \h </w:instrText>
             </w:r>
             <w:r>
               <w:rPr>
@@ -1416,7 +1416,7 @@
               <w14:ligatures w14:val="standardContextual"/>
             </w:rPr>
           </w:pPr>
-          <w:hyperlink w:anchor="_Toc225437715" w:history="1">
+          <w:hyperlink w:anchor="_Toc225478179" w:history="1">
             <w:r>
               <w:rPr>
                 <w:rStyle w:val="Hiperhivatkozs"/>
@@ -1443,7 +1443,7 @@
                 <w:noProof/>
                 <w:webHidden/>
               </w:rPr>
-              <w:instrText xml:space="preserve"> PAGEREF _Toc225437715 \h </w:instrText>
+              <w:instrText xml:space="preserve"> PAGEREF _Toc225478179 \h </w:instrText>
             </w:r>
             <w:r>
               <w:rPr>
@@ -1489,7 +1489,7 @@
               <w14:ligatures w14:val="standardContextual"/>
             </w:rPr>
           </w:pPr>
-          <w:hyperlink w:anchor="_Toc225437716" w:history="1">
+          <w:hyperlink w:anchor="_Toc225478180" w:history="1">
             <w:r>
               <w:rPr>
                 <w:rStyle w:val="Hiperhivatkozs"/>
@@ -1516,7 +1516,7 @@
                 <w:noProof/>
                 <w:webHidden/>
               </w:rPr>
-              <w:instrText xml:space="preserve"> PAGEREF _Toc225437716 \h </w:instrText>
+              <w:instrText xml:space="preserve"> PAGEREF _Toc225478180 \h </w:instrText>
             </w:r>
             <w:r>
               <w:rPr>
@@ -1562,7 +1562,7 @@
               <w14:ligatures w14:val="standardContextual"/>
             </w:rPr>
           </w:pPr>
-          <w:hyperlink w:anchor="_Toc225437717" w:history="1">
+          <w:hyperlink w:anchor="_Toc225478181" w:history="1">
             <w:r>
               <w:rPr>
                 <w:rStyle w:val="Hiperhivatkozs"/>
@@ -1589,7 +1589,7 @@
                 <w:noProof/>
                 <w:webHidden/>
               </w:rPr>
-              <w:instrText xml:space="preserve"> PAGEREF _Toc225437717 \h </w:instrText>
+              <w:instrText xml:space="preserve"> PAGEREF _Toc225478181 \h </w:instrText>
             </w:r>
             <w:r>
               <w:rPr>
@@ -1635,7 +1635,7 @@
               <w14:ligatures w14:val="standardContextual"/>
             </w:rPr>
           </w:pPr>
-          <w:hyperlink w:anchor="_Toc225437718" w:history="1">
+          <w:hyperlink w:anchor="_Toc225478182" w:history="1">
             <w:r>
               <w:rPr>
                 <w:rStyle w:val="Hiperhivatkozs"/>
@@ -1662,7 +1662,7 @@
                 <w:noProof/>
                 <w:webHidden/>
               </w:rPr>
-              <w:instrText xml:space="preserve"> PAGEREF _Toc225437718 \h </w:instrText>
+              <w:instrText xml:space="preserve"> PAGEREF _Toc225478182 \h </w:instrText>
             </w:r>
             <w:r>
               <w:rPr>
@@ -1708,7 +1708,7 @@
               <w14:ligatures w14:val="standardContextual"/>
             </w:rPr>
           </w:pPr>
-          <w:hyperlink w:anchor="_Toc225437719" w:history="1">
+          <w:hyperlink w:anchor="_Toc225478183" w:history="1">
             <w:r>
               <w:rPr>
                 <w:rStyle w:val="Hiperhivatkozs"/>
@@ -1735,7 +1735,7 @@
                 <w:noProof/>
                 <w:webHidden/>
               </w:rPr>
-              <w:instrText xml:space="preserve"> PAGEREF _Toc225437719 \h </w:instrText>
+              <w:instrText xml:space="preserve"> PAGEREF _Toc225478183 \h </w:instrText>
             </w:r>
             <w:r>
               <w:rPr>
@@ -1781,7 +1781,7 @@
               <w14:ligatures w14:val="standardContextual"/>
             </w:rPr>
           </w:pPr>
-          <w:hyperlink w:anchor="_Toc225437720" w:history="1">
+          <w:hyperlink w:anchor="_Toc225478184" w:history="1">
             <w:r>
               <w:rPr>
                 <w:rStyle w:val="Hiperhivatkozs"/>
@@ -1808,7 +1808,7 @@
                 <w:noProof/>
                 <w:webHidden/>
               </w:rPr>
-              <w:instrText xml:space="preserve"> PAGEREF _Toc225437720 \h </w:instrText>
+              <w:instrText xml:space="preserve"> PAGEREF _Toc225478184 \h </w:instrText>
             </w:r>
             <w:r>
               <w:rPr>
@@ -1829,6 +1829,152 @@
                 <w:webHidden/>
               </w:rPr>
               <w:t>22</w:t>
+            </w:r>
+            <w:r>
+              <w:rPr>
+                <w:noProof/>
+                <w:webHidden/>
+              </w:rPr>
+              <w:fldChar w:fldCharType="end"/>
+            </w:r>
+          </w:hyperlink>
+        </w:p>
+        <w:p>
+          <w:pPr>
+            <w:pStyle w:val="TJ3"/>
+            <w:tabs>
+              <w:tab w:val="right" w:leader="dot" w:pos="9062"/>
+            </w:tabs>
+            <w:rPr>
+              <w:rFonts w:cstheme="minorBidi"/>
+              <w:noProof/>
+              <w:kern w:val="2"/>
+              <w:szCs w:val="24"/>
+              <w:lang w:eastAsia="hu-HU"/>
+              <w14:ligatures w14:val="standardContextual"/>
+            </w:rPr>
+          </w:pPr>
+          <w:hyperlink w:anchor="_Toc225478185" w:history="1">
+            <w:r>
+              <w:rPr>
+                <w:rStyle w:val="Hiperhivatkozs"/>
+                <w:noProof/>
+              </w:rPr>
+              <w:t>6.2.7 RequestMessages tábla</w:t>
+            </w:r>
+            <w:r>
+              <w:rPr>
+                <w:noProof/>
+                <w:webHidden/>
+              </w:rPr>
+              <w:tab/>
+            </w:r>
+            <w:r>
+              <w:rPr>
+                <w:noProof/>
+                <w:webHidden/>
+              </w:rPr>
+              <w:fldChar w:fldCharType="begin"/>
+            </w:r>
+            <w:r>
+              <w:rPr>
+                <w:noProof/>
+                <w:webHidden/>
+              </w:rPr>
+              <w:instrText xml:space="preserve"> PAGEREF _Toc225478185 \h </w:instrText>
+            </w:r>
+            <w:r>
+              <w:rPr>
+                <w:noProof/>
+                <w:webHidden/>
+              </w:rPr>
+            </w:r>
+            <w:r>
+              <w:rPr>
+                <w:noProof/>
+                <w:webHidden/>
+              </w:rPr>
+              <w:fldChar w:fldCharType="separate"/>
+            </w:r>
+            <w:r>
+              <w:rPr>
+                <w:noProof/>
+                <w:webHidden/>
+              </w:rPr>
+              <w:t>22</w:t>
+            </w:r>
+            <w:r>
+              <w:rPr>
+                <w:noProof/>
+                <w:webHidden/>
+              </w:rPr>
+              <w:fldChar w:fldCharType="end"/>
+            </w:r>
+          </w:hyperlink>
+        </w:p>
+        <w:p>
+          <w:pPr>
+            <w:pStyle w:val="TJ3"/>
+            <w:tabs>
+              <w:tab w:val="right" w:leader="dot" w:pos="9062"/>
+            </w:tabs>
+            <w:rPr>
+              <w:rFonts w:cstheme="minorBidi"/>
+              <w:noProof/>
+              <w:kern w:val="2"/>
+              <w:szCs w:val="24"/>
+              <w:lang w:eastAsia="hu-HU"/>
+              <w14:ligatures w14:val="standardContextual"/>
+            </w:rPr>
+          </w:pPr>
+          <w:hyperlink w:anchor="_Toc225478186" w:history="1">
+            <w:r>
+              <w:rPr>
+                <w:rStyle w:val="Hiperhivatkozs"/>
+                <w:noProof/>
+              </w:rPr>
+              <w:t>6.2.8 PasswordResetTokens tábla</w:t>
+            </w:r>
+            <w:r>
+              <w:rPr>
+                <w:noProof/>
+                <w:webHidden/>
+              </w:rPr>
+              <w:tab/>
+            </w:r>
+            <w:r>
+              <w:rPr>
+                <w:noProof/>
+                <w:webHidden/>
+              </w:rPr>
+              <w:fldChar w:fldCharType="begin"/>
+            </w:r>
+            <w:r>
+              <w:rPr>
+                <w:noProof/>
+                <w:webHidden/>
+              </w:rPr>
+              <w:instrText xml:space="preserve"> PAGEREF _Toc225478186 \h </w:instrText>
+            </w:r>
+            <w:r>
+              <w:rPr>
+                <w:noProof/>
+                <w:webHidden/>
+              </w:rPr>
+            </w:r>
+            <w:r>
+              <w:rPr>
+                <w:noProof/>
+                <w:webHidden/>
+              </w:rPr>
+              <w:fldChar w:fldCharType="separate"/>
+            </w:r>
+            <w:r>
+              <w:rPr>
+                <w:noProof/>
+                <w:webHidden/>
+              </w:rPr>
+              <w:t>23</w:t>
             </w:r>
             <w:r>
               <w:rPr>
@@ -1854,7 +2000,7 @@
               <w14:ligatures w14:val="standardContextual"/>
             </w:rPr>
           </w:pPr>
-          <w:hyperlink w:anchor="_Toc225437721" w:history="1">
+          <w:hyperlink w:anchor="_Toc225478187" w:history="1">
             <w:r>
               <w:rPr>
                 <w:rStyle w:val="Hiperhivatkozs"/>
@@ -1881,7 +2027,7 @@
                 <w:noProof/>
                 <w:webHidden/>
               </w:rPr>
-              <w:instrText xml:space="preserve"> PAGEREF _Toc225437721 \h </w:instrText>
+              <w:instrText xml:space="preserve"> PAGEREF _Toc225478187 \h </w:instrText>
             </w:r>
             <w:r>
               <w:rPr>
@@ -1901,7 +2047,7 @@
                 <w:noProof/>
                 <w:webHidden/>
               </w:rPr>
-              <w:t>23</w:t>
+              <w:t>24</w:t>
             </w:r>
             <w:r>
               <w:rPr>
@@ -1927,7 +2073,7 @@
               <w14:ligatures w14:val="standardContextual"/>
             </w:rPr>
           </w:pPr>
-          <w:hyperlink w:anchor="_Toc225437722" w:history="1">
+          <w:hyperlink w:anchor="_Toc225478188" w:history="1">
             <w:r>
               <w:rPr>
                 <w:rStyle w:val="Hiperhivatkozs"/>
@@ -1954,7 +2100,7 @@
                 <w:noProof/>
                 <w:webHidden/>
               </w:rPr>
-              <w:instrText xml:space="preserve"> PAGEREF _Toc225437722 \h </w:instrText>
+              <w:instrText xml:space="preserve"> PAGEREF _Toc225478188 \h </w:instrText>
             </w:r>
             <w:r>
               <w:rPr>
@@ -1974,7 +2120,7 @@
                 <w:noProof/>
                 <w:webHidden/>
               </w:rPr>
-              <w:t>25</w:t>
+              <w:t>26</w:t>
             </w:r>
             <w:r>
               <w:rPr>
@@ -2000,7 +2146,7 @@
               <w14:ligatures w14:val="standardContextual"/>
             </w:rPr>
           </w:pPr>
-          <w:hyperlink w:anchor="_Toc225437723" w:history="1">
+          <w:hyperlink w:anchor="_Toc225478189" w:history="1">
             <w:r>
               <w:rPr>
                 <w:rStyle w:val="Hiperhivatkozs"/>
@@ -2027,7 +2173,7 @@
                 <w:noProof/>
                 <w:webHidden/>
               </w:rPr>
-              <w:instrText xml:space="preserve"> PAGEREF _Toc225437723 \h </w:instrText>
+              <w:instrText xml:space="preserve"> PAGEREF _Toc225478189 \h </w:instrText>
             </w:r>
             <w:r>
               <w:rPr>
@@ -2047,7 +2193,7 @@
                 <w:noProof/>
                 <w:webHidden/>
               </w:rPr>
-              <w:t>27</w:t>
+              <w:t>28</w:t>
             </w:r>
             <w:r>
               <w:rPr>
@@ -2073,7 +2219,7 @@
               <w14:ligatures w14:val="standardContextual"/>
             </w:rPr>
           </w:pPr>
-          <w:hyperlink w:anchor="_Toc225437724" w:history="1">
+          <w:hyperlink w:anchor="_Toc225478190" w:history="1">
             <w:r>
               <w:rPr>
                 <w:rStyle w:val="Hiperhivatkozs"/>
@@ -2100,7 +2246,7 @@
                 <w:noProof/>
                 <w:webHidden/>
               </w:rPr>
-              <w:instrText xml:space="preserve"> PAGEREF _Toc225437724 \h </w:instrText>
+              <w:instrText xml:space="preserve"> PAGEREF _Toc225478190 \h </w:instrText>
             </w:r>
             <w:r>
               <w:rPr>
@@ -2120,7 +2266,7 @@
                 <w:noProof/>
                 <w:webHidden/>
               </w:rPr>
-              <w:t>29</w:t>
+              <w:t>30</w:t>
             </w:r>
             <w:r>
               <w:rPr>
@@ -2146,7 +2292,7 @@
               <w14:ligatures w14:val="standardContextual"/>
             </w:rPr>
           </w:pPr>
-          <w:hyperlink w:anchor="_Toc225437725" w:history="1">
+          <w:hyperlink w:anchor="_Toc225478191" w:history="1">
             <w:r>
               <w:rPr>
                 <w:rStyle w:val="Hiperhivatkozs"/>
@@ -2173,7 +2319,7 @@
                 <w:noProof/>
                 <w:webHidden/>
               </w:rPr>
-              <w:instrText xml:space="preserve"> PAGEREF _Toc225437725 \h </w:instrText>
+              <w:instrText xml:space="preserve"> PAGEREF _Toc225478191 \h </w:instrText>
             </w:r>
             <w:r>
               <w:rPr>
@@ -2193,7 +2339,7 @@
                 <w:noProof/>
                 <w:webHidden/>
               </w:rPr>
-              <w:t>31</w:t>
+              <w:t>32</w:t>
             </w:r>
             <w:r>
               <w:rPr>
@@ -2219,7 +2365,7 @@
               <w14:ligatures w14:val="standardContextual"/>
             </w:rPr>
           </w:pPr>
-          <w:hyperlink w:anchor="_Toc225437726" w:history="1">
+          <w:hyperlink w:anchor="_Toc225478192" w:history="1">
             <w:r>
               <w:rPr>
                 <w:rStyle w:val="Hiperhivatkozs"/>
@@ -2246,7 +2392,7 @@
                 <w:noProof/>
                 <w:webHidden/>
               </w:rPr>
-              <w:instrText xml:space="preserve"> PAGEREF _Toc225437726 \h </w:instrText>
+              <w:instrText xml:space="preserve"> PAGEREF _Toc225478192 \h </w:instrText>
             </w:r>
             <w:r>
               <w:rPr>
@@ -2266,7 +2412,7 @@
                 <w:noProof/>
                 <w:webHidden/>
               </w:rPr>
-              <w:t>32</w:t>
+              <w:t>33</w:t>
             </w:r>
             <w:r>
               <w:rPr>
@@ -2292,7 +2438,7 @@
               <w14:ligatures w14:val="standardContextual"/>
             </w:rPr>
           </w:pPr>
-          <w:hyperlink w:anchor="_Toc225437727" w:history="1">
+          <w:hyperlink w:anchor="_Toc225478193" w:history="1">
             <w:r>
               <w:rPr>
                 <w:rStyle w:val="Hiperhivatkozs"/>
@@ -2319,7 +2465,7 @@
                 <w:noProof/>
                 <w:webHidden/>
               </w:rPr>
-              <w:instrText xml:space="preserve"> PAGEREF _Toc225437727 \h </w:instrText>
+              <w:instrText xml:space="preserve"> PAGEREF _Toc225478193 \h </w:instrText>
             </w:r>
             <w:r>
               <w:rPr>
@@ -2339,7 +2485,7 @@
                 <w:noProof/>
                 <w:webHidden/>
               </w:rPr>
-              <w:t>33</w:t>
+              <w:t>34</w:t>
             </w:r>
             <w:r>
               <w:rPr>
@@ -2365,7 +2511,7 @@
               <w14:ligatures w14:val="standardContextual"/>
             </w:rPr>
           </w:pPr>
-          <w:hyperlink w:anchor="_Toc225437728" w:history="1">
+          <w:hyperlink w:anchor="_Toc225478194" w:history="1">
             <w:r>
               <w:rPr>
                 <w:rStyle w:val="Hiperhivatkozs"/>
@@ -2392,7 +2538,7 @@
                 <w:noProof/>
                 <w:webHidden/>
               </w:rPr>
-              <w:instrText xml:space="preserve"> PAGEREF _Toc225437728 \h </w:instrText>
+              <w:instrText xml:space="preserve"> PAGEREF _Toc225478194 \h </w:instrText>
             </w:r>
             <w:r>
               <w:rPr>
@@ -2412,7 +2558,7 @@
                 <w:noProof/>
                 <w:webHidden/>
               </w:rPr>
-              <w:t>34</w:t>
+              <w:t>35</w:t>
             </w:r>
             <w:r>
               <w:rPr>
@@ -2438,7 +2584,7 @@
               <w14:ligatures w14:val="standardContextual"/>
             </w:rPr>
           </w:pPr>
-          <w:hyperlink w:anchor="_Toc225437729" w:history="1">
+          <w:hyperlink w:anchor="_Toc225478195" w:history="1">
             <w:r>
               <w:rPr>
                 <w:rStyle w:val="Hiperhivatkozs"/>
@@ -2465,7 +2611,7 @@
                 <w:noProof/>
                 <w:webHidden/>
               </w:rPr>
-              <w:instrText xml:space="preserve"> PAGEREF _Toc225437729 \h </w:instrText>
+              <w:instrText xml:space="preserve"> PAGEREF _Toc225478195 \h </w:instrText>
             </w:r>
             <w:r>
               <w:rPr>
@@ -2485,7 +2631,7 @@
                 <w:noProof/>
                 <w:webHidden/>
               </w:rPr>
-              <w:t>35</w:t>
+              <w:t>36</w:t>
             </w:r>
             <w:r>
               <w:rPr>
@@ -2511,7 +2657,7 @@
               <w14:ligatures w14:val="standardContextual"/>
             </w:rPr>
           </w:pPr>
-          <w:hyperlink w:anchor="_Toc225437730" w:history="1">
+          <w:hyperlink w:anchor="_Toc225478196" w:history="1">
             <w:r>
               <w:rPr>
                 <w:rStyle w:val="Hiperhivatkozs"/>
@@ -2538,7 +2684,7 @@
                 <w:noProof/>
                 <w:webHidden/>
               </w:rPr>
-              <w:instrText xml:space="preserve"> PAGEREF _Toc225437730 \h </w:instrText>
+              <w:instrText xml:space="preserve"> PAGEREF _Toc225478196 \h </w:instrText>
             </w:r>
             <w:r>
               <w:rPr>
@@ -2558,7 +2704,7 @@
                 <w:noProof/>
                 <w:webHidden/>
               </w:rPr>
-              <w:t>36</w:t>
+              <w:t>37</w:t>
             </w:r>
             <w:r>
               <w:rPr>
@@ -2584,7 +2730,7 @@
               <w14:ligatures w14:val="standardContextual"/>
             </w:rPr>
           </w:pPr>
-          <w:hyperlink w:anchor="_Toc225437731" w:history="1">
+          <w:hyperlink w:anchor="_Toc225478197" w:history="1">
             <w:r>
               <w:rPr>
                 <w:rStyle w:val="Hiperhivatkozs"/>
@@ -2611,7 +2757,7 @@
                 <w:noProof/>
                 <w:webHidden/>
               </w:rPr>
-              <w:instrText xml:space="preserve"> PAGEREF _Toc225437731 \h </w:instrText>
+              <w:instrText xml:space="preserve"> PAGEREF _Toc225478197 \h </w:instrText>
             </w:r>
             <w:r>
               <w:rPr>
@@ -2631,7 +2777,7 @@
                 <w:noProof/>
                 <w:webHidden/>
               </w:rPr>
-              <w:t>37</w:t>
+              <w:t>38</w:t>
             </w:r>
             <w:r>
               <w:rPr>
@@ -2657,7 +2803,7 @@
               <w14:ligatures w14:val="standardContextual"/>
             </w:rPr>
           </w:pPr>
-          <w:hyperlink w:anchor="_Toc225437732" w:history="1">
+          <w:hyperlink w:anchor="_Toc225478198" w:history="1">
             <w:r>
               <w:rPr>
                 <w:rStyle w:val="Hiperhivatkozs"/>
@@ -2684,7 +2830,7 @@
                 <w:noProof/>
                 <w:webHidden/>
               </w:rPr>
-              <w:instrText xml:space="preserve"> PAGEREF _Toc225437732 \h </w:instrText>
+              <w:instrText xml:space="preserve"> PAGEREF _Toc225478198 \h </w:instrText>
             </w:r>
             <w:r>
               <w:rPr>
@@ -2704,7 +2850,7 @@
                 <w:noProof/>
                 <w:webHidden/>
               </w:rPr>
-              <w:t>38</w:t>
+              <w:t>39</w:t>
             </w:r>
             <w:r>
               <w:rPr>
@@ -2730,7 +2876,7 @@
               <w14:ligatures w14:val="standardContextual"/>
             </w:rPr>
           </w:pPr>
-          <w:hyperlink w:anchor="_Toc225437733" w:history="1">
+          <w:hyperlink w:anchor="_Toc225478199" w:history="1">
             <w:r>
               <w:rPr>
                 <w:rStyle w:val="Hiperhivatkozs"/>
@@ -2757,7 +2903,7 @@
                 <w:noProof/>
                 <w:webHidden/>
               </w:rPr>
-              <w:instrText xml:space="preserve"> PAGEREF _Toc225437733 \h </w:instrText>
+              <w:instrText xml:space="preserve"> PAGEREF _Toc225478199 \h </w:instrText>
             </w:r>
             <w:r>
               <w:rPr>
@@ -2777,7 +2923,7 @@
                 <w:noProof/>
                 <w:webHidden/>
               </w:rPr>
-              <w:t>39</w:t>
+              <w:t>40</w:t>
             </w:r>
             <w:r>
               <w:rPr>
@@ -2803,7 +2949,7 @@
               <w14:ligatures w14:val="standardContextual"/>
             </w:rPr>
           </w:pPr>
-          <w:hyperlink w:anchor="_Toc225437734" w:history="1">
+          <w:hyperlink w:anchor="_Toc225478200" w:history="1">
             <w:r>
               <w:rPr>
                 <w:rStyle w:val="Hiperhivatkozs"/>
@@ -2830,7 +2976,7 @@
                 <w:noProof/>
                 <w:webHidden/>
               </w:rPr>
-              <w:instrText xml:space="preserve"> PAGEREF _Toc225437734 \h </w:instrText>
+              <w:instrText xml:space="preserve"> PAGEREF _Toc225478200 \h </w:instrText>
             </w:r>
             <w:r>
               <w:rPr>
@@ -2850,7 +2996,7 @@
                 <w:noProof/>
                 <w:webHidden/>
               </w:rPr>
-              <w:t>40</w:t>
+              <w:t>41</w:t>
             </w:r>
             <w:r>
               <w:rPr>
@@ -2876,7 +3022,7 @@
               <w14:ligatures w14:val="standardContextual"/>
             </w:rPr>
           </w:pPr>
-          <w:hyperlink w:anchor="_Toc225437735" w:history="1">
+          <w:hyperlink w:anchor="_Toc225478201" w:history="1">
             <w:r>
               <w:rPr>
                 <w:rStyle w:val="Hiperhivatkozs"/>
@@ -2903,7 +3049,7 @@
                 <w:noProof/>
                 <w:webHidden/>
               </w:rPr>
-              <w:instrText xml:space="preserve"> PAGEREF _Toc225437735 \h </w:instrText>
+              <w:instrText xml:space="preserve"> PAGEREF _Toc225478201 \h </w:instrText>
             </w:r>
             <w:r>
               <w:rPr>
@@ -2923,7 +3069,7 @@
                 <w:noProof/>
                 <w:webHidden/>
               </w:rPr>
-              <w:t>41</w:t>
+              <w:t>42</w:t>
             </w:r>
             <w:r>
               <w:rPr>
@@ -2949,7 +3095,7 @@
               <w14:ligatures w14:val="standardContextual"/>
             </w:rPr>
           </w:pPr>
-          <w:hyperlink w:anchor="_Toc225437736" w:history="1">
+          <w:hyperlink w:anchor="_Toc225478202" w:history="1">
             <w:r>
               <w:rPr>
                 <w:rStyle w:val="Hiperhivatkozs"/>
@@ -2976,7 +3122,7 @@
                 <w:noProof/>
                 <w:webHidden/>
               </w:rPr>
-              <w:instrText xml:space="preserve"> PAGEREF _Toc225437736 \h </w:instrText>
+              <w:instrText xml:space="preserve"> PAGEREF _Toc225478202 \h </w:instrText>
             </w:r>
             <w:r>
               <w:rPr>
@@ -2996,7 +3142,7 @@
                 <w:noProof/>
                 <w:webHidden/>
               </w:rPr>
-              <w:t>42</w:t>
+              <w:t>43</w:t>
             </w:r>
             <w:r>
               <w:rPr>
@@ -3022,7 +3168,7 @@
               <w14:ligatures w14:val="standardContextual"/>
             </w:rPr>
           </w:pPr>
-          <w:hyperlink w:anchor="_Toc225437737" w:history="1">
+          <w:hyperlink w:anchor="_Toc225478203" w:history="1">
             <w:r>
               <w:rPr>
                 <w:rStyle w:val="Hiperhivatkozs"/>
@@ -3049,7 +3195,7 @@
                 <w:noProof/>
                 <w:webHidden/>
               </w:rPr>
-              <w:instrText xml:space="preserve"> PAGEREF _Toc225437737 \h </w:instrText>
+              <w:instrText xml:space="preserve"> PAGEREF _Toc225478203 \h </w:instrText>
             </w:r>
             <w:r>
               <w:rPr>
@@ -3069,7 +3215,7 @@
                 <w:noProof/>
                 <w:webHidden/>
               </w:rPr>
-              <w:t>43</w:t>
+              <w:t>44</w:t>
             </w:r>
             <w:r>
               <w:rPr>
@@ -3095,7 +3241,7 @@
               <w14:ligatures w14:val="standardContextual"/>
             </w:rPr>
           </w:pPr>
-          <w:hyperlink w:anchor="_Toc225437738" w:history="1">
+          <w:hyperlink w:anchor="_Toc225478204" w:history="1">
             <w:r>
               <w:rPr>
                 <w:rStyle w:val="Hiperhivatkozs"/>
@@ -3122,7 +3268,7 @@
                 <w:noProof/>
                 <w:webHidden/>
               </w:rPr>
-              <w:instrText xml:space="preserve"> PAGEREF _Toc225437738 \h </w:instrText>
+              <w:instrText xml:space="preserve"> PAGEREF _Toc225478204 \h </w:instrText>
             </w:r>
             <w:r>
               <w:rPr>
@@ -3142,7 +3288,7 @@
                 <w:noProof/>
                 <w:webHidden/>
               </w:rPr>
-              <w:t>44</w:t>
+              <w:t>45</w:t>
             </w:r>
             <w:r>
               <w:rPr>
@@ -3168,7 +3314,7 @@
               <w14:ligatures w14:val="standardContextual"/>
             </w:rPr>
           </w:pPr>
-          <w:hyperlink w:anchor="_Toc225437739" w:history="1">
+          <w:hyperlink w:anchor="_Toc225478205" w:history="1">
             <w:r>
               <w:rPr>
                 <w:rStyle w:val="Hiperhivatkozs"/>
@@ -3195,7 +3341,7 @@
                 <w:noProof/>
                 <w:webHidden/>
               </w:rPr>
-              <w:instrText xml:space="preserve"> PAGEREF _Toc225437739 \h </w:instrText>
+              <w:instrText xml:space="preserve"> PAGEREF _Toc225478205 \h </w:instrText>
             </w:r>
             <w:r>
               <w:rPr>
@@ -3215,7 +3361,7 @@
                 <w:noProof/>
                 <w:webHidden/>
               </w:rPr>
-              <w:t>45</w:t>
+              <w:t>46</w:t>
             </w:r>
             <w:r>
               <w:rPr>
@@ -3241,7 +3387,7 @@
               <w14:ligatures w14:val="standardContextual"/>
             </w:rPr>
           </w:pPr>
-          <w:hyperlink w:anchor="_Toc225437740" w:history="1">
+          <w:hyperlink w:anchor="_Toc225478206" w:history="1">
             <w:r>
               <w:rPr>
                 <w:rStyle w:val="Hiperhivatkozs"/>
@@ -3268,7 +3414,7 @@
                 <w:noProof/>
                 <w:webHidden/>
               </w:rPr>
-              <w:instrText xml:space="preserve"> PAGEREF _Toc225437740 \h </w:instrText>
+              <w:instrText xml:space="preserve"> PAGEREF _Toc225478206 \h </w:instrText>
             </w:r>
             <w:r>
               <w:rPr>
@@ -3288,7 +3434,7 @@
                 <w:noProof/>
                 <w:webHidden/>
               </w:rPr>
-              <w:t>46</w:t>
+              <w:t>47</w:t>
             </w:r>
             <w:r>
               <w:rPr>
@@ -3314,7 +3460,7 @@
               <w14:ligatures w14:val="standardContextual"/>
             </w:rPr>
           </w:pPr>
-          <w:hyperlink w:anchor="_Toc225437741" w:history="1">
+          <w:hyperlink w:anchor="_Toc225478207" w:history="1">
             <w:r>
               <w:rPr>
                 <w:rStyle w:val="Hiperhivatkozs"/>
@@ -3341,7 +3487,7 @@
                 <w:noProof/>
                 <w:webHidden/>
               </w:rPr>
-              <w:instrText xml:space="preserve"> PAGEREF _Toc225437741 \h </w:instrText>
+              <w:instrText xml:space="preserve"> PAGEREF _Toc225478207 \h </w:instrText>
             </w:r>
             <w:r>
               <w:rPr>
@@ -3361,7 +3507,7 @@
                 <w:noProof/>
                 <w:webHidden/>
               </w:rPr>
-              <w:t>48</w:t>
+              <w:t>49</w:t>
             </w:r>
             <w:r>
               <w:rPr>
@@ -3387,7 +3533,7 @@
               <w14:ligatures w14:val="standardContextual"/>
             </w:rPr>
           </w:pPr>
-          <w:hyperlink w:anchor="_Toc225437742" w:history="1">
+          <w:hyperlink w:anchor="_Toc225478208" w:history="1">
             <w:r>
               <w:rPr>
                 <w:rStyle w:val="Hiperhivatkozs"/>
@@ -3414,7 +3560,7 @@
                 <w:noProof/>
                 <w:webHidden/>
               </w:rPr>
-              <w:instrText xml:space="preserve"> PAGEREF _Toc225437742 \h </w:instrText>
+              <w:instrText xml:space="preserve"> PAGEREF _Toc225478208 \h </w:instrText>
             </w:r>
             <w:r>
               <w:rPr>
@@ -3434,7 +3580,7 @@
                 <w:noProof/>
                 <w:webHidden/>
               </w:rPr>
-              <w:t>49</w:t>
+              <w:t>50</w:t>
             </w:r>
             <w:r>
               <w:rPr>
@@ -3460,7 +3606,7 @@
               <w14:ligatures w14:val="standardContextual"/>
             </w:rPr>
           </w:pPr>
-          <w:hyperlink w:anchor="_Toc225437743" w:history="1">
+          <w:hyperlink w:anchor="_Toc225478209" w:history="1">
             <w:r>
               <w:rPr>
                 <w:rStyle w:val="Hiperhivatkozs"/>
@@ -3487,7 +3633,7 @@
                 <w:noProof/>
                 <w:webHidden/>
               </w:rPr>
-              <w:instrText xml:space="preserve"> PAGEREF _Toc225437743 \h </w:instrText>
+              <w:instrText xml:space="preserve"> PAGEREF _Toc225478209 \h </w:instrText>
             </w:r>
             <w:r>
               <w:rPr>
@@ -3507,7 +3653,7 @@
                 <w:noProof/>
                 <w:webHidden/>
               </w:rPr>
-              <w:t>50</w:t>
+              <w:t>51</w:t>
             </w:r>
             <w:r>
               <w:rPr>
@@ -3533,7 +3679,7 @@
               <w14:ligatures w14:val="standardContextual"/>
             </w:rPr>
           </w:pPr>
-          <w:hyperlink w:anchor="_Toc225437744" w:history="1">
+          <w:hyperlink w:anchor="_Toc225478210" w:history="1">
             <w:r>
               <w:rPr>
                 <w:rStyle w:val="Hiperhivatkozs"/>
@@ -3560,7 +3706,7 @@
                 <w:noProof/>
                 <w:webHidden/>
               </w:rPr>
-              <w:instrText xml:space="preserve"> PAGEREF _Toc225437744 \h </w:instrText>
+              <w:instrText xml:space="preserve"> PAGEREF _Toc225478210 \h </w:instrText>
             </w:r>
             <w:r>
               <w:rPr>
@@ -3580,7 +3726,7 @@
                 <w:noProof/>
                 <w:webHidden/>
               </w:rPr>
-              <w:t>50</w:t>
+              <w:t>51</w:t>
             </w:r>
             <w:r>
               <w:rPr>
@@ -3606,7 +3752,7 @@
               <w14:ligatures w14:val="standardContextual"/>
             </w:rPr>
           </w:pPr>
-          <w:hyperlink w:anchor="_Toc225437745" w:history="1">
+          <w:hyperlink w:anchor="_Toc225478211" w:history="1">
             <w:r>
               <w:rPr>
                 <w:rStyle w:val="Hiperhivatkozs"/>
@@ -3633,7 +3779,7 @@
                 <w:noProof/>
                 <w:webHidden/>
               </w:rPr>
-              <w:instrText xml:space="preserve"> PAGEREF _Toc225437745 \h </w:instrText>
+              <w:instrText xml:space="preserve"> PAGEREF _Toc225478211 \h </w:instrText>
             </w:r>
             <w:r>
               <w:rPr>
@@ -3653,7 +3799,7 @@
                 <w:noProof/>
                 <w:webHidden/>
               </w:rPr>
-              <w:t>50</w:t>
+              <w:t>51</w:t>
             </w:r>
             <w:r>
               <w:rPr>
@@ -3679,7 +3825,7 @@
               <w14:ligatures w14:val="standardContextual"/>
             </w:rPr>
           </w:pPr>
-          <w:hyperlink w:anchor="_Toc225437746" w:history="1">
+          <w:hyperlink w:anchor="_Toc225478212" w:history="1">
             <w:r>
               <w:rPr>
                 <w:rStyle w:val="Hiperhivatkozs"/>
@@ -3706,7 +3852,7 @@
                 <w:noProof/>
                 <w:webHidden/>
               </w:rPr>
-              <w:instrText xml:space="preserve"> PAGEREF _Toc225437746 \h </w:instrText>
+              <w:instrText xml:space="preserve"> PAGEREF _Toc225478212 \h </w:instrText>
             </w:r>
             <w:r>
               <w:rPr>
@@ -3726,7 +3872,7 @@
                 <w:noProof/>
                 <w:webHidden/>
               </w:rPr>
-              <w:t>51</w:t>
+              <w:t>52</w:t>
             </w:r>
             <w:r>
               <w:rPr>
@@ -3752,7 +3898,7 @@
               <w14:ligatures w14:val="standardContextual"/>
             </w:rPr>
           </w:pPr>
-          <w:hyperlink w:anchor="_Toc225437747" w:history="1">
+          <w:hyperlink w:anchor="_Toc225478213" w:history="1">
             <w:r>
               <w:rPr>
                 <w:rStyle w:val="Hiperhivatkozs"/>
@@ -3788,7 +3934,7 @@
                 <w:noProof/>
                 <w:webHidden/>
               </w:rPr>
-              <w:instrText xml:space="preserve"> PAGEREF _Toc225437747 \h </w:instrText>
+              <w:instrText xml:space="preserve"> PAGEREF _Toc225478213 \h </w:instrText>
             </w:r>
             <w:r>
               <w:rPr>
@@ -3808,7 +3954,7 @@
                 <w:noProof/>
                 <w:webHidden/>
               </w:rPr>
-              <w:t>51</w:t>
+              <w:t>52</w:t>
             </w:r>
             <w:r>
               <w:rPr>
@@ -3834,7 +3980,7 @@
               <w14:ligatures w14:val="standardContextual"/>
             </w:rPr>
           </w:pPr>
-          <w:hyperlink w:anchor="_Toc225437748" w:history="1">
+          <w:hyperlink w:anchor="_Toc225478214" w:history="1">
             <w:r>
               <w:rPr>
                 <w:rStyle w:val="Hiperhivatkozs"/>
@@ -3870,7 +4016,7 @@
                 <w:noProof/>
                 <w:webHidden/>
               </w:rPr>
-              <w:instrText xml:space="preserve"> PAGEREF _Toc225437748 \h </w:instrText>
+              <w:instrText xml:space="preserve"> PAGEREF _Toc225478214 \h </w:instrText>
             </w:r>
             <w:r>
               <w:rPr>
@@ -3890,7 +4036,7 @@
                 <w:noProof/>
                 <w:webHidden/>
               </w:rPr>
-              <w:t>52</w:t>
+              <w:t>53</w:t>
             </w:r>
             <w:r>
               <w:rPr>
@@ -3916,7 +4062,7 @@
               <w14:ligatures w14:val="standardContextual"/>
             </w:rPr>
           </w:pPr>
-          <w:hyperlink w:anchor="_Toc225437749" w:history="1">
+          <w:hyperlink w:anchor="_Toc225478215" w:history="1">
             <w:r>
               <w:rPr>
                 <w:rStyle w:val="Hiperhivatkozs"/>
@@ -3943,7 +4089,7 @@
                 <w:noProof/>
                 <w:webHidden/>
               </w:rPr>
-              <w:instrText xml:space="preserve"> PAGEREF _Toc225437749 \h </w:instrText>
+              <w:instrText xml:space="preserve"> PAGEREF _Toc225478215 \h </w:instrText>
             </w:r>
             <w:r>
               <w:rPr>
@@ -3963,7 +4109,7 @@
                 <w:noProof/>
                 <w:webHidden/>
               </w:rPr>
-              <w:t>53</w:t>
+              <w:t>54</w:t>
             </w:r>
             <w:r>
               <w:rPr>
@@ -3989,7 +4135,7 @@
               <w14:ligatures w14:val="standardContextual"/>
             </w:rPr>
           </w:pPr>
-          <w:hyperlink w:anchor="_Toc225437750" w:history="1">
+          <w:hyperlink w:anchor="_Toc225478216" w:history="1">
             <w:r>
               <w:rPr>
                 <w:rStyle w:val="Hiperhivatkozs"/>
@@ -4016,7 +4162,7 @@
                 <w:noProof/>
                 <w:webHidden/>
               </w:rPr>
-              <w:instrText xml:space="preserve"> PAGEREF _Toc225437750 \h </w:instrText>
+              <w:instrText xml:space="preserve"> PAGEREF _Toc225478216 \h </w:instrText>
             </w:r>
             <w:r>
               <w:rPr>
@@ -4036,7 +4182,7 @@
                 <w:noProof/>
                 <w:webHidden/>
               </w:rPr>
-              <w:t>54</w:t>
+              <w:t>55</w:t>
             </w:r>
             <w:r>
               <w:rPr>
@@ -4062,7 +4208,7 @@
               <w14:ligatures w14:val="standardContextual"/>
             </w:rPr>
           </w:pPr>
-          <w:hyperlink w:anchor="_Toc225437751" w:history="1">
+          <w:hyperlink w:anchor="_Toc225478217" w:history="1">
             <w:r>
               <w:rPr>
                 <w:rStyle w:val="Hiperhivatkozs"/>
@@ -4089,7 +4235,7 @@
                 <w:noProof/>
                 <w:webHidden/>
               </w:rPr>
-              <w:instrText xml:space="preserve"> PAGEREF _Toc225437751 \h </w:instrText>
+              <w:instrText xml:space="preserve"> PAGEREF _Toc225478217 \h </w:instrText>
             </w:r>
             <w:r>
               <w:rPr>
@@ -4109,7 +4255,7 @@
                 <w:noProof/>
                 <w:webHidden/>
               </w:rPr>
-              <w:t>55</w:t>
+              <w:t>56</w:t>
             </w:r>
             <w:r>
               <w:rPr>
@@ -4135,7 +4281,7 @@
               <w14:ligatures w14:val="standardContextual"/>
             </w:rPr>
           </w:pPr>
-          <w:hyperlink w:anchor="_Toc225437752" w:history="1">
+          <w:hyperlink w:anchor="_Toc225478218" w:history="1">
             <w:r>
               <w:rPr>
                 <w:rStyle w:val="Hiperhivatkozs"/>
@@ -4162,7 +4308,7 @@
                 <w:noProof/>
                 <w:webHidden/>
               </w:rPr>
-              <w:instrText xml:space="preserve"> PAGEREF _Toc225437752 \h </w:instrText>
+              <w:instrText xml:space="preserve"> PAGEREF _Toc225478218 \h </w:instrText>
             </w:r>
             <w:r>
               <w:rPr>
@@ -4182,7 +4328,7 @@
                 <w:noProof/>
                 <w:webHidden/>
               </w:rPr>
-              <w:t>56</w:t>
+              <w:t>57</w:t>
             </w:r>
             <w:r>
               <w:rPr>
@@ -4208,7 +4354,7 @@
               <w14:ligatures w14:val="standardContextual"/>
             </w:rPr>
           </w:pPr>
-          <w:hyperlink w:anchor="_Toc225437753" w:history="1">
+          <w:hyperlink w:anchor="_Toc225478219" w:history="1">
             <w:r>
               <w:rPr>
                 <w:rStyle w:val="Hiperhivatkozs"/>
@@ -4235,7 +4381,7 @@
                 <w:noProof/>
                 <w:webHidden/>
               </w:rPr>
-              <w:instrText xml:space="preserve"> PAGEREF _Toc225437753 \h </w:instrText>
+              <w:instrText xml:space="preserve"> PAGEREF _Toc225478219 \h </w:instrText>
             </w:r>
             <w:r>
               <w:rPr>
@@ -4255,7 +4401,7 @@
                 <w:noProof/>
                 <w:webHidden/>
               </w:rPr>
-              <w:t>57</w:t>
+              <w:t>58</w:t>
             </w:r>
             <w:r>
               <w:rPr>
@@ -4289,7 +4435,7 @@
       <w:pPr>
         <w:pStyle w:val="Cmsor1"/>
       </w:pPr>
-      <w:bookmarkStart w:id="0" w:name="_Toc225437700"/>
+      <w:bookmarkStart w:id="0" w:name="_Toc225478164"/>
       <w:r>
         <w:lastRenderedPageBreak/>
         <w:t>1. BEVEZETÉS</w:t>
@@ -4338,7 +4484,7 @@
       <w:pPr>
         <w:pStyle w:val="Cmsor2"/>
       </w:pPr>
-      <w:bookmarkStart w:id="1" w:name="_Toc225437701"/>
+      <w:bookmarkStart w:id="1" w:name="_Toc225478165"/>
       <w:r>
         <w:lastRenderedPageBreak/>
         <w:t>1.2 TÉMAVÁLASZTÁS INDOKLÁSA</w:t>
@@ -4500,7 +4646,7 @@
       <w:pPr>
         <w:pStyle w:val="Cmsor2"/>
       </w:pPr>
-      <w:bookmarkStart w:id="2" w:name="_Toc225437702"/>
+      <w:bookmarkStart w:id="2" w:name="_Toc225478166"/>
       <w:r>
         <w:lastRenderedPageBreak/>
         <w:t>1</w:t>
@@ -4619,7 +4765,7 @@
           <w:noProof/>
         </w:rPr>
         <w:drawing>
-          <wp:anchor distT="0" distB="0" distL="114300" distR="114300" simplePos="0" relativeHeight="251675648" behindDoc="0" locked="0" layoutInCell="1" allowOverlap="1" wp14:anchorId="4A622A8E" wp14:editId="70AF321D">
+          <wp:anchor distT="0" distB="0" distL="114300" distR="114300" simplePos="0" relativeHeight="251675648" behindDoc="0" locked="0" layoutInCell="1" allowOverlap="1" wp14:anchorId="4A622A8E" wp14:editId="51AD3547">
             <wp:simplePos x="0" y="0"/>
             <wp:positionH relativeFrom="margin">
               <wp:posOffset>413468</wp:posOffset>
@@ -5592,7 +5738,7 @@
       <w:pPr>
         <w:pStyle w:val="Cmsor1"/>
       </w:pPr>
-      <w:bookmarkStart w:id="3" w:name="_Toc225437703"/>
+      <w:bookmarkStart w:id="3" w:name="_Toc225478167"/>
       <w:r>
         <w:lastRenderedPageBreak/>
         <w:t>2. A PROJEKT CÉLJA</w:t>
@@ -5777,7 +5923,7 @@
       <w:pPr>
         <w:pStyle w:val="Cmsor1"/>
       </w:pPr>
-      <w:bookmarkStart w:id="4" w:name="_Toc225437704"/>
+      <w:bookmarkStart w:id="4" w:name="_Toc225478168"/>
       <w:r>
         <w:lastRenderedPageBreak/>
         <w:t>3. AZ ALKALMAZÁS BEMUTATÁSA</w:t>
@@ -5970,7 +6116,7 @@
       <w:pPr>
         <w:pStyle w:val="Cmsor2"/>
       </w:pPr>
-      <w:bookmarkStart w:id="5" w:name="_Toc225437705"/>
+      <w:bookmarkStart w:id="5" w:name="_Toc225478169"/>
       <w:r>
         <w:t>3.1 FELHASZNÁLÓI MŰKÖDÉS (AUTÓS OLDAL)</w:t>
       </w:r>
@@ -6126,7 +6272,7 @@
       <w:pPr>
         <w:pStyle w:val="Cmsor2"/>
       </w:pPr>
-      <w:bookmarkStart w:id="6" w:name="_Toc225437706"/>
+      <w:bookmarkStart w:id="6" w:name="_Toc225478170"/>
       <w:r>
         <w:lastRenderedPageBreak/>
         <w:t>3.2 SZOLGÁLTATÓI MŰKÖDÉS (AUTÓMENTŐ OLDAL)</w:t>
@@ -6324,7 +6470,7 @@
       <w:pPr>
         <w:pStyle w:val="Cmsor2"/>
       </w:pPr>
-      <w:bookmarkStart w:id="7" w:name="_Toc225437707"/>
+      <w:bookmarkStart w:id="7" w:name="_Toc225478171"/>
       <w:r>
         <w:lastRenderedPageBreak/>
         <w:t>3.3 ADMINISZTRÁCIÓ ÉS TÁMOGATÁS</w:t>
@@ -6457,7 +6603,7 @@
       <w:pPr>
         <w:pStyle w:val="Cmsor1"/>
       </w:pPr>
-      <w:bookmarkStart w:id="8" w:name="_Toc225437708"/>
+      <w:bookmarkStart w:id="8" w:name="_Toc225478172"/>
       <w:r>
         <w:lastRenderedPageBreak/>
         <w:t>4. AZ ALKALMAZÁS MŰKÖDÉSE</w:t>
@@ -6564,7 +6710,7 @@
       <w:pPr>
         <w:pStyle w:val="Cmsor2"/>
       </w:pPr>
-      <w:bookmarkStart w:id="9" w:name="_Toc225437709"/>
+      <w:bookmarkStart w:id="9" w:name="_Toc225478173"/>
       <w:r>
         <w:lastRenderedPageBreak/>
         <w:t>4.1 AUTÓMENTŐK OLDALA</w:t>
@@ -6665,7 +6811,7 @@
       <w:pPr>
         <w:pStyle w:val="Cmsor2"/>
       </w:pPr>
-      <w:bookmarkStart w:id="10" w:name="_Toc225437710"/>
+      <w:bookmarkStart w:id="10" w:name="_Toc225478174"/>
       <w:r>
         <w:lastRenderedPageBreak/>
         <w:t>4.2 FELHASZNÁLÓK OLDALA</w:t>
@@ -6787,7 +6933,7 @@
       <w:pPr>
         <w:pStyle w:val="Cmsor1"/>
       </w:pPr>
-      <w:bookmarkStart w:id="11" w:name="_Toc225437711"/>
+      <w:bookmarkStart w:id="11" w:name="_Toc225478175"/>
       <w:r>
         <w:lastRenderedPageBreak/>
         <w:t>5. FELHASZNÁLT TECHNOLÓGIÁK</w:t>
@@ -6989,7 +7135,7 @@
       <w:pPr>
         <w:pStyle w:val="Cmsor1"/>
       </w:pPr>
-      <w:bookmarkStart w:id="12" w:name="_Toc225437712"/>
+      <w:bookmarkStart w:id="12" w:name="_Toc225478176"/>
       <w:r>
         <w:lastRenderedPageBreak/>
         <w:t>6. ADATBÁZIS FELÉPÍTÉSE</w:t>
@@ -7083,7 +7229,7 @@
       <w:pPr>
         <w:pStyle w:val="Cmsor2"/>
       </w:pPr>
-      <w:bookmarkStart w:id="13" w:name="_Toc225437713"/>
+      <w:bookmarkStart w:id="13" w:name="_Toc225478177"/>
       <w:r>
         <w:lastRenderedPageBreak/>
         <w:t xml:space="preserve">6.2 </w:t>
@@ -7154,7 +7300,7 @@
           </wp:anchor>
         </w:drawing>
       </w:r>
-      <w:bookmarkStart w:id="14" w:name="_Toc225437714"/>
+      <w:bookmarkStart w:id="14" w:name="_Toc225478178"/>
       <w:r>
         <w:rPr>
           <w:rStyle w:val="Cmsor3Char"/>
@@ -7350,7 +7496,7 @@
           </wp:anchor>
         </w:drawing>
       </w:r>
-      <w:bookmarkStart w:id="15" w:name="_Toc225437715"/>
+      <w:bookmarkStart w:id="15" w:name="_Toc225478179"/>
       <w:r>
         <w:rPr>
           <w:rStyle w:val="Cmsor3Char"/>
@@ -7611,7 +7757,7 @@
       <w:pPr>
         <w:pStyle w:val="Cmsor3"/>
       </w:pPr>
-      <w:bookmarkStart w:id="16" w:name="_Toc225437716"/>
+      <w:bookmarkStart w:id="16" w:name="_Toc225478180"/>
       <w:r>
         <w:t xml:space="preserve">6.2.3 </w:t>
       </w:r>
@@ -7833,7 +7979,7 @@
         <w:pStyle w:val="Cmsor3"/>
         <w:spacing w:before="360" w:after="0"/>
       </w:pPr>
-      <w:bookmarkStart w:id="17" w:name="_Toc225437717"/>
+      <w:bookmarkStart w:id="17" w:name="_Toc225478181"/>
       <w:r>
         <w:lastRenderedPageBreak/>
         <w:t xml:space="preserve">6.2.4 </w:t>
@@ -8077,7 +8223,7 @@
       <w:pPr>
         <w:pStyle w:val="Cmsor3"/>
       </w:pPr>
-      <w:bookmarkStart w:id="18" w:name="_Toc225437718"/>
+      <w:bookmarkStart w:id="18" w:name="_Toc225478182"/>
       <w:r>
         <w:lastRenderedPageBreak/>
         <w:t xml:space="preserve">6.2.4 </w:t>
@@ -8323,7 +8469,7 @@
       <w:pPr>
         <w:pStyle w:val="Cmsor3"/>
       </w:pPr>
-      <w:bookmarkStart w:id="19" w:name="_Toc225437719"/>
+      <w:bookmarkStart w:id="19" w:name="_Toc225478183"/>
       <w:r>
         <w:t xml:space="preserve">6.2.5 </w:t>
       </w:r>
@@ -8536,7 +8682,7 @@
       <w:pPr>
         <w:pStyle w:val="Cmsor3"/>
       </w:pPr>
-      <w:bookmarkStart w:id="20" w:name="_Toc225437720"/>
+      <w:bookmarkStart w:id="20" w:name="_Toc225478184"/>
       <w:r>
         <w:lastRenderedPageBreak/>
         <w:t xml:space="preserve">6.2.6 </w:t>
@@ -8719,8 +8865,9 @@
       <w:r>
         <w:t> pedig az utolsó aktivitás idejét rögzíti.</w:t>
       </w:r>
-    </w:p>
-    <w:p>
+      <w:r>
+        <w:t xml:space="preserve"> </w:t>
+      </w:r>
       <w:r>
         <w:t xml:space="preserve">Ez a tábla a </w:t>
       </w:r>
@@ -8731,6 +8878,459 @@
       <w:proofErr w:type="spellEnd"/>
       <w:r>
         <w:t xml:space="preserve"> modul központi eleme, mert erre épül az ügyek nyilvántartása, a beszélgetések listázása és az adminisztratív ügykezelés teljes folyamata.</w:t>
+      </w:r>
+    </w:p>
+    <w:p>
+      <w:pPr>
+        <w:pStyle w:val="Cmsor3"/>
+      </w:pPr>
+      <w:bookmarkStart w:id="21" w:name="_Toc225478185"/>
+      <w:r>
+        <w:t xml:space="preserve">6.2.7 </w:t>
+      </w:r>
+      <w:proofErr w:type="spellStart"/>
+      <w:r>
+        <w:t>RequestMessages</w:t>
+      </w:r>
+      <w:proofErr w:type="spellEnd"/>
+      <w:r>
+        <w:t> </w:t>
+      </w:r>
+      <w:r>
+        <w:t>tábla</w:t>
+      </w:r>
+      <w:bookmarkEnd w:id="21"/>
+    </w:p>
+    <w:p>
+      <w:r>
+        <w:rPr>
+          <w:noProof/>
+          <w14:ligatures w14:val="standardContextual"/>
+        </w:rPr>
+        <w:drawing>
+          <wp:anchor distT="0" distB="0" distL="114300" distR="114300" simplePos="0" relativeHeight="251688960" behindDoc="0" locked="0" layoutInCell="1" allowOverlap="1" wp14:anchorId="6C218B0C" wp14:editId="73FFB2C5">
+            <wp:simplePos x="0" y="0"/>
+            <wp:positionH relativeFrom="margin">
+              <wp:align>left</wp:align>
+            </wp:positionH>
+            <wp:positionV relativeFrom="paragraph">
+              <wp:posOffset>65709</wp:posOffset>
+            </wp:positionV>
+            <wp:extent cx="2113915" cy="1570990"/>
+            <wp:effectExtent l="0" t="0" r="635" b="0"/>
+            <wp:wrapSquare wrapText="bothSides"/>
+            <wp:docPr id="9" name="Kép 9"/>
+            <wp:cNvGraphicFramePr>
+              <a:graphicFrameLocks xmlns:a="http://schemas.openxmlformats.org/drawingml/2006/main" noChangeAspect="1"/>
+            </wp:cNvGraphicFramePr>
+            <a:graphic xmlns:a="http://schemas.openxmlformats.org/drawingml/2006/main">
+              <a:graphicData uri="http://schemas.openxmlformats.org/drawingml/2006/picture">
+                <pic:pic xmlns:pic="http://schemas.openxmlformats.org/drawingml/2006/picture">
+                  <pic:nvPicPr>
+                    <pic:cNvPr id="1" name=""/>
+                    <pic:cNvPicPr/>
+                  </pic:nvPicPr>
+                  <pic:blipFill>
+                    <a:blip r:embed="rId32">
+                      <a:extLst>
+                        <a:ext uri="{28A0092B-C50C-407E-A947-70E740481C1C}">
+                          <a14:useLocalDpi xmlns:a14="http://schemas.microsoft.com/office/drawing/2010/main" val="0"/>
+                        </a:ext>
+                      </a:extLst>
+                    </a:blip>
+                    <a:stretch>
+                      <a:fillRect/>
+                    </a:stretch>
+                  </pic:blipFill>
+                  <pic:spPr>
+                    <a:xfrm>
+                      <a:off x="0" y="0"/>
+                      <a:ext cx="2113915" cy="1570990"/>
+                    </a:xfrm>
+                    <a:prstGeom prst="rect">
+                      <a:avLst/>
+                    </a:prstGeom>
+                  </pic:spPr>
+                </pic:pic>
+              </a:graphicData>
+            </a:graphic>
+          </wp:anchor>
+        </w:drawing>
+      </w:r>
+      <w:r>
+        <w:t>Ebben a </w:t>
+      </w:r>
+      <w:proofErr w:type="spellStart"/>
+      <w:r>
+        <w:t>RequestMessages</w:t>
+      </w:r>
+      <w:proofErr w:type="spellEnd"/>
+      <w:r>
+        <w:t> táblában tároljuk a mentési kérelmekhez kapcsolódó chatüzeneteket.</w:t>
+      </w:r>
+      <w:r>
+        <w:br/>
+      </w:r>
+      <w:r>
+        <w:t xml:space="preserve"> </w:t>
+      </w:r>
+      <w:r>
+        <w:t>A tábla célja, hogy a felhasználó és a kijelölt autómentő közötti kommunikáció minden eleme naplózva, időrendben visszakereshetően legyen elmentve.</w:t>
+      </w:r>
+    </w:p>
+    <w:p>
+      <w:r>
+        <w:t>Az </w:t>
+      </w:r>
+      <w:proofErr w:type="spellStart"/>
+      <w:r>
+        <w:t>Id</w:t>
+      </w:r>
+      <w:proofErr w:type="spellEnd"/>
+      <w:r>
+        <w:t> mező az elsődleges kulcs, amely egyedileg azonosít minden üzenetet.</w:t>
+      </w:r>
+      <w:r>
+        <w:br/>
+        <w:t>A </w:t>
+      </w:r>
+      <w:proofErr w:type="spellStart"/>
+      <w:r>
+        <w:t>RequestId</w:t>
+      </w:r>
+      <w:proofErr w:type="spellEnd"/>
+      <w:r>
+        <w:t> idegen kulcs a </w:t>
+      </w:r>
+      <w:proofErr w:type="spellStart"/>
+      <w:r>
+        <w:t>ServiceRequests</w:t>
+      </w:r>
+      <w:proofErr w:type="spellEnd"/>
+      <w:r>
+        <w:t> táblára mutat, így egyértelműen meghatározható, hogy az üzenet melyik mentési ügyhöz tartozik.</w:t>
+      </w:r>
+      <w:r>
+        <w:br/>
+        <w:t>A </w:t>
+      </w:r>
+      <w:proofErr w:type="spellStart"/>
+      <w:r>
+        <w:t>SenderUserId</w:t>
+      </w:r>
+      <w:proofErr w:type="spellEnd"/>
+      <w:r>
+        <w:t> mező a küldő felhasználó azonosítóját tárolja (</w:t>
+      </w:r>
+      <w:proofErr w:type="spellStart"/>
+      <w:r>
+        <w:t>Users</w:t>
+      </w:r>
+      <w:proofErr w:type="spellEnd"/>
+      <w:r>
+        <w:t> tábla), ezért pontosan nyomon követhető, hogy az üzenetet a segítséget kérő felhasználó vagy a szolgáltató küldte.</w:t>
+      </w:r>
+    </w:p>
+    <w:p>
+      <w:r>
+        <w:t>A Body mező tartalmazza az üzenet szövegét, a </w:t>
+      </w:r>
+      <w:proofErr w:type="spellStart"/>
+      <w:r>
+        <w:t>CreatedAt</w:t>
+      </w:r>
+      <w:proofErr w:type="spellEnd"/>
+      <w:r>
+        <w:t> pedig az üzenet létrehozásának időpontját rögzíti.</w:t>
+      </w:r>
+      <w:r>
+        <w:br/>
+        <w:t>Ez lehetővé teszi, hogy a beszélgetések a felületen helyes időrendben jelenjenek meg, és vitás helyzetekben visszaellenőrizhetők legyenek.</w:t>
+      </w:r>
+    </w:p>
+    <w:p>
+      <w:r>
+        <w:t>A </w:t>
+      </w:r>
+      <w:proofErr w:type="spellStart"/>
+      <w:r>
+        <w:t>RequestMessages</w:t>
+      </w:r>
+      <w:proofErr w:type="spellEnd"/>
+      <w:r>
+        <w:t> tábla fontos része a mentési folyamatnak, mert ezen keresztül valósul meg a gyors, közvetlen és dokumentált kommunikáció az érintett felek között.</w:t>
+      </w:r>
+    </w:p>
+    <w:p>
+      <w:pPr>
+        <w:pStyle w:val="Cmsor3"/>
+      </w:pPr>
+      <w:bookmarkStart w:id="22" w:name="_Toc225478186"/>
+      <w:r>
+        <w:lastRenderedPageBreak/>
+        <w:t xml:space="preserve">6.2.8 </w:t>
+      </w:r>
+      <w:proofErr w:type="spellStart"/>
+      <w:r>
+        <w:t>PasswordResetTokens</w:t>
+      </w:r>
+      <w:proofErr w:type="spellEnd"/>
+      <w:r>
+        <w:t> </w:t>
+      </w:r>
+      <w:r>
+        <w:t>tábla</w:t>
+      </w:r>
+      <w:bookmarkEnd w:id="22"/>
+    </w:p>
+    <w:p>
+      <w:r>
+        <w:rPr>
+          <w:noProof/>
+          <w14:ligatures w14:val="standardContextual"/>
+        </w:rPr>
+        <w:drawing>
+          <wp:anchor distT="0" distB="0" distL="114300" distR="114300" simplePos="0" relativeHeight="251689984" behindDoc="0" locked="0" layoutInCell="1" allowOverlap="1" wp14:anchorId="063DA9FA" wp14:editId="609510AA">
+            <wp:simplePos x="0" y="0"/>
+            <wp:positionH relativeFrom="margin">
+              <wp:align>left</wp:align>
+            </wp:positionH>
+            <wp:positionV relativeFrom="paragraph">
+              <wp:posOffset>80010</wp:posOffset>
+            </wp:positionV>
+            <wp:extent cx="2321781" cy="1949933"/>
+            <wp:effectExtent l="0" t="0" r="2540" b="0"/>
+            <wp:wrapSquare wrapText="bothSides"/>
+            <wp:docPr id="17" name="Kép 17"/>
+            <wp:cNvGraphicFramePr>
+              <a:graphicFrameLocks xmlns:a="http://schemas.openxmlformats.org/drawingml/2006/main" noChangeAspect="1"/>
+            </wp:cNvGraphicFramePr>
+            <a:graphic xmlns:a="http://schemas.openxmlformats.org/drawingml/2006/main">
+              <a:graphicData uri="http://schemas.openxmlformats.org/drawingml/2006/picture">
+                <pic:pic xmlns:pic="http://schemas.openxmlformats.org/drawingml/2006/picture">
+                  <pic:nvPicPr>
+                    <pic:cNvPr id="1" name=""/>
+                    <pic:cNvPicPr/>
+                  </pic:nvPicPr>
+                  <pic:blipFill>
+                    <a:blip r:embed="rId33">
+                      <a:extLst>
+                        <a:ext uri="{28A0092B-C50C-407E-A947-70E740481C1C}">
+                          <a14:useLocalDpi xmlns:a14="http://schemas.microsoft.com/office/drawing/2010/main" val="0"/>
+                        </a:ext>
+                      </a:extLst>
+                    </a:blip>
+                    <a:stretch>
+                      <a:fillRect/>
+                    </a:stretch>
+                  </pic:blipFill>
+                  <pic:spPr>
+                    <a:xfrm>
+                      <a:off x="0" y="0"/>
+                      <a:ext cx="2321781" cy="1949933"/>
+                    </a:xfrm>
+                    <a:prstGeom prst="rect">
+                      <a:avLst/>
+                    </a:prstGeom>
+                  </pic:spPr>
+                </pic:pic>
+              </a:graphicData>
+            </a:graphic>
+          </wp:anchor>
+        </w:drawing>
+      </w:r>
+      <w:r>
+        <w:t>Ebben a </w:t>
+      </w:r>
+      <w:proofErr w:type="spellStart"/>
+      <w:r>
+        <w:t>PasswordResetTokens</w:t>
+      </w:r>
+      <w:proofErr w:type="spellEnd"/>
+      <w:r>
+        <w:t xml:space="preserve"> táblában tároljuk a jelszó-visszaállításhoz kapcsolódó ideiglenes </w:t>
+      </w:r>
+      <w:proofErr w:type="spellStart"/>
+      <w:r>
+        <w:t>tokeneket</w:t>
+      </w:r>
+      <w:proofErr w:type="spellEnd"/>
+      <w:r>
+        <w:t>.</w:t>
+      </w:r>
+      <w:r>
+        <w:br/>
+        <w:t xml:space="preserve">A tábla célja, hogy a „Elfelejtett jelszó” folyamat biztonságosan, időkorláttal és egyszeri felhasználással </w:t>
+      </w:r>
+      <w:proofErr w:type="spellStart"/>
+      <w:r>
+        <w:t>működjön</w:t>
+      </w:r>
+      <w:proofErr w:type="spellEnd"/>
+      <w:r>
+        <w:t>.</w:t>
+      </w:r>
+    </w:p>
+    <w:p>
+      <w:r>
+        <w:t xml:space="preserve"> </w:t>
+      </w:r>
+      <w:r>
+        <w:t>Az </w:t>
+      </w:r>
+      <w:proofErr w:type="spellStart"/>
+      <w:r>
+        <w:t>Id</w:t>
+      </w:r>
+      <w:proofErr w:type="spellEnd"/>
+      <w:r>
+        <w:t xml:space="preserve"> mező az elsődleges kulcs, amely egyedileg azonosít minden </w:t>
+      </w:r>
+      <w:proofErr w:type="spellStart"/>
+      <w:r>
+        <w:t>reset</w:t>
+      </w:r>
+      <w:proofErr w:type="spellEnd"/>
+      <w:r>
+        <w:t xml:space="preserve"> </w:t>
+      </w:r>
+      <w:proofErr w:type="spellStart"/>
+      <w:r>
+        <w:t>tokent</w:t>
+      </w:r>
+      <w:proofErr w:type="spellEnd"/>
+      <w:r>
+        <w:t>.</w:t>
+      </w:r>
+      <w:r>
+        <w:br/>
+        <w:t>A </w:t>
+      </w:r>
+      <w:proofErr w:type="spellStart"/>
+      <w:r>
+        <w:t>UserId</w:t>
+      </w:r>
+      <w:proofErr w:type="spellEnd"/>
+      <w:r>
+        <w:t> idegen kulcs a </w:t>
+      </w:r>
+      <w:proofErr w:type="spellStart"/>
+      <w:r>
+        <w:t>Users</w:t>
+      </w:r>
+      <w:proofErr w:type="spellEnd"/>
+      <w:r>
+        <w:t> táblára mutat, így látható, melyik felhasználóhoz tartozik az adott visszaállítási kérés.</w:t>
+      </w:r>
+      <w:r>
+        <w:br/>
+        <w:t>A </w:t>
+      </w:r>
+      <w:proofErr w:type="spellStart"/>
+      <w:r>
+        <w:t>TokenHash</w:t>
+      </w:r>
+      <w:proofErr w:type="spellEnd"/>
+      <w:r>
+        <w:t xml:space="preserve"> mezőben a </w:t>
+      </w:r>
+      <w:proofErr w:type="spellStart"/>
+      <w:r>
+        <w:t>token</w:t>
+      </w:r>
+      <w:proofErr w:type="spellEnd"/>
+      <w:r>
+        <w:t xml:space="preserve"> </w:t>
+      </w:r>
+      <w:proofErr w:type="spellStart"/>
+      <w:r>
+        <w:t>hash-elt</w:t>
+      </w:r>
+      <w:proofErr w:type="spellEnd"/>
+      <w:r>
+        <w:t xml:space="preserve"> (SHA-256) változata van eltárolva, nem a nyers </w:t>
+      </w:r>
+      <w:proofErr w:type="spellStart"/>
+      <w:r>
+        <w:t>token</w:t>
+      </w:r>
+      <w:proofErr w:type="spellEnd"/>
+      <w:r>
+        <w:t>, ami növeli a biztonságot egy esetleges adatszivárgás esetén is.</w:t>
+      </w:r>
+    </w:p>
+    <w:p>
+      <w:r>
+        <w:t>Az </w:t>
+      </w:r>
+      <w:proofErr w:type="spellStart"/>
+      <w:r>
+        <w:t>ExpiresAt</w:t>
+      </w:r>
+      <w:proofErr w:type="spellEnd"/>
+      <w:r>
+        <w:t xml:space="preserve"> mező a </w:t>
+      </w:r>
+      <w:proofErr w:type="spellStart"/>
+      <w:r>
+        <w:t>token</w:t>
+      </w:r>
+      <w:proofErr w:type="spellEnd"/>
+      <w:r>
+        <w:t xml:space="preserve"> lejárati idejét tárolja, így a rendszer csak meghatározott ideig fogadja el a visszaállítási linket.</w:t>
+      </w:r>
+      <w:r>
+        <w:br/>
+        <w:t>A </w:t>
+      </w:r>
+      <w:proofErr w:type="spellStart"/>
+      <w:r>
+        <w:t>UsedAt</w:t>
+      </w:r>
+      <w:proofErr w:type="spellEnd"/>
+      <w:r>
+        <w:t xml:space="preserve"> mező jelzi, hogy a </w:t>
+      </w:r>
+      <w:proofErr w:type="spellStart"/>
+      <w:r>
+        <w:t>token</w:t>
+      </w:r>
+      <w:proofErr w:type="spellEnd"/>
+      <w:r>
+        <w:t xml:space="preserve"> már fel lett-e használva; ha igen, ugyanaz a </w:t>
+      </w:r>
+      <w:proofErr w:type="spellStart"/>
+      <w:r>
+        <w:t>token</w:t>
+      </w:r>
+      <w:proofErr w:type="spellEnd"/>
+      <w:r>
+        <w:t xml:space="preserve"> többé nem érvényes.</w:t>
+      </w:r>
+      <w:r>
+        <w:br/>
+        <w:t>A </w:t>
+      </w:r>
+      <w:proofErr w:type="spellStart"/>
+      <w:r>
+        <w:t>CreatedAt</w:t>
+      </w:r>
+      <w:proofErr w:type="spellEnd"/>
+      <w:r>
+        <w:t xml:space="preserve"> mező a </w:t>
+      </w:r>
+      <w:proofErr w:type="spellStart"/>
+      <w:r>
+        <w:t>token</w:t>
+      </w:r>
+      <w:proofErr w:type="spellEnd"/>
+      <w:r>
+        <w:t xml:space="preserve"> létrehozásának időpontját rögzíti.</w:t>
+      </w:r>
+    </w:p>
+    <w:p>
+      <w:r>
+        <w:t>Ez a tábla kulcsszerepet játszik a fiókbiztonságban, mert biztosítja, hogy a jelszó-visszaállítás ellenőrzött, időkorlátos és visszaélés ellen védett módon történjen.</w:t>
       </w:r>
     </w:p>
     <w:p/>
@@ -8752,12 +9352,12 @@
       <w:pPr>
         <w:pStyle w:val="Cmsor2"/>
       </w:pPr>
-      <w:bookmarkStart w:id="21" w:name="_Toc225437721"/>
+      <w:bookmarkStart w:id="23" w:name="_Toc225478187"/>
       <w:r>
         <w:lastRenderedPageBreak/>
         <w:t>6.3 Adatkapcsolatok, integritás és teljesítmény</w:t>
       </w:r>
-      <w:bookmarkEnd w:id="21"/>
+      <w:bookmarkEnd w:id="23"/>
     </w:p>
     <w:p>
       <w:r>
@@ -9281,12 +9881,12 @@
       <w:pPr>
         <w:pStyle w:val="Cmsor1"/>
       </w:pPr>
-      <w:bookmarkStart w:id="22" w:name="_Toc225437722"/>
+      <w:bookmarkStart w:id="24" w:name="_Toc225478188"/>
       <w:r>
         <w:lastRenderedPageBreak/>
         <w:t>7. A PROJEKT MEGVALÓSÍTÁSA</w:t>
       </w:r>
-      <w:bookmarkEnd w:id="22"/>
+      <w:bookmarkEnd w:id="24"/>
     </w:p>
     <w:p>
       <w:r>
@@ -9776,12 +10376,12 @@
       <w:pPr>
         <w:pStyle w:val="Cmsor2"/>
       </w:pPr>
-      <w:bookmarkStart w:id="23" w:name="_Toc225437723"/>
+      <w:bookmarkStart w:id="25" w:name="_Toc225478189"/>
       <w:r>
         <w:lastRenderedPageBreak/>
         <w:t>7.1 Projektstruktúra és mappafelépítés</w:t>
       </w:r>
-      <w:bookmarkEnd w:id="23"/>
+      <w:bookmarkEnd w:id="25"/>
     </w:p>
     <w:p>
       <w:r>
@@ -10276,12 +10876,12 @@
       <w:pPr>
         <w:pStyle w:val="Cmsor1"/>
       </w:pPr>
-      <w:bookmarkStart w:id="24" w:name="_Toc225437724"/>
+      <w:bookmarkStart w:id="26" w:name="_Toc225478190"/>
       <w:r>
         <w:lastRenderedPageBreak/>
         <w:t>8. FELADATMEGOSZTÁS</w:t>
       </w:r>
-      <w:bookmarkEnd w:id="24"/>
+      <w:bookmarkEnd w:id="26"/>
     </w:p>
     <w:p>
       <w:r>
@@ -10556,12 +11156,12 @@
       <w:pPr>
         <w:pStyle w:val="Cmsor1"/>
       </w:pPr>
-      <w:bookmarkStart w:id="25" w:name="_Toc225437725"/>
+      <w:bookmarkStart w:id="27" w:name="_Toc225478191"/>
       <w:r>
         <w:lastRenderedPageBreak/>
         <w:t>9. TESZTELÉS</w:t>
       </w:r>
-      <w:bookmarkEnd w:id="25"/>
+      <w:bookmarkEnd w:id="27"/>
     </w:p>
     <w:tbl>
       <w:tblPr>
@@ -10940,12 +11540,12 @@
       <w:pPr>
         <w:pStyle w:val="Cmsor1"/>
       </w:pPr>
-      <w:bookmarkStart w:id="26" w:name="_Toc225437726"/>
+      <w:bookmarkStart w:id="28" w:name="_Toc225478192"/>
       <w:r>
         <w:lastRenderedPageBreak/>
         <w:t>10. ÖSSZEGZÉS</w:t>
       </w:r>
-      <w:bookmarkEnd w:id="26"/>
+      <w:bookmarkEnd w:id="28"/>
     </w:p>
     <w:p>
       <w:r>
@@ -11178,7 +11778,7 @@
       <w:pPr>
         <w:pStyle w:val="Cmsor1"/>
       </w:pPr>
-      <w:bookmarkStart w:id="27" w:name="_Toc225437727"/>
+      <w:bookmarkStart w:id="29" w:name="_Toc225478193"/>
       <w:r>
         <w:lastRenderedPageBreak/>
         <w:t xml:space="preserve">11. </w:t>
@@ -11186,7 +11786,7 @@
       <w:r>
         <w:t>Biztonság</w:t>
       </w:r>
-      <w:bookmarkEnd w:id="27"/>
+      <w:bookmarkEnd w:id="29"/>
     </w:p>
     <w:p>
       <w:pPr>
@@ -11414,12 +12014,12 @@
       <w:pPr>
         <w:pStyle w:val="Cmsor2"/>
       </w:pPr>
-      <w:bookmarkStart w:id="28" w:name="_Toc225437728"/>
+      <w:bookmarkStart w:id="30" w:name="_Toc225478194"/>
       <w:r>
         <w:lastRenderedPageBreak/>
         <w:t>11.1 Hitelesítés és munkamenet-kezelés</w:t>
       </w:r>
-      <w:bookmarkEnd w:id="28"/>
+      <w:bookmarkEnd w:id="30"/>
     </w:p>
     <w:p>
       <w:pPr>
@@ -11811,12 +12411,12 @@
       <w:pPr>
         <w:pStyle w:val="Cmsor2"/>
       </w:pPr>
-      <w:bookmarkStart w:id="29" w:name="_Toc225437729"/>
+      <w:bookmarkStart w:id="31" w:name="_Toc225478195"/>
       <w:r>
         <w:lastRenderedPageBreak/>
         <w:t>11.2 Jelszóbiztonság</w:t>
       </w:r>
-      <w:bookmarkEnd w:id="29"/>
+      <w:bookmarkEnd w:id="31"/>
     </w:p>
     <w:p>
       <w:r>
@@ -11997,12 +12597,12 @@
         <w:pStyle w:val="Cmsor2"/>
         <w:spacing w:before="100" w:beforeAutospacing="1"/>
       </w:pPr>
-      <w:bookmarkStart w:id="30" w:name="_Toc225437730"/>
+      <w:bookmarkStart w:id="32" w:name="_Toc225478196"/>
       <w:r>
         <w:lastRenderedPageBreak/>
         <w:t>11.3 Jogosultságkezelés (RBAC)</w:t>
       </w:r>
-      <w:bookmarkEnd w:id="30"/>
+      <w:bookmarkEnd w:id="32"/>
     </w:p>
     <w:p>
       <w:pPr>
@@ -12238,12 +12838,12 @@
       <w:pPr>
         <w:pStyle w:val="Cmsor2"/>
       </w:pPr>
-      <w:bookmarkStart w:id="31" w:name="_Toc225437731"/>
+      <w:bookmarkStart w:id="33" w:name="_Toc225478197"/>
       <w:r>
         <w:lastRenderedPageBreak/>
         <w:t>11.4 Jelszó-visszaállítás védelme</w:t>
       </w:r>
-      <w:bookmarkEnd w:id="31"/>
+      <w:bookmarkEnd w:id="33"/>
     </w:p>
     <w:p>
       <w:pPr>
@@ -12563,12 +13163,12 @@
       <w:pPr>
         <w:pStyle w:val="Cmsor2"/>
       </w:pPr>
-      <w:bookmarkStart w:id="32" w:name="_Toc225437732"/>
+      <w:bookmarkStart w:id="34" w:name="_Toc225478198"/>
       <w:r>
         <w:lastRenderedPageBreak/>
         <w:t>11.5 API-védelem és forgalomkorlát</w:t>
       </w:r>
-      <w:bookmarkEnd w:id="32"/>
+      <w:bookmarkEnd w:id="34"/>
     </w:p>
     <w:p>
       <w:r>
@@ -12729,12 +13329,12 @@
       <w:pPr>
         <w:pStyle w:val="Cmsor2"/>
       </w:pPr>
-      <w:bookmarkStart w:id="33" w:name="_Toc225437733"/>
+      <w:bookmarkStart w:id="35" w:name="_Toc225478199"/>
       <w:r>
         <w:lastRenderedPageBreak/>
         <w:t>11.6 CORS és környezeti védelem</w:t>
       </w:r>
-      <w:bookmarkEnd w:id="33"/>
+      <w:bookmarkEnd w:id="35"/>
     </w:p>
     <w:p>
       <w:pPr>
@@ -12927,12 +13527,12 @@
       <w:pPr>
         <w:pStyle w:val="Cmsor2"/>
       </w:pPr>
-      <w:bookmarkStart w:id="34" w:name="_Toc225437734"/>
+      <w:bookmarkStart w:id="36" w:name="_Toc225478200"/>
       <w:r>
         <w:lastRenderedPageBreak/>
         <w:t>11.7 Adatbázis-biztonság és lekérdezések</w:t>
       </w:r>
-      <w:bookmarkEnd w:id="34"/>
+      <w:bookmarkEnd w:id="36"/>
     </w:p>
     <w:p>
       <w:pPr>
@@ -13182,12 +13782,12 @@
       <w:pPr>
         <w:pStyle w:val="Cmsor2"/>
       </w:pPr>
-      <w:bookmarkStart w:id="35" w:name="_Toc225437735"/>
+      <w:bookmarkStart w:id="37" w:name="_Toc225478201"/>
       <w:r>
         <w:lastRenderedPageBreak/>
         <w:t>11.8 Üzleti logikai védelem</w:t>
       </w:r>
-      <w:bookmarkEnd w:id="35"/>
+      <w:bookmarkEnd w:id="37"/>
     </w:p>
     <w:p>
       <w:pPr>
@@ -13375,12 +13975,12 @@
       <w:pPr>
         <w:pStyle w:val="Cmsor2"/>
       </w:pPr>
-      <w:bookmarkStart w:id="36" w:name="_Toc225437736"/>
+      <w:bookmarkStart w:id="38" w:name="_Toc225478202"/>
       <w:r>
         <w:lastRenderedPageBreak/>
         <w:t>11.9 Üzenetek és bemenetek kezelése</w:t>
       </w:r>
-      <w:bookmarkEnd w:id="36"/>
+      <w:bookmarkEnd w:id="38"/>
     </w:p>
     <w:p>
       <w:pPr>
@@ -13543,12 +14143,12 @@
       <w:pPr>
         <w:pStyle w:val="Cmsor1"/>
       </w:pPr>
-      <w:bookmarkStart w:id="37" w:name="_Toc225437737"/>
+      <w:bookmarkStart w:id="39" w:name="_Toc225478203"/>
       <w:r>
         <w:lastRenderedPageBreak/>
         <w:t>12. API-DOKUMENTÁCIÓ ÖSSZEFOGLALÓ</w:t>
       </w:r>
-      <w:bookmarkEnd w:id="37"/>
+      <w:bookmarkEnd w:id="39"/>
     </w:p>
     <w:p>
       <w:pPr>
@@ -13824,12 +14424,12 @@
       <w:pPr>
         <w:pStyle w:val="Cmsor2"/>
       </w:pPr>
-      <w:bookmarkStart w:id="38" w:name="_Toc225437738"/>
+      <w:bookmarkStart w:id="40" w:name="_Toc225478204"/>
       <w:r>
         <w:lastRenderedPageBreak/>
         <w:t>12.1 API-csoportok áttekintése</w:t>
       </w:r>
-      <w:bookmarkEnd w:id="38"/>
+      <w:bookmarkEnd w:id="40"/>
     </w:p>
     <w:p>
       <w:pPr>
@@ -14192,12 +14792,12 @@
       <w:pPr>
         <w:pStyle w:val="Cmsor2"/>
       </w:pPr>
-      <w:bookmarkStart w:id="39" w:name="_Toc225437739"/>
+      <w:bookmarkStart w:id="41" w:name="_Toc225478205"/>
       <w:r>
         <w:lastRenderedPageBreak/>
         <w:t>12.2 Hitelesítés és szerepkörök</w:t>
       </w:r>
-      <w:bookmarkEnd w:id="39"/>
+      <w:bookmarkEnd w:id="41"/>
     </w:p>
     <w:p>
       <w:pPr>
@@ -14437,12 +15037,12 @@
       <w:pPr>
         <w:pStyle w:val="Cmsor2"/>
       </w:pPr>
-      <w:bookmarkStart w:id="40" w:name="_Toc225437740"/>
+      <w:bookmarkStart w:id="42" w:name="_Toc225478206"/>
       <w:r>
         <w:lastRenderedPageBreak/>
         <w:t>12.3 Főbb végpontok (projekt szerinti, tényleges útvonalakkal)</w:t>
       </w:r>
-      <w:bookmarkEnd w:id="40"/>
+      <w:bookmarkEnd w:id="42"/>
     </w:p>
     <w:p>
       <w:pPr>
@@ -15580,12 +16180,12 @@
         <w:pStyle w:val="Cmsor2"/>
         <w:spacing w:before="480"/>
       </w:pPr>
-      <w:bookmarkStart w:id="41" w:name="_Toc225437741"/>
+      <w:bookmarkStart w:id="43" w:name="_Toc225478207"/>
       <w:r>
         <w:lastRenderedPageBreak/>
         <w:t>12.4 Példa kérés-válasz logika</w:t>
       </w:r>
-      <w:bookmarkEnd w:id="41"/>
+      <w:bookmarkEnd w:id="43"/>
     </w:p>
     <w:p>
       <w:pPr>
@@ -16091,12 +16691,12 @@
         <w:pStyle w:val="Cmsor1"/>
         <w:spacing w:before="840"/>
       </w:pPr>
-      <w:bookmarkStart w:id="42" w:name="_Toc225437742"/>
+      <w:bookmarkStart w:id="44" w:name="_Toc225478208"/>
       <w:r>
         <w:lastRenderedPageBreak/>
         <w:t>13. JÖVŐBELI FEJLESZTÉSI LEHETŐSÉGEK</w:t>
       </w:r>
-      <w:bookmarkEnd w:id="42"/>
+      <w:bookmarkEnd w:id="44"/>
     </w:p>
     <w:p>
       <w:pPr>
@@ -16474,25 +17074,25 @@
       <w:pPr>
         <w:pStyle w:val="Cmsor1"/>
       </w:pPr>
-      <w:bookmarkStart w:id="43" w:name="_Toc225437743"/>
+      <w:bookmarkStart w:id="45" w:name="_Toc225478209"/>
       <w:r>
         <w:lastRenderedPageBreak/>
         <w:t>14. MELLÉKLETEK</w:t>
       </w:r>
-      <w:bookmarkEnd w:id="43"/>
+      <w:bookmarkEnd w:id="45"/>
     </w:p>
     <w:p>
       <w:pPr>
         <w:pStyle w:val="Cmsor2"/>
       </w:pPr>
-      <w:bookmarkStart w:id="44" w:name="_Toc225437744"/>
+      <w:bookmarkStart w:id="46" w:name="_Toc225478210"/>
       <w:r>
         <w:t xml:space="preserve">14.1 </w:t>
       </w:r>
       <w:r>
         <w:t>Bejelentkezés</w:t>
       </w:r>
-      <w:bookmarkEnd w:id="44"/>
+      <w:bookmarkEnd w:id="46"/>
     </w:p>
     <w:p>
       <w:r>
@@ -16523,7 +17123,7 @@
                     <pic:cNvPicPr/>
                   </pic:nvPicPr>
                   <pic:blipFill>
-                    <a:blip r:embed="rId32">
+                    <a:blip r:embed="rId34">
                       <a:extLst>
                         <a:ext uri="{28A0092B-C50C-407E-A947-70E740481C1C}">
                           <a14:useLocalDpi xmlns:a14="http://schemas.microsoft.com/office/drawing/2010/main" val="0"/>
@@ -16606,11 +17206,11 @@
       <w:pPr>
         <w:pStyle w:val="Cmsor3"/>
       </w:pPr>
-      <w:bookmarkStart w:id="45" w:name="_Toc225437745"/>
+      <w:bookmarkStart w:id="47" w:name="_Toc225478211"/>
       <w:r>
         <w:t>14.1.1 Bejelentkezés hibaüzenetek</w:t>
       </w:r>
-      <w:bookmarkEnd w:id="45"/>
+      <w:bookmarkEnd w:id="47"/>
     </w:p>
     <w:p>
       <w:pPr>
@@ -16636,177 +17236,6 @@
             <wp:effectExtent l="0" t="0" r="0" b="0"/>
             <wp:wrapSquare wrapText="bothSides"/>
             <wp:docPr id="12" name="Kép 12"/>
-            <wp:cNvGraphicFramePr>
-              <a:graphicFrameLocks xmlns:a="http://schemas.openxmlformats.org/drawingml/2006/main" noChangeAspect="1"/>
-            </wp:cNvGraphicFramePr>
-            <a:graphic xmlns:a="http://schemas.openxmlformats.org/drawingml/2006/main">
-              <a:graphicData uri="http://schemas.openxmlformats.org/drawingml/2006/picture">
-                <pic:pic xmlns:pic="http://schemas.openxmlformats.org/drawingml/2006/picture">
-                  <pic:nvPicPr>
-                    <pic:cNvPr id="1" name=""/>
-                    <pic:cNvPicPr/>
-                  </pic:nvPicPr>
-                  <pic:blipFill>
-                    <a:blip r:embed="rId33">
-                      <a:extLst>
-                        <a:ext uri="{28A0092B-C50C-407E-A947-70E740481C1C}">
-                          <a14:useLocalDpi xmlns:a14="http://schemas.microsoft.com/office/drawing/2010/main" val="0"/>
-                        </a:ext>
-                      </a:extLst>
-                    </a:blip>
-                    <a:stretch>
-                      <a:fillRect/>
-                    </a:stretch>
-                  </pic:blipFill>
-                  <pic:spPr>
-                    <a:xfrm>
-                      <a:off x="0" y="0"/>
-                      <a:ext cx="3511550" cy="2822575"/>
-                    </a:xfrm>
-                    <a:prstGeom prst="rect">
-                      <a:avLst/>
-                    </a:prstGeom>
-                  </pic:spPr>
-                </pic:pic>
-              </a:graphicData>
-            </a:graphic>
-          </wp:anchor>
-        </w:drawing>
-      </w:r>
-      <w:r>
-        <w:t>Ez a hibaüzenet a bejelentkezési űrlap kliensoldali validációjához tartozik.</w:t>
-      </w:r>
-      <w:r>
-        <w:br/>
-        <w:t>A rendszer ellenőrzi, hogy az email mezőben valóban érvényes email formátum szerepel-e, és ha nem, akkor a belépési folyamatot nem engedi tovább.</w:t>
-      </w:r>
-      <w:r>
-        <w:t xml:space="preserve"> </w:t>
-      </w:r>
-      <w:r>
-        <w:br/>
-      </w:r>
-      <w:r>
-        <w:t>A képen látható </w:t>
-      </w:r>
-      <w:proofErr w:type="spellStart"/>
-      <w:r>
-        <w:t>asd</w:t>
-      </w:r>
-      <w:proofErr w:type="spellEnd"/>
-      <w:r>
-        <w:t xml:space="preserve"> érték nem felel meg az elvárt formátumnak (hiányzik például a @ és a </w:t>
-      </w:r>
-      <w:proofErr w:type="spellStart"/>
-      <w:r>
-        <w:t>domain</w:t>
-      </w:r>
-      <w:proofErr w:type="spellEnd"/>
-      <w:r>
-        <w:t xml:space="preserve"> rész), ezért jelenik meg a figyelmeztetés:</w:t>
-      </w:r>
-      <w:r>
-        <w:br/>
-      </w:r>
-      <w:r>
-        <w:rPr>
-          <w:b/>
-          <w:bCs/>
-        </w:rPr>
-        <w:t>„Kérlek érvényes email címet adj meg (pl. </w:t>
-      </w:r>
-      <w:hyperlink r:id="rId34" w:tgtFrame="_blank" w:history="1">
-        <w:r>
-          <w:rPr>
-            <w:rStyle w:val="Hiperhivatkozs"/>
-            <w:b/>
-            <w:bCs/>
-          </w:rPr>
-          <w:t>nev@pelda.hu</w:t>
-        </w:r>
-      </w:hyperlink>
-      <w:r>
-        <w:rPr>
-          <w:b/>
-          <w:bCs/>
-        </w:rPr>
-        <w:t>).”</w:t>
-      </w:r>
-    </w:p>
-    <w:p>
-      <w:pPr>
-        <w:spacing w:before="480"/>
-      </w:pPr>
-      <w:r>
-        <w:lastRenderedPageBreak/>
-        <w:t>Ennek célja:</w:t>
-      </w:r>
-    </w:p>
-    <w:p>
-      <w:pPr>
-        <w:numPr>
-          <w:ilvl w:val="0"/>
-          <w:numId w:val="21"/>
-        </w:numPr>
-      </w:pPr>
-      <w:r>
-        <w:t>a hibás adatbevitel korai kiszűrése,</w:t>
-      </w:r>
-    </w:p>
-    <w:p>
-      <w:pPr>
-        <w:numPr>
-          <w:ilvl w:val="0"/>
-          <w:numId w:val="21"/>
-        </w:numPr>
-      </w:pPr>
-      <w:r>
-        <w:t>a felesleges szerverhívások csökkentése,</w:t>
-      </w:r>
-    </w:p>
-    <w:p>
-      <w:pPr>
-        <w:numPr>
-          <w:ilvl w:val="0"/>
-          <w:numId w:val="21"/>
-        </w:numPr>
-      </w:pPr>
-      <w:r>
-        <w:t>egyértelmű visszajelzés adása a felhasználónak a javításhoz.</w:t>
-      </w:r>
-    </w:p>
-    <w:p>
-      <w:pPr>
-        <w:pStyle w:val="Cmsor3"/>
-      </w:pPr>
-      <w:bookmarkStart w:id="46" w:name="_Toc225437746"/>
-      <w:r>
-        <w:t xml:space="preserve">14.1.2 </w:t>
-      </w:r>
-      <w:r>
-        <w:t>Hiányzó Jelszó a Bejelentkezésnél</w:t>
-      </w:r>
-      <w:bookmarkEnd w:id="46"/>
-    </w:p>
-    <w:p>
-      <w:r>
-        <w:rPr>
-          <w:noProof/>
-          <w14:ligatures w14:val="standardContextual"/>
-        </w:rPr>
-        <w:drawing>
-          <wp:anchor distT="0" distB="0" distL="114300" distR="114300" simplePos="0" relativeHeight="251668480" behindDoc="0" locked="0" layoutInCell="1" allowOverlap="1" wp14:anchorId="28FD0E91" wp14:editId="020154FB">
-            <wp:simplePos x="0" y="0"/>
-            <wp:positionH relativeFrom="margin">
-              <wp:align>left</wp:align>
-            </wp:positionH>
-            <wp:positionV relativeFrom="paragraph">
-              <wp:posOffset>394143</wp:posOffset>
-            </wp:positionV>
-            <wp:extent cx="3414395" cy="3010535"/>
-            <wp:effectExtent l="0" t="0" r="0" b="0"/>
-            <wp:wrapSquare wrapText="bothSides"/>
-            <wp:docPr id="13" name="Kép 13"/>
             <wp:cNvGraphicFramePr>
               <a:graphicFrameLocks xmlns:a="http://schemas.openxmlformats.org/drawingml/2006/main" noChangeAspect="1"/>
             </wp:cNvGraphicFramePr>
@@ -16832,7 +17261,7 @@
                   <pic:spPr>
                     <a:xfrm>
                       <a:off x="0" y="0"/>
-                      <a:ext cx="3414395" cy="3010535"/>
+                      <a:ext cx="3511550" cy="2822575"/>
                     </a:xfrm>
                     <a:prstGeom prst="rect">
                       <a:avLst/>
@@ -16845,57 +17274,119 @@
         </w:drawing>
       </w:r>
       <w:r>
-        <w:t>Ez a hibaüzenet akkor jelenik meg, amikor a felhasználó kitölti az email mezőt, de a jelszó mezőt üresen hagyja, és így próbál belépni. A kliensoldali validáció ellenőrzi a kötelező mezőket, ezért a rendszer nem indítja el a bejelentkezési kérést, amíg a jelszó nincs megadva.</w:t>
-      </w:r>
-    </w:p>
-    <w:p>
-      <w:r>
-        <w:t>A „</w:t>
+        <w:t>Ez a hibaüzenet a bejelentkezési űrlap kliensoldali validációjához tartozik.</w:t>
+      </w:r>
+      <w:r>
+        <w:br/>
+        <w:t>A rendszer ellenőrzi, hogy az email mezőben valóban érvényes email formátum szerepel-e, és ha nem, akkor a belépési folyamatot nem engedi tovább.</w:t>
+      </w:r>
+      <w:r>
+        <w:t xml:space="preserve"> </w:t>
+      </w:r>
+      <w:r>
+        <w:br/>
+      </w:r>
+      <w:r>
+        <w:t>A képen látható </w:t>
+      </w:r>
+      <w:proofErr w:type="spellStart"/>
+      <w:r>
+        <w:t>asd</w:t>
+      </w:r>
+      <w:proofErr w:type="spellEnd"/>
+      <w:r>
+        <w:t xml:space="preserve"> érték nem felel meg az elvárt formátumnak (hiányzik például a @ és a </w:t>
+      </w:r>
+      <w:proofErr w:type="spellStart"/>
+      <w:r>
+        <w:t>domain</w:t>
+      </w:r>
+      <w:proofErr w:type="spellEnd"/>
+      <w:r>
+        <w:t xml:space="preserve"> rész), ezért jelenik meg a figyelmeztetés:</w:t>
+      </w:r>
+      <w:r>
+        <w:br/>
       </w:r>
       <w:r>
         <w:rPr>
           <w:b/>
           <w:bCs/>
         </w:rPr>
-        <w:t xml:space="preserve">Kérlek add meg a </w:t>
-      </w:r>
-      <w:proofErr w:type="spellStart"/>
+        <w:t>„Kérlek érvényes email címet adj meg (pl. </w:t>
+      </w:r>
+      <w:hyperlink r:id="rId36" w:tgtFrame="_blank" w:history="1">
+        <w:r>
+          <w:rPr>
+            <w:rStyle w:val="Hiperhivatkozs"/>
+            <w:b/>
+            <w:bCs/>
+          </w:rPr>
+          <w:t>nev@pelda.hu</w:t>
+        </w:r>
+      </w:hyperlink>
       <w:r>
         <w:rPr>
           <w:b/>
           <w:bCs/>
         </w:rPr>
-        <w:t>jelszavadat</w:t>
-      </w:r>
-      <w:proofErr w:type="spellEnd"/>
-      <w:r>
-        <w:rPr>
-          <w:b/>
-          <w:bCs/>
-        </w:rPr>
-        <w:t>.</w:t>
-      </w:r>
-      <w:r>
-        <w:t>” üzenet célja, hogy azonnali, egyértelmű visszajelzést adjon a hiányzó adat pótlásához. Ez javítja a felhasználói élményt, csökkenti a hibás beküldések számát, és megelőzi a felesleges szerveroldali terhelést.</w:t>
-      </w:r>
-    </w:p>
-    <w:p/>
+        <w:t>).”</w:t>
+      </w:r>
+    </w:p>
+    <w:p>
+      <w:pPr>
+        <w:spacing w:before="480"/>
+      </w:pPr>
+      <w:r>
+        <w:lastRenderedPageBreak/>
+        <w:t>Ennek célja:</w:t>
+      </w:r>
+    </w:p>
+    <w:p>
+      <w:pPr>
+        <w:numPr>
+          <w:ilvl w:val="0"/>
+          <w:numId w:val="21"/>
+        </w:numPr>
+      </w:pPr>
+      <w:r>
+        <w:t>a hibás adatbevitel korai kiszűrése,</w:t>
+      </w:r>
+    </w:p>
+    <w:p>
+      <w:pPr>
+        <w:numPr>
+          <w:ilvl w:val="0"/>
+          <w:numId w:val="21"/>
+        </w:numPr>
+      </w:pPr>
+      <w:r>
+        <w:t>a felesleges szerverhívások csökkentése,</w:t>
+      </w:r>
+    </w:p>
+    <w:p>
+      <w:pPr>
+        <w:numPr>
+          <w:ilvl w:val="0"/>
+          <w:numId w:val="21"/>
+        </w:numPr>
+      </w:pPr>
+      <w:r>
+        <w:t>egyértelmű visszajelzés adása a felhasználónak a javításhoz.</w:t>
+      </w:r>
+    </w:p>
     <w:p>
       <w:pPr>
         <w:pStyle w:val="Cmsor3"/>
       </w:pPr>
-      <w:bookmarkStart w:id="47" w:name="_Toc225437747"/>
-      <w:r>
-        <w:t xml:space="preserve">14.1.3 </w:t>
-      </w:r>
-      <w:r>
-        <w:rPr>
-          <w:b/>
-          <w:bCs/>
-        </w:rPr>
-        <w:t>Nem Létező Fiók (Bejelentkezési Hiba)</w:t>
-      </w:r>
-      <w:bookmarkEnd w:id="47"/>
+      <w:bookmarkStart w:id="48" w:name="_Toc225478212"/>
+      <w:r>
+        <w:t xml:space="preserve">14.1.2 </w:t>
+      </w:r>
+      <w:r>
+        <w:t>Hiányzó Jelszó a Bejelentkezésnél</w:t>
+      </w:r>
+      <w:bookmarkEnd w:id="48"/>
     </w:p>
     <w:p>
       <w:r>
@@ -16904,174 +17395,18 @@
           <w14:ligatures w14:val="standardContextual"/>
         </w:rPr>
         <w:drawing>
-          <wp:anchor distT="0" distB="0" distL="114300" distR="114300" simplePos="0" relativeHeight="251669504" behindDoc="0" locked="0" layoutInCell="1" allowOverlap="1" wp14:anchorId="5C0B8CC3" wp14:editId="17FE4D4B">
+          <wp:anchor distT="0" distB="0" distL="114300" distR="114300" simplePos="0" relativeHeight="251668480" behindDoc="0" locked="0" layoutInCell="1" allowOverlap="1" wp14:anchorId="28FD0E91" wp14:editId="020154FB">
             <wp:simplePos x="0" y="0"/>
             <wp:positionH relativeFrom="margin">
               <wp:align>left</wp:align>
             </wp:positionH>
             <wp:positionV relativeFrom="paragraph">
-              <wp:posOffset>12975</wp:posOffset>
+              <wp:posOffset>394143</wp:posOffset>
             </wp:positionV>
-            <wp:extent cx="3056890" cy="2484120"/>
+            <wp:extent cx="3414395" cy="3010535"/>
             <wp:effectExtent l="0" t="0" r="0" b="0"/>
             <wp:wrapSquare wrapText="bothSides"/>
-            <wp:docPr id="14" name="Kép 14"/>
-            <wp:cNvGraphicFramePr>
-              <a:graphicFrameLocks xmlns:a="http://schemas.openxmlformats.org/drawingml/2006/main" noChangeAspect="1"/>
-            </wp:cNvGraphicFramePr>
-            <a:graphic xmlns:a="http://schemas.openxmlformats.org/drawingml/2006/main">
-              <a:graphicData uri="http://schemas.openxmlformats.org/drawingml/2006/picture">
-                <pic:pic xmlns:pic="http://schemas.openxmlformats.org/drawingml/2006/picture">
-                  <pic:nvPicPr>
-                    <pic:cNvPr id="1" name=""/>
-                    <pic:cNvPicPr/>
-                  </pic:nvPicPr>
-                  <pic:blipFill>
-                    <a:blip r:embed="rId36">
-                      <a:extLst>
-                        <a:ext uri="{28A0092B-C50C-407E-A947-70E740481C1C}">
-                          <a14:useLocalDpi xmlns:a14="http://schemas.microsoft.com/office/drawing/2010/main" val="0"/>
-                        </a:ext>
-                      </a:extLst>
-                    </a:blip>
-                    <a:stretch>
-                      <a:fillRect/>
-                    </a:stretch>
-                  </pic:blipFill>
-                  <pic:spPr>
-                    <a:xfrm>
-                      <a:off x="0" y="0"/>
-                      <a:ext cx="3056890" cy="2484120"/>
-                    </a:xfrm>
-                    <a:prstGeom prst="rect">
-                      <a:avLst/>
-                    </a:prstGeom>
-                  </pic:spPr>
-                </pic:pic>
-              </a:graphicData>
-            </a:graphic>
-          </wp:anchor>
-        </w:drawing>
-      </w:r>
-      <w:r>
-        <w:t>Ez a hibaüzenet akkor jelenik meg, amikor a megadott email címhez nem tartozik regisztrált felhasználói fiók a rendszerben. A backend ilyenkor nem tudja azonosítani a felhasználót, ezért a bejelentkezést elutasítja, és visszajelzi: </w:t>
-      </w:r>
-      <w:r>
-        <w:rPr>
-          <w:b/>
-          <w:bCs/>
-        </w:rPr>
-        <w:t>„A fiókját nem találtuk. Ellenőrizd az email címet.”</w:t>
-      </w:r>
-    </w:p>
-    <w:p>
-      <w:pPr>
-        <w:spacing w:before="0"/>
-      </w:pPr>
-      <w:r>
-        <w:t>A hiba célja, hogy egyértelműen jelezze: a probléma nem a jelszóval, hanem az email-címhez tartozó fiók hiányával kapcsolatos.</w:t>
-      </w:r>
-      <w:r>
-        <w:t xml:space="preserve"> </w:t>
-      </w:r>
-    </w:p>
-    <w:p>
-      <w:pPr>
-        <w:spacing w:before="0"/>
-      </w:pPr>
-    </w:p>
-    <w:p>
-      <w:pPr>
-        <w:spacing w:before="0"/>
-        <w:rPr>
-          <w:b/>
-          <w:bCs/>
-        </w:rPr>
-      </w:pPr>
-      <w:r>
-        <w:rPr>
-          <w:b/>
-          <w:bCs/>
-        </w:rPr>
-        <w:lastRenderedPageBreak/>
-        <w:t>Ilyen esetben a felhasználó:</w:t>
-      </w:r>
-    </w:p>
-    <w:p>
-      <w:pPr>
-        <w:pStyle w:val="Listaszerbekezds"/>
-        <w:numPr>
-          <w:ilvl w:val="0"/>
-          <w:numId w:val="45"/>
-        </w:numPr>
-        <w:spacing w:before="0"/>
-      </w:pPr>
-      <w:r>
-        <w:t>ellenőrizze az email cím helyesírását,</w:t>
-      </w:r>
-    </w:p>
-    <w:p>
-      <w:pPr>
-        <w:numPr>
-          <w:ilvl w:val="0"/>
-          <w:numId w:val="45"/>
-        </w:numPr>
-      </w:pPr>
-      <w:r>
-        <w:t>próbáljon másik, korábban használt email címet,</w:t>
-      </w:r>
-    </w:p>
-    <w:p>
-      <w:pPr>
-        <w:numPr>
-          <w:ilvl w:val="0"/>
-          <w:numId w:val="45"/>
-        </w:numPr>
-      </w:pPr>
-      <w:r>
-        <w:t>vagy hozza létre új fiókját a regisztrációs oldalon.</w:t>
-      </w:r>
-    </w:p>
-    <w:p>
-      <w:pPr>
-        <w:pStyle w:val="Cmsor3"/>
-        <w:rPr>
-          <w:b/>
-          <w:bCs/>
-        </w:rPr>
-      </w:pPr>
-      <w:bookmarkStart w:id="48" w:name="_Toc225437748"/>
-      <w:r>
-        <w:t xml:space="preserve">14.1.4 </w:t>
-      </w:r>
-      <w:r>
-        <w:rPr>
-          <w:b/>
-          <w:bCs/>
-        </w:rPr>
-        <w:t>Hibás Jelszó a Bejelentkezésnél</w:t>
-      </w:r>
-      <w:bookmarkEnd w:id="48"/>
-    </w:p>
-    <w:p>
-      <w:r>
-        <w:rPr>
-          <w:noProof/>
-          <w14:ligatures w14:val="standardContextual"/>
-        </w:rPr>
-        <w:drawing>
-          <wp:anchor distT="0" distB="0" distL="114300" distR="114300" simplePos="0" relativeHeight="251670528" behindDoc="0" locked="0" layoutInCell="1" allowOverlap="1" wp14:anchorId="4CC74842" wp14:editId="65BBA693">
-            <wp:simplePos x="0" y="0"/>
-            <wp:positionH relativeFrom="margin">
-              <wp:align>left</wp:align>
-            </wp:positionH>
-            <wp:positionV relativeFrom="paragraph">
-              <wp:posOffset>14569</wp:posOffset>
-            </wp:positionV>
-            <wp:extent cx="3185220" cy="2613804"/>
-            <wp:effectExtent l="0" t="0" r="0" b="0"/>
-            <wp:wrapSquare wrapText="bothSides"/>
-            <wp:docPr id="15" name="Kép 15"/>
+            <wp:docPr id="13" name="Kép 13"/>
             <wp:cNvGraphicFramePr>
               <a:graphicFrameLocks xmlns:a="http://schemas.openxmlformats.org/drawingml/2006/main" noChangeAspect="1"/>
             </wp:cNvGraphicFramePr>
@@ -17097,6 +17432,271 @@
                   <pic:spPr>
                     <a:xfrm>
                       <a:off x="0" y="0"/>
+                      <a:ext cx="3414395" cy="3010535"/>
+                    </a:xfrm>
+                    <a:prstGeom prst="rect">
+                      <a:avLst/>
+                    </a:prstGeom>
+                  </pic:spPr>
+                </pic:pic>
+              </a:graphicData>
+            </a:graphic>
+          </wp:anchor>
+        </w:drawing>
+      </w:r>
+      <w:r>
+        <w:t>Ez a hibaüzenet akkor jelenik meg, amikor a felhasználó kitölti az email mezőt, de a jelszó mezőt üresen hagyja, és így próbál belépni. A kliensoldali validáció ellenőrzi a kötelező mezőket, ezért a rendszer nem indítja el a bejelentkezési kérést, amíg a jelszó nincs megadva.</w:t>
+      </w:r>
+    </w:p>
+    <w:p>
+      <w:r>
+        <w:t>A „</w:t>
+      </w:r>
+      <w:r>
+        <w:rPr>
+          <w:b/>
+          <w:bCs/>
+        </w:rPr>
+        <w:t xml:space="preserve">Kérlek add meg a </w:t>
+      </w:r>
+      <w:proofErr w:type="spellStart"/>
+      <w:r>
+        <w:rPr>
+          <w:b/>
+          <w:bCs/>
+        </w:rPr>
+        <w:t>jelszavadat</w:t>
+      </w:r>
+      <w:proofErr w:type="spellEnd"/>
+      <w:r>
+        <w:rPr>
+          <w:b/>
+          <w:bCs/>
+        </w:rPr>
+        <w:t>.</w:t>
+      </w:r>
+      <w:r>
+        <w:t>” üzenet célja, hogy azonnali, egyértelmű visszajelzést adjon a hiányzó adat pótlásához. Ez javítja a felhasználói élményt, csökkenti a hibás beküldések számát, és megelőzi a felesleges szerveroldali terhelést.</w:t>
+      </w:r>
+    </w:p>
+    <w:p/>
+    <w:p>
+      <w:pPr>
+        <w:pStyle w:val="Cmsor3"/>
+      </w:pPr>
+      <w:bookmarkStart w:id="49" w:name="_Toc225478213"/>
+      <w:r>
+        <w:t xml:space="preserve">14.1.3 </w:t>
+      </w:r>
+      <w:r>
+        <w:rPr>
+          <w:b/>
+          <w:bCs/>
+        </w:rPr>
+        <w:t>Nem Létező Fiók (Bejelentkezési Hiba)</w:t>
+      </w:r>
+      <w:bookmarkEnd w:id="49"/>
+    </w:p>
+    <w:p>
+      <w:r>
+        <w:rPr>
+          <w:noProof/>
+          <w14:ligatures w14:val="standardContextual"/>
+        </w:rPr>
+        <w:drawing>
+          <wp:anchor distT="0" distB="0" distL="114300" distR="114300" simplePos="0" relativeHeight="251669504" behindDoc="0" locked="0" layoutInCell="1" allowOverlap="1" wp14:anchorId="5C0B8CC3" wp14:editId="17FE4D4B">
+            <wp:simplePos x="0" y="0"/>
+            <wp:positionH relativeFrom="margin">
+              <wp:align>left</wp:align>
+            </wp:positionH>
+            <wp:positionV relativeFrom="paragraph">
+              <wp:posOffset>12975</wp:posOffset>
+            </wp:positionV>
+            <wp:extent cx="3056890" cy="2484120"/>
+            <wp:effectExtent l="0" t="0" r="0" b="0"/>
+            <wp:wrapSquare wrapText="bothSides"/>
+            <wp:docPr id="14" name="Kép 14"/>
+            <wp:cNvGraphicFramePr>
+              <a:graphicFrameLocks xmlns:a="http://schemas.openxmlformats.org/drawingml/2006/main" noChangeAspect="1"/>
+            </wp:cNvGraphicFramePr>
+            <a:graphic xmlns:a="http://schemas.openxmlformats.org/drawingml/2006/main">
+              <a:graphicData uri="http://schemas.openxmlformats.org/drawingml/2006/picture">
+                <pic:pic xmlns:pic="http://schemas.openxmlformats.org/drawingml/2006/picture">
+                  <pic:nvPicPr>
+                    <pic:cNvPr id="1" name=""/>
+                    <pic:cNvPicPr/>
+                  </pic:nvPicPr>
+                  <pic:blipFill>
+                    <a:blip r:embed="rId38">
+                      <a:extLst>
+                        <a:ext uri="{28A0092B-C50C-407E-A947-70E740481C1C}">
+                          <a14:useLocalDpi xmlns:a14="http://schemas.microsoft.com/office/drawing/2010/main" val="0"/>
+                        </a:ext>
+                      </a:extLst>
+                    </a:blip>
+                    <a:stretch>
+                      <a:fillRect/>
+                    </a:stretch>
+                  </pic:blipFill>
+                  <pic:spPr>
+                    <a:xfrm>
+                      <a:off x="0" y="0"/>
+                      <a:ext cx="3056890" cy="2484120"/>
+                    </a:xfrm>
+                    <a:prstGeom prst="rect">
+                      <a:avLst/>
+                    </a:prstGeom>
+                  </pic:spPr>
+                </pic:pic>
+              </a:graphicData>
+            </a:graphic>
+          </wp:anchor>
+        </w:drawing>
+      </w:r>
+      <w:r>
+        <w:t>Ez a hibaüzenet akkor jelenik meg, amikor a megadott email címhez nem tartozik regisztrált felhasználói fiók a rendszerben. A backend ilyenkor nem tudja azonosítani a felhasználót, ezért a bejelentkezést elutasítja, és visszajelzi: </w:t>
+      </w:r>
+      <w:r>
+        <w:rPr>
+          <w:b/>
+          <w:bCs/>
+        </w:rPr>
+        <w:t>„A fiókját nem találtuk. Ellenőrizd az email címet.”</w:t>
+      </w:r>
+    </w:p>
+    <w:p>
+      <w:pPr>
+        <w:spacing w:before="0"/>
+      </w:pPr>
+      <w:r>
+        <w:t>A hiba célja, hogy egyértelműen jelezze: a probléma nem a jelszóval, hanem az email-címhez tartozó fiók hiányával kapcsolatos.</w:t>
+      </w:r>
+      <w:r>
+        <w:t xml:space="preserve"> </w:t>
+      </w:r>
+    </w:p>
+    <w:p>
+      <w:pPr>
+        <w:spacing w:before="0"/>
+      </w:pPr>
+    </w:p>
+    <w:p>
+      <w:pPr>
+        <w:spacing w:before="0"/>
+        <w:rPr>
+          <w:b/>
+          <w:bCs/>
+        </w:rPr>
+      </w:pPr>
+      <w:r>
+        <w:rPr>
+          <w:b/>
+          <w:bCs/>
+        </w:rPr>
+        <w:lastRenderedPageBreak/>
+        <w:t>Ilyen esetben a felhasználó:</w:t>
+      </w:r>
+    </w:p>
+    <w:p>
+      <w:pPr>
+        <w:pStyle w:val="Listaszerbekezds"/>
+        <w:numPr>
+          <w:ilvl w:val="0"/>
+          <w:numId w:val="45"/>
+        </w:numPr>
+        <w:spacing w:before="0"/>
+      </w:pPr>
+      <w:r>
+        <w:t>ellenőrizze az email cím helyesírását,</w:t>
+      </w:r>
+    </w:p>
+    <w:p>
+      <w:pPr>
+        <w:numPr>
+          <w:ilvl w:val="0"/>
+          <w:numId w:val="45"/>
+        </w:numPr>
+      </w:pPr>
+      <w:r>
+        <w:t>próbáljon másik, korábban használt email címet,</w:t>
+      </w:r>
+    </w:p>
+    <w:p>
+      <w:pPr>
+        <w:numPr>
+          <w:ilvl w:val="0"/>
+          <w:numId w:val="45"/>
+        </w:numPr>
+      </w:pPr>
+      <w:r>
+        <w:t>vagy hozza létre új fiókját a regisztrációs oldalon.</w:t>
+      </w:r>
+    </w:p>
+    <w:p>
+      <w:pPr>
+        <w:pStyle w:val="Cmsor3"/>
+        <w:rPr>
+          <w:b/>
+          <w:bCs/>
+        </w:rPr>
+      </w:pPr>
+      <w:bookmarkStart w:id="50" w:name="_Toc225478214"/>
+      <w:r>
+        <w:t xml:space="preserve">14.1.4 </w:t>
+      </w:r>
+      <w:r>
+        <w:rPr>
+          <w:b/>
+          <w:bCs/>
+        </w:rPr>
+        <w:t>Hibás Jelszó a Bejelentkezésnél</w:t>
+      </w:r>
+      <w:bookmarkEnd w:id="50"/>
+    </w:p>
+    <w:p>
+      <w:r>
+        <w:rPr>
+          <w:noProof/>
+          <w14:ligatures w14:val="standardContextual"/>
+        </w:rPr>
+        <w:drawing>
+          <wp:anchor distT="0" distB="0" distL="114300" distR="114300" simplePos="0" relativeHeight="251670528" behindDoc="0" locked="0" layoutInCell="1" allowOverlap="1" wp14:anchorId="4CC74842" wp14:editId="65BBA693">
+            <wp:simplePos x="0" y="0"/>
+            <wp:positionH relativeFrom="margin">
+              <wp:align>left</wp:align>
+            </wp:positionH>
+            <wp:positionV relativeFrom="paragraph">
+              <wp:posOffset>14569</wp:posOffset>
+            </wp:positionV>
+            <wp:extent cx="3185220" cy="2613804"/>
+            <wp:effectExtent l="0" t="0" r="0" b="0"/>
+            <wp:wrapSquare wrapText="bothSides"/>
+            <wp:docPr id="15" name="Kép 15"/>
+            <wp:cNvGraphicFramePr>
+              <a:graphicFrameLocks xmlns:a="http://schemas.openxmlformats.org/drawingml/2006/main" noChangeAspect="1"/>
+            </wp:cNvGraphicFramePr>
+            <a:graphic xmlns:a="http://schemas.openxmlformats.org/drawingml/2006/main">
+              <a:graphicData uri="http://schemas.openxmlformats.org/drawingml/2006/picture">
+                <pic:pic xmlns:pic="http://schemas.openxmlformats.org/drawingml/2006/picture">
+                  <pic:nvPicPr>
+                    <pic:cNvPr id="1" name=""/>
+                    <pic:cNvPicPr/>
+                  </pic:nvPicPr>
+                  <pic:blipFill>
+                    <a:blip r:embed="rId39">
+                      <a:extLst>
+                        <a:ext uri="{28A0092B-C50C-407E-A947-70E740481C1C}">
+                          <a14:useLocalDpi xmlns:a14="http://schemas.microsoft.com/office/drawing/2010/main" val="0"/>
+                        </a:ext>
+                      </a:extLst>
+                    </a:blip>
+                    <a:stretch>
+                      <a:fillRect/>
+                    </a:stretch>
+                  </pic:blipFill>
+                  <pic:spPr>
+                    <a:xfrm>
+                      <a:off x="0" y="0"/>
                       <a:ext cx="3185220" cy="2613804"/>
                     </a:xfrm>
                     <a:prstGeom prst="rect">
@@ -17200,7 +17800,7 @@
       <w:pPr>
         <w:pStyle w:val="Cmsor1"/>
       </w:pPr>
-      <w:bookmarkStart w:id="49" w:name="_Toc225437749"/>
+      <w:bookmarkStart w:id="51" w:name="_Toc225478215"/>
       <w:r>
         <w:rPr>
           <w:noProof/>
@@ -17231,7 +17831,7 @@
                     <pic:cNvPicPr/>
                   </pic:nvPicPr>
                   <pic:blipFill>
-                    <a:blip r:embed="rId38" cstate="print">
+                    <a:blip r:embed="rId40" cstate="print">
                       <a:extLst>
                         <a:ext uri="{28A0092B-C50C-407E-A947-70E740481C1C}">
                           <a14:useLocalDpi xmlns:a14="http://schemas.microsoft.com/office/drawing/2010/main" val="0"/>
@@ -17269,7 +17869,7 @@
       <w:r>
         <w:t>Szerepköralapú Regisztrációs Folyamat (Felhasználó és Autómentő)</w:t>
       </w:r>
-      <w:bookmarkEnd w:id="49"/>
+      <w:bookmarkEnd w:id="51"/>
     </w:p>
     <w:p>
       <w:pPr>
@@ -17306,7 +17906,7 @@
                     <pic:cNvPicPr/>
                   </pic:nvPicPr>
                   <pic:blipFill>
-                    <a:blip r:embed="rId39">
+                    <a:blip r:embed="rId41">
                       <a:extLst>
                         <a:ext uri="{28A0092B-C50C-407E-A947-70E740481C1C}">
                           <a14:useLocalDpi xmlns:a14="http://schemas.microsoft.com/office/drawing/2010/main" val="0"/>
@@ -17507,7 +18107,7 @@
       <w:pPr>
         <w:pStyle w:val="Cmsor3"/>
       </w:pPr>
-      <w:bookmarkStart w:id="50" w:name="_Toc225437750"/>
+      <w:bookmarkStart w:id="52" w:name="_Toc225478216"/>
       <w:r>
         <w:rPr>
           <w:noProof/>
@@ -17537,7 +18137,7 @@
                     <pic:cNvPicPr/>
                   </pic:nvPicPr>
                   <pic:blipFill>
-                    <a:blip r:embed="rId40">
+                    <a:blip r:embed="rId42">
                       <a:extLst>
                         <a:ext uri="{28A0092B-C50C-407E-A947-70E740481C1C}">
                           <a14:useLocalDpi xmlns:a14="http://schemas.microsoft.com/office/drawing/2010/main" val="0"/>
@@ -17575,7 +18175,7 @@
       <w:r>
         <w:t>Hibás Email Formátum Regisztrációnál</w:t>
       </w:r>
-      <w:bookmarkEnd w:id="50"/>
+      <w:bookmarkEnd w:id="52"/>
     </w:p>
     <w:p>
       <w:r>
@@ -17607,7 +18207,7 @@
         </w:rPr>
         <w:t>Kérlek érvényes email címet adj meg (pl. </w:t>
       </w:r>
-      <w:hyperlink r:id="rId41" w:tgtFrame="_blank" w:history="1">
+      <w:hyperlink r:id="rId43" w:tgtFrame="_blank" w:history="1">
         <w:r>
           <w:rPr>
             <w:rStyle w:val="Hiperhivatkozs"/>
@@ -17664,7 +18264,7 @@
           <w:noProof/>
         </w:rPr>
       </w:pPr>
-      <w:bookmarkStart w:id="51" w:name="_Toc225437751"/>
+      <w:bookmarkStart w:id="53" w:name="_Toc225478217"/>
       <w:r>
         <w:rPr>
           <w:noProof/>
@@ -17678,7 +18278,7 @@
         </w:rPr>
         <w:t>Hiányzó Jelszó Regisztrációnál</w:t>
       </w:r>
-      <w:bookmarkEnd w:id="51"/>
+      <w:bookmarkEnd w:id="53"/>
     </w:p>
     <w:p>
       <w:r>
@@ -17710,7 +18310,7 @@
                     <pic:cNvPicPr/>
                   </pic:nvPicPr>
                   <pic:blipFill>
-                    <a:blip r:embed="rId42">
+                    <a:blip r:embed="rId44">
                       <a:extLst>
                         <a:ext uri="{28A0092B-C50C-407E-A947-70E740481C1C}">
                           <a14:useLocalDpi xmlns:a14="http://schemas.microsoft.com/office/drawing/2010/main" val="0"/>
@@ -17803,7 +18403,7 @@
       <w:pPr>
         <w:pStyle w:val="Cmsor2"/>
       </w:pPr>
-      <w:bookmarkStart w:id="52" w:name="_Toc225437752"/>
+      <w:bookmarkStart w:id="54" w:name="_Toc225478218"/>
       <w:r>
         <w:lastRenderedPageBreak/>
         <w:t>14.</w:t>
@@ -17814,7 +18414,7 @@
       <w:r>
         <w:t xml:space="preserve"> Mentési folyamat rövid folyamatábrája (szöveges)</w:t>
       </w:r>
-      <w:bookmarkEnd w:id="52"/>
+      <w:bookmarkEnd w:id="54"/>
     </w:p>
     <w:p>
       <w:pPr>
@@ -18006,7 +18606,7 @@
       <w:pPr>
         <w:pStyle w:val="Cmsor2"/>
       </w:pPr>
-      <w:bookmarkStart w:id="53" w:name="_Toc225437753"/>
+      <w:bookmarkStart w:id="55" w:name="_Toc225478219"/>
       <w:r>
         <w:lastRenderedPageBreak/>
         <w:t>14.</w:t>
@@ -18017,7 +18617,7 @@
       <w:r>
         <w:t xml:space="preserve"> ER-diagram leírás</w:t>
       </w:r>
-      <w:bookmarkEnd w:id="53"/>
+      <w:bookmarkEnd w:id="55"/>
     </w:p>
     <w:p>
       <w:r>
@@ -18361,7 +18961,7 @@
       </w:r>
     </w:p>
     <w:sectPr>
-      <w:footerReference w:type="default" r:id="rId43"/>
+      <w:footerReference w:type="default" r:id="rId45"/>
       <w:pgSz w:w="11906" w:h="16838"/>
       <w:pgMar w:top="1417" w:right="1417" w:bottom="1417" w:left="1417" w:header="708" w:footer="708" w:gutter="0"/>
       <w:cols w:space="708"/>
@@ -28100,7 +28700,6 @@
   <w:style w:type="character" w:default="1" w:styleId="Bekezdsalapbettpusa">
     <w:name w:val="Default Paragraph Font"/>
     <w:uiPriority w:val="1"/>
-    <w:semiHidden/>
     <w:unhideWhenUsed/>
   </w:style>
   <w:style w:type="table" w:default="1" w:styleId="Normltblzat">

</xml_diff>

<commit_message>
Update project to current local state
</commit_message>
<xml_diff>
--- a/dokumentacio/alakulodokumentacio.docx
+++ b/dokumentacio/alakulodokumentacio.docx
@@ -321,7 +321,7 @@
           <w:r>
             <w:fldChar w:fldCharType="separate"/>
           </w:r>
-          <w:hyperlink w:anchor="_Toc225437700" w:history="1">
+          <w:hyperlink w:anchor="_Toc225478164" w:history="1">
             <w:r>
               <w:rPr>
                 <w:rStyle w:val="Hiperhivatkozs"/>
@@ -348,7 +348,7 @@
                 <w:noProof/>
                 <w:webHidden/>
               </w:rPr>
-              <w:instrText xml:space="preserve"> PAGEREF _Toc225437700 \h </w:instrText>
+              <w:instrText xml:space="preserve"> PAGEREF _Toc225478164 \h </w:instrText>
             </w:r>
             <w:r>
               <w:rPr>
@@ -394,7 +394,7 @@
               <w14:ligatures w14:val="standardContextual"/>
             </w:rPr>
           </w:pPr>
-          <w:hyperlink w:anchor="_Toc225437701" w:history="1">
+          <w:hyperlink w:anchor="_Toc225478165" w:history="1">
             <w:r>
               <w:rPr>
                 <w:rStyle w:val="Hiperhivatkozs"/>
@@ -421,7 +421,7 @@
                 <w:noProof/>
                 <w:webHidden/>
               </w:rPr>
-              <w:instrText xml:space="preserve"> PAGEREF _Toc225437701 \h </w:instrText>
+              <w:instrText xml:space="preserve"> PAGEREF _Toc225478165 \h </w:instrText>
             </w:r>
             <w:r>
               <w:rPr>
@@ -467,7 +467,7 @@
               <w14:ligatures w14:val="standardContextual"/>
             </w:rPr>
           </w:pPr>
-          <w:hyperlink w:anchor="_Toc225437702" w:history="1">
+          <w:hyperlink w:anchor="_Toc225478166" w:history="1">
             <w:r>
               <w:rPr>
                 <w:rStyle w:val="Hiperhivatkozs"/>
@@ -494,7 +494,7 @@
                 <w:noProof/>
                 <w:webHidden/>
               </w:rPr>
-              <w:instrText xml:space="preserve"> PAGEREF _Toc225437702 \h </w:instrText>
+              <w:instrText xml:space="preserve"> PAGEREF _Toc225478166 \h </w:instrText>
             </w:r>
             <w:r>
               <w:rPr>
@@ -540,7 +540,7 @@
               <w14:ligatures w14:val="standardContextual"/>
             </w:rPr>
           </w:pPr>
-          <w:hyperlink w:anchor="_Toc225437703" w:history="1">
+          <w:hyperlink w:anchor="_Toc225478167" w:history="1">
             <w:r>
               <w:rPr>
                 <w:rStyle w:val="Hiperhivatkozs"/>
@@ -567,7 +567,7 @@
                 <w:noProof/>
                 <w:webHidden/>
               </w:rPr>
-              <w:instrText xml:space="preserve"> PAGEREF _Toc225437703 \h </w:instrText>
+              <w:instrText xml:space="preserve"> PAGEREF _Toc225478167 \h </w:instrText>
             </w:r>
             <w:r>
               <w:rPr>
@@ -613,7 +613,7 @@
               <w14:ligatures w14:val="standardContextual"/>
             </w:rPr>
           </w:pPr>
-          <w:hyperlink w:anchor="_Toc225437704" w:history="1">
+          <w:hyperlink w:anchor="_Toc225478168" w:history="1">
             <w:r>
               <w:rPr>
                 <w:rStyle w:val="Hiperhivatkozs"/>
@@ -640,7 +640,7 @@
                 <w:noProof/>
                 <w:webHidden/>
               </w:rPr>
-              <w:instrText xml:space="preserve"> PAGEREF _Toc225437704 \h </w:instrText>
+              <w:instrText xml:space="preserve"> PAGEREF _Toc225478168 \h </w:instrText>
             </w:r>
             <w:r>
               <w:rPr>
@@ -686,7 +686,7 @@
               <w14:ligatures w14:val="standardContextual"/>
             </w:rPr>
           </w:pPr>
-          <w:hyperlink w:anchor="_Toc225437705" w:history="1">
+          <w:hyperlink w:anchor="_Toc225478169" w:history="1">
             <w:r>
               <w:rPr>
                 <w:rStyle w:val="Hiperhivatkozs"/>
@@ -713,7 +713,7 @@
                 <w:noProof/>
                 <w:webHidden/>
               </w:rPr>
-              <w:instrText xml:space="preserve"> PAGEREF _Toc225437705 \h </w:instrText>
+              <w:instrText xml:space="preserve"> PAGEREF _Toc225478169 \h </w:instrText>
             </w:r>
             <w:r>
               <w:rPr>
@@ -759,7 +759,7 @@
               <w14:ligatures w14:val="standardContextual"/>
             </w:rPr>
           </w:pPr>
-          <w:hyperlink w:anchor="_Toc225437706" w:history="1">
+          <w:hyperlink w:anchor="_Toc225478170" w:history="1">
             <w:r>
               <w:rPr>
                 <w:rStyle w:val="Hiperhivatkozs"/>
@@ -786,7 +786,7 @@
                 <w:noProof/>
                 <w:webHidden/>
               </w:rPr>
-              <w:instrText xml:space="preserve"> PAGEREF _Toc225437706 \h </w:instrText>
+              <w:instrText xml:space="preserve"> PAGEREF _Toc225478170 \h </w:instrText>
             </w:r>
             <w:r>
               <w:rPr>
@@ -832,7 +832,7 @@
               <w14:ligatures w14:val="standardContextual"/>
             </w:rPr>
           </w:pPr>
-          <w:hyperlink w:anchor="_Toc225437707" w:history="1">
+          <w:hyperlink w:anchor="_Toc225478171" w:history="1">
             <w:r>
               <w:rPr>
                 <w:rStyle w:val="Hiperhivatkozs"/>
@@ -859,7 +859,7 @@
                 <w:noProof/>
                 <w:webHidden/>
               </w:rPr>
-              <w:instrText xml:space="preserve"> PAGEREF _Toc225437707 \h </w:instrText>
+              <w:instrText xml:space="preserve"> PAGEREF _Toc225478171 \h </w:instrText>
             </w:r>
             <w:r>
               <w:rPr>
@@ -905,7 +905,7 @@
               <w14:ligatures w14:val="standardContextual"/>
             </w:rPr>
           </w:pPr>
-          <w:hyperlink w:anchor="_Toc225437708" w:history="1">
+          <w:hyperlink w:anchor="_Toc225478172" w:history="1">
             <w:r>
               <w:rPr>
                 <w:rStyle w:val="Hiperhivatkozs"/>
@@ -932,7 +932,7 @@
                 <w:noProof/>
                 <w:webHidden/>
               </w:rPr>
-              <w:instrText xml:space="preserve"> PAGEREF _Toc225437708 \h </w:instrText>
+              <w:instrText xml:space="preserve"> PAGEREF _Toc225478172 \h </w:instrText>
             </w:r>
             <w:r>
               <w:rPr>
@@ -978,7 +978,7 @@
               <w14:ligatures w14:val="standardContextual"/>
             </w:rPr>
           </w:pPr>
-          <w:hyperlink w:anchor="_Toc225437709" w:history="1">
+          <w:hyperlink w:anchor="_Toc225478173" w:history="1">
             <w:r>
               <w:rPr>
                 <w:rStyle w:val="Hiperhivatkozs"/>
@@ -1005,7 +1005,7 @@
                 <w:noProof/>
                 <w:webHidden/>
               </w:rPr>
-              <w:instrText xml:space="preserve"> PAGEREF _Toc225437709 \h </w:instrText>
+              <w:instrText xml:space="preserve"> PAGEREF _Toc225478173 \h </w:instrText>
             </w:r>
             <w:r>
               <w:rPr>
@@ -1051,7 +1051,7 @@
               <w14:ligatures w14:val="standardContextual"/>
             </w:rPr>
           </w:pPr>
-          <w:hyperlink w:anchor="_Toc225437710" w:history="1">
+          <w:hyperlink w:anchor="_Toc225478174" w:history="1">
             <w:r>
               <w:rPr>
                 <w:rStyle w:val="Hiperhivatkozs"/>
@@ -1078,7 +1078,7 @@
                 <w:noProof/>
                 <w:webHidden/>
               </w:rPr>
-              <w:instrText xml:space="preserve"> PAGEREF _Toc225437710 \h </w:instrText>
+              <w:instrText xml:space="preserve"> PAGEREF _Toc225478174 \h </w:instrText>
             </w:r>
             <w:r>
               <w:rPr>
@@ -1124,7 +1124,7 @@
               <w14:ligatures w14:val="standardContextual"/>
             </w:rPr>
           </w:pPr>
-          <w:hyperlink w:anchor="_Toc225437711" w:history="1">
+          <w:hyperlink w:anchor="_Toc225478175" w:history="1">
             <w:r>
               <w:rPr>
                 <w:rStyle w:val="Hiperhivatkozs"/>
@@ -1151,7 +1151,7 @@
                 <w:noProof/>
                 <w:webHidden/>
               </w:rPr>
-              <w:instrText xml:space="preserve"> PAGEREF _Toc225437711 \h </w:instrText>
+              <w:instrText xml:space="preserve"> PAGEREF _Toc225478175 \h </w:instrText>
             </w:r>
             <w:r>
               <w:rPr>
@@ -1197,7 +1197,7 @@
               <w14:ligatures w14:val="standardContextual"/>
             </w:rPr>
           </w:pPr>
-          <w:hyperlink w:anchor="_Toc225437712" w:history="1">
+          <w:hyperlink w:anchor="_Toc225478176" w:history="1">
             <w:r>
               <w:rPr>
                 <w:rStyle w:val="Hiperhivatkozs"/>
@@ -1224,7 +1224,7 @@
                 <w:noProof/>
                 <w:webHidden/>
               </w:rPr>
-              <w:instrText xml:space="preserve"> PAGEREF _Toc225437712 \h </w:instrText>
+              <w:instrText xml:space="preserve"> PAGEREF _Toc225478176 \h </w:instrText>
             </w:r>
             <w:r>
               <w:rPr>
@@ -1270,7 +1270,7 @@
               <w14:ligatures w14:val="standardContextual"/>
             </w:rPr>
           </w:pPr>
-          <w:hyperlink w:anchor="_Toc225437713" w:history="1">
+          <w:hyperlink w:anchor="_Toc225478177" w:history="1">
             <w:r>
               <w:rPr>
                 <w:rStyle w:val="Hiperhivatkozs"/>
@@ -1297,7 +1297,7 @@
                 <w:noProof/>
                 <w:webHidden/>
               </w:rPr>
-              <w:instrText xml:space="preserve"> PAGEREF _Toc225437713 \h </w:instrText>
+              <w:instrText xml:space="preserve"> PAGEREF _Toc225478177 \h </w:instrText>
             </w:r>
             <w:r>
               <w:rPr>
@@ -1343,7 +1343,7 @@
               <w14:ligatures w14:val="standardContextual"/>
             </w:rPr>
           </w:pPr>
-          <w:hyperlink w:anchor="_Toc225437714" w:history="1">
+          <w:hyperlink w:anchor="_Toc225478178" w:history="1">
             <w:r>
               <w:rPr>
                 <w:rStyle w:val="Hiperhivatkozs"/>
@@ -1370,7 +1370,7 @@
                 <w:noProof/>
                 <w:webHidden/>
               </w:rPr>
-              <w:instrText xml:space="preserve"> PAGEREF _Toc225437714 \h </w:instrText>
+              <w:instrText xml:space="preserve"> PAGEREF _Toc225478178 \h </w:instrText>
             </w:r>
             <w:r>
               <w:rPr>
@@ -1416,7 +1416,7 @@
               <w14:ligatures w14:val="standardContextual"/>
             </w:rPr>
           </w:pPr>
-          <w:hyperlink w:anchor="_Toc225437715" w:history="1">
+          <w:hyperlink w:anchor="_Toc225478179" w:history="1">
             <w:r>
               <w:rPr>
                 <w:rStyle w:val="Hiperhivatkozs"/>
@@ -1443,7 +1443,7 @@
                 <w:noProof/>
                 <w:webHidden/>
               </w:rPr>
-              <w:instrText xml:space="preserve"> PAGEREF _Toc225437715 \h </w:instrText>
+              <w:instrText xml:space="preserve"> PAGEREF _Toc225478179 \h </w:instrText>
             </w:r>
             <w:r>
               <w:rPr>
@@ -1489,7 +1489,7 @@
               <w14:ligatures w14:val="standardContextual"/>
             </w:rPr>
           </w:pPr>
-          <w:hyperlink w:anchor="_Toc225437716" w:history="1">
+          <w:hyperlink w:anchor="_Toc225478180" w:history="1">
             <w:r>
               <w:rPr>
                 <w:rStyle w:val="Hiperhivatkozs"/>
@@ -1516,7 +1516,7 @@
                 <w:noProof/>
                 <w:webHidden/>
               </w:rPr>
-              <w:instrText xml:space="preserve"> PAGEREF _Toc225437716 \h </w:instrText>
+              <w:instrText xml:space="preserve"> PAGEREF _Toc225478180 \h </w:instrText>
             </w:r>
             <w:r>
               <w:rPr>
@@ -1562,7 +1562,7 @@
               <w14:ligatures w14:val="standardContextual"/>
             </w:rPr>
           </w:pPr>
-          <w:hyperlink w:anchor="_Toc225437717" w:history="1">
+          <w:hyperlink w:anchor="_Toc225478181" w:history="1">
             <w:r>
               <w:rPr>
                 <w:rStyle w:val="Hiperhivatkozs"/>
@@ -1589,7 +1589,7 @@
                 <w:noProof/>
                 <w:webHidden/>
               </w:rPr>
-              <w:instrText xml:space="preserve"> PAGEREF _Toc225437717 \h </w:instrText>
+              <w:instrText xml:space="preserve"> PAGEREF _Toc225478181 \h </w:instrText>
             </w:r>
             <w:r>
               <w:rPr>
@@ -1635,7 +1635,7 @@
               <w14:ligatures w14:val="standardContextual"/>
             </w:rPr>
           </w:pPr>
-          <w:hyperlink w:anchor="_Toc225437718" w:history="1">
+          <w:hyperlink w:anchor="_Toc225478182" w:history="1">
             <w:r>
               <w:rPr>
                 <w:rStyle w:val="Hiperhivatkozs"/>
@@ -1662,7 +1662,7 @@
                 <w:noProof/>
                 <w:webHidden/>
               </w:rPr>
-              <w:instrText xml:space="preserve"> PAGEREF _Toc225437718 \h </w:instrText>
+              <w:instrText xml:space="preserve"> PAGEREF _Toc225478182 \h </w:instrText>
             </w:r>
             <w:r>
               <w:rPr>
@@ -1708,7 +1708,7 @@
               <w14:ligatures w14:val="standardContextual"/>
             </w:rPr>
           </w:pPr>
-          <w:hyperlink w:anchor="_Toc225437719" w:history="1">
+          <w:hyperlink w:anchor="_Toc225478183" w:history="1">
             <w:r>
               <w:rPr>
                 <w:rStyle w:val="Hiperhivatkozs"/>
@@ -1735,7 +1735,7 @@
                 <w:noProof/>
                 <w:webHidden/>
               </w:rPr>
-              <w:instrText xml:space="preserve"> PAGEREF _Toc225437719 \h </w:instrText>
+              <w:instrText xml:space="preserve"> PAGEREF _Toc225478183 \h </w:instrText>
             </w:r>
             <w:r>
               <w:rPr>
@@ -1781,7 +1781,7 @@
               <w14:ligatures w14:val="standardContextual"/>
             </w:rPr>
           </w:pPr>
-          <w:hyperlink w:anchor="_Toc225437720" w:history="1">
+          <w:hyperlink w:anchor="_Toc225478184" w:history="1">
             <w:r>
               <w:rPr>
                 <w:rStyle w:val="Hiperhivatkozs"/>
@@ -1808,7 +1808,7 @@
                 <w:noProof/>
                 <w:webHidden/>
               </w:rPr>
-              <w:instrText xml:space="preserve"> PAGEREF _Toc225437720 \h </w:instrText>
+              <w:instrText xml:space="preserve"> PAGEREF _Toc225478184 \h </w:instrText>
             </w:r>
             <w:r>
               <w:rPr>
@@ -1829,6 +1829,152 @@
                 <w:webHidden/>
               </w:rPr>
               <w:t>22</w:t>
+            </w:r>
+            <w:r>
+              <w:rPr>
+                <w:noProof/>
+                <w:webHidden/>
+              </w:rPr>
+              <w:fldChar w:fldCharType="end"/>
+            </w:r>
+          </w:hyperlink>
+        </w:p>
+        <w:p>
+          <w:pPr>
+            <w:pStyle w:val="TJ3"/>
+            <w:tabs>
+              <w:tab w:val="right" w:leader="dot" w:pos="9062"/>
+            </w:tabs>
+            <w:rPr>
+              <w:rFonts w:cstheme="minorBidi"/>
+              <w:noProof/>
+              <w:kern w:val="2"/>
+              <w:szCs w:val="24"/>
+              <w:lang w:eastAsia="hu-HU"/>
+              <w14:ligatures w14:val="standardContextual"/>
+            </w:rPr>
+          </w:pPr>
+          <w:hyperlink w:anchor="_Toc225478185" w:history="1">
+            <w:r>
+              <w:rPr>
+                <w:rStyle w:val="Hiperhivatkozs"/>
+                <w:noProof/>
+              </w:rPr>
+              <w:t>6.2.7 RequestMessages tábla</w:t>
+            </w:r>
+            <w:r>
+              <w:rPr>
+                <w:noProof/>
+                <w:webHidden/>
+              </w:rPr>
+              <w:tab/>
+            </w:r>
+            <w:r>
+              <w:rPr>
+                <w:noProof/>
+                <w:webHidden/>
+              </w:rPr>
+              <w:fldChar w:fldCharType="begin"/>
+            </w:r>
+            <w:r>
+              <w:rPr>
+                <w:noProof/>
+                <w:webHidden/>
+              </w:rPr>
+              <w:instrText xml:space="preserve"> PAGEREF _Toc225478185 \h </w:instrText>
+            </w:r>
+            <w:r>
+              <w:rPr>
+                <w:noProof/>
+                <w:webHidden/>
+              </w:rPr>
+            </w:r>
+            <w:r>
+              <w:rPr>
+                <w:noProof/>
+                <w:webHidden/>
+              </w:rPr>
+              <w:fldChar w:fldCharType="separate"/>
+            </w:r>
+            <w:r>
+              <w:rPr>
+                <w:noProof/>
+                <w:webHidden/>
+              </w:rPr>
+              <w:t>22</w:t>
+            </w:r>
+            <w:r>
+              <w:rPr>
+                <w:noProof/>
+                <w:webHidden/>
+              </w:rPr>
+              <w:fldChar w:fldCharType="end"/>
+            </w:r>
+          </w:hyperlink>
+        </w:p>
+        <w:p>
+          <w:pPr>
+            <w:pStyle w:val="TJ3"/>
+            <w:tabs>
+              <w:tab w:val="right" w:leader="dot" w:pos="9062"/>
+            </w:tabs>
+            <w:rPr>
+              <w:rFonts w:cstheme="minorBidi"/>
+              <w:noProof/>
+              <w:kern w:val="2"/>
+              <w:szCs w:val="24"/>
+              <w:lang w:eastAsia="hu-HU"/>
+              <w14:ligatures w14:val="standardContextual"/>
+            </w:rPr>
+          </w:pPr>
+          <w:hyperlink w:anchor="_Toc225478186" w:history="1">
+            <w:r>
+              <w:rPr>
+                <w:rStyle w:val="Hiperhivatkozs"/>
+                <w:noProof/>
+              </w:rPr>
+              <w:t>6.2.8 PasswordResetTokens tábla</w:t>
+            </w:r>
+            <w:r>
+              <w:rPr>
+                <w:noProof/>
+                <w:webHidden/>
+              </w:rPr>
+              <w:tab/>
+            </w:r>
+            <w:r>
+              <w:rPr>
+                <w:noProof/>
+                <w:webHidden/>
+              </w:rPr>
+              <w:fldChar w:fldCharType="begin"/>
+            </w:r>
+            <w:r>
+              <w:rPr>
+                <w:noProof/>
+                <w:webHidden/>
+              </w:rPr>
+              <w:instrText xml:space="preserve"> PAGEREF _Toc225478186 \h </w:instrText>
+            </w:r>
+            <w:r>
+              <w:rPr>
+                <w:noProof/>
+                <w:webHidden/>
+              </w:rPr>
+            </w:r>
+            <w:r>
+              <w:rPr>
+                <w:noProof/>
+                <w:webHidden/>
+              </w:rPr>
+              <w:fldChar w:fldCharType="separate"/>
+            </w:r>
+            <w:r>
+              <w:rPr>
+                <w:noProof/>
+                <w:webHidden/>
+              </w:rPr>
+              <w:t>23</w:t>
             </w:r>
             <w:r>
               <w:rPr>
@@ -1854,7 +2000,7 @@
               <w14:ligatures w14:val="standardContextual"/>
             </w:rPr>
           </w:pPr>
-          <w:hyperlink w:anchor="_Toc225437721" w:history="1">
+          <w:hyperlink w:anchor="_Toc225478187" w:history="1">
             <w:r>
               <w:rPr>
                 <w:rStyle w:val="Hiperhivatkozs"/>
@@ -1881,7 +2027,7 @@
                 <w:noProof/>
                 <w:webHidden/>
               </w:rPr>
-              <w:instrText xml:space="preserve"> PAGEREF _Toc225437721 \h </w:instrText>
+              <w:instrText xml:space="preserve"> PAGEREF _Toc225478187 \h </w:instrText>
             </w:r>
             <w:r>
               <w:rPr>
@@ -1901,7 +2047,7 @@
                 <w:noProof/>
                 <w:webHidden/>
               </w:rPr>
-              <w:t>23</w:t>
+              <w:t>24</w:t>
             </w:r>
             <w:r>
               <w:rPr>
@@ -1927,7 +2073,7 @@
               <w14:ligatures w14:val="standardContextual"/>
             </w:rPr>
           </w:pPr>
-          <w:hyperlink w:anchor="_Toc225437722" w:history="1">
+          <w:hyperlink w:anchor="_Toc225478188" w:history="1">
             <w:r>
               <w:rPr>
                 <w:rStyle w:val="Hiperhivatkozs"/>
@@ -1954,7 +2100,7 @@
                 <w:noProof/>
                 <w:webHidden/>
               </w:rPr>
-              <w:instrText xml:space="preserve"> PAGEREF _Toc225437722 \h </w:instrText>
+              <w:instrText xml:space="preserve"> PAGEREF _Toc225478188 \h </w:instrText>
             </w:r>
             <w:r>
               <w:rPr>
@@ -1974,7 +2120,7 @@
                 <w:noProof/>
                 <w:webHidden/>
               </w:rPr>
-              <w:t>25</w:t>
+              <w:t>26</w:t>
             </w:r>
             <w:r>
               <w:rPr>
@@ -2000,7 +2146,7 @@
               <w14:ligatures w14:val="standardContextual"/>
             </w:rPr>
           </w:pPr>
-          <w:hyperlink w:anchor="_Toc225437723" w:history="1">
+          <w:hyperlink w:anchor="_Toc225478189" w:history="1">
             <w:r>
               <w:rPr>
                 <w:rStyle w:val="Hiperhivatkozs"/>
@@ -2027,7 +2173,7 @@
                 <w:noProof/>
                 <w:webHidden/>
               </w:rPr>
-              <w:instrText xml:space="preserve"> PAGEREF _Toc225437723 \h </w:instrText>
+              <w:instrText xml:space="preserve"> PAGEREF _Toc225478189 \h </w:instrText>
             </w:r>
             <w:r>
               <w:rPr>
@@ -2047,7 +2193,7 @@
                 <w:noProof/>
                 <w:webHidden/>
               </w:rPr>
-              <w:t>27</w:t>
+              <w:t>28</w:t>
             </w:r>
             <w:r>
               <w:rPr>
@@ -2073,7 +2219,7 @@
               <w14:ligatures w14:val="standardContextual"/>
             </w:rPr>
           </w:pPr>
-          <w:hyperlink w:anchor="_Toc225437724" w:history="1">
+          <w:hyperlink w:anchor="_Toc225478190" w:history="1">
             <w:r>
               <w:rPr>
                 <w:rStyle w:val="Hiperhivatkozs"/>
@@ -2100,7 +2246,7 @@
                 <w:noProof/>
                 <w:webHidden/>
               </w:rPr>
-              <w:instrText xml:space="preserve"> PAGEREF _Toc225437724 \h </w:instrText>
+              <w:instrText xml:space="preserve"> PAGEREF _Toc225478190 \h </w:instrText>
             </w:r>
             <w:r>
               <w:rPr>
@@ -2120,7 +2266,7 @@
                 <w:noProof/>
                 <w:webHidden/>
               </w:rPr>
-              <w:t>29</w:t>
+              <w:t>30</w:t>
             </w:r>
             <w:r>
               <w:rPr>
@@ -2146,7 +2292,7 @@
               <w14:ligatures w14:val="standardContextual"/>
             </w:rPr>
           </w:pPr>
-          <w:hyperlink w:anchor="_Toc225437725" w:history="1">
+          <w:hyperlink w:anchor="_Toc225478191" w:history="1">
             <w:r>
               <w:rPr>
                 <w:rStyle w:val="Hiperhivatkozs"/>
@@ -2173,7 +2319,7 @@
                 <w:noProof/>
                 <w:webHidden/>
               </w:rPr>
-              <w:instrText xml:space="preserve"> PAGEREF _Toc225437725 \h </w:instrText>
+              <w:instrText xml:space="preserve"> PAGEREF _Toc225478191 \h </w:instrText>
             </w:r>
             <w:r>
               <w:rPr>
@@ -2193,7 +2339,7 @@
                 <w:noProof/>
                 <w:webHidden/>
               </w:rPr>
-              <w:t>31</w:t>
+              <w:t>32</w:t>
             </w:r>
             <w:r>
               <w:rPr>
@@ -2219,7 +2365,7 @@
               <w14:ligatures w14:val="standardContextual"/>
             </w:rPr>
           </w:pPr>
-          <w:hyperlink w:anchor="_Toc225437726" w:history="1">
+          <w:hyperlink w:anchor="_Toc225478192" w:history="1">
             <w:r>
               <w:rPr>
                 <w:rStyle w:val="Hiperhivatkozs"/>
@@ -2246,7 +2392,7 @@
                 <w:noProof/>
                 <w:webHidden/>
               </w:rPr>
-              <w:instrText xml:space="preserve"> PAGEREF _Toc225437726 \h </w:instrText>
+              <w:instrText xml:space="preserve"> PAGEREF _Toc225478192 \h </w:instrText>
             </w:r>
             <w:r>
               <w:rPr>
@@ -2266,7 +2412,7 @@
                 <w:noProof/>
                 <w:webHidden/>
               </w:rPr>
-              <w:t>32</w:t>
+              <w:t>33</w:t>
             </w:r>
             <w:r>
               <w:rPr>
@@ -2292,7 +2438,7 @@
               <w14:ligatures w14:val="standardContextual"/>
             </w:rPr>
           </w:pPr>
-          <w:hyperlink w:anchor="_Toc225437727" w:history="1">
+          <w:hyperlink w:anchor="_Toc225478193" w:history="1">
             <w:r>
               <w:rPr>
                 <w:rStyle w:val="Hiperhivatkozs"/>
@@ -2319,7 +2465,7 @@
                 <w:noProof/>
                 <w:webHidden/>
               </w:rPr>
-              <w:instrText xml:space="preserve"> PAGEREF _Toc225437727 \h </w:instrText>
+              <w:instrText xml:space="preserve"> PAGEREF _Toc225478193 \h </w:instrText>
             </w:r>
             <w:r>
               <w:rPr>
@@ -2339,7 +2485,7 @@
                 <w:noProof/>
                 <w:webHidden/>
               </w:rPr>
-              <w:t>33</w:t>
+              <w:t>34</w:t>
             </w:r>
             <w:r>
               <w:rPr>
@@ -2365,7 +2511,7 @@
               <w14:ligatures w14:val="standardContextual"/>
             </w:rPr>
           </w:pPr>
-          <w:hyperlink w:anchor="_Toc225437728" w:history="1">
+          <w:hyperlink w:anchor="_Toc225478194" w:history="1">
             <w:r>
               <w:rPr>
                 <w:rStyle w:val="Hiperhivatkozs"/>
@@ -2392,7 +2538,7 @@
                 <w:noProof/>
                 <w:webHidden/>
               </w:rPr>
-              <w:instrText xml:space="preserve"> PAGEREF _Toc225437728 \h </w:instrText>
+              <w:instrText xml:space="preserve"> PAGEREF _Toc225478194 \h </w:instrText>
             </w:r>
             <w:r>
               <w:rPr>
@@ -2412,7 +2558,7 @@
                 <w:noProof/>
                 <w:webHidden/>
               </w:rPr>
-              <w:t>34</w:t>
+              <w:t>35</w:t>
             </w:r>
             <w:r>
               <w:rPr>
@@ -2438,7 +2584,7 @@
               <w14:ligatures w14:val="standardContextual"/>
             </w:rPr>
           </w:pPr>
-          <w:hyperlink w:anchor="_Toc225437729" w:history="1">
+          <w:hyperlink w:anchor="_Toc225478195" w:history="1">
             <w:r>
               <w:rPr>
                 <w:rStyle w:val="Hiperhivatkozs"/>
@@ -2465,7 +2611,7 @@
                 <w:noProof/>
                 <w:webHidden/>
               </w:rPr>
-              <w:instrText xml:space="preserve"> PAGEREF _Toc225437729 \h </w:instrText>
+              <w:instrText xml:space="preserve"> PAGEREF _Toc225478195 \h </w:instrText>
             </w:r>
             <w:r>
               <w:rPr>
@@ -2485,7 +2631,7 @@
                 <w:noProof/>
                 <w:webHidden/>
               </w:rPr>
-              <w:t>35</w:t>
+              <w:t>36</w:t>
             </w:r>
             <w:r>
               <w:rPr>
@@ -2511,7 +2657,7 @@
               <w14:ligatures w14:val="standardContextual"/>
             </w:rPr>
           </w:pPr>
-          <w:hyperlink w:anchor="_Toc225437730" w:history="1">
+          <w:hyperlink w:anchor="_Toc225478196" w:history="1">
             <w:r>
               <w:rPr>
                 <w:rStyle w:val="Hiperhivatkozs"/>
@@ -2538,7 +2684,7 @@
                 <w:noProof/>
                 <w:webHidden/>
               </w:rPr>
-              <w:instrText xml:space="preserve"> PAGEREF _Toc225437730 \h </w:instrText>
+              <w:instrText xml:space="preserve"> PAGEREF _Toc225478196 \h </w:instrText>
             </w:r>
             <w:r>
               <w:rPr>
@@ -2558,7 +2704,7 @@
                 <w:noProof/>
                 <w:webHidden/>
               </w:rPr>
-              <w:t>36</w:t>
+              <w:t>37</w:t>
             </w:r>
             <w:r>
               <w:rPr>
@@ -2584,7 +2730,7 @@
               <w14:ligatures w14:val="standardContextual"/>
             </w:rPr>
           </w:pPr>
-          <w:hyperlink w:anchor="_Toc225437731" w:history="1">
+          <w:hyperlink w:anchor="_Toc225478197" w:history="1">
             <w:r>
               <w:rPr>
                 <w:rStyle w:val="Hiperhivatkozs"/>
@@ -2611,7 +2757,7 @@
                 <w:noProof/>
                 <w:webHidden/>
               </w:rPr>
-              <w:instrText xml:space="preserve"> PAGEREF _Toc225437731 \h </w:instrText>
+              <w:instrText xml:space="preserve"> PAGEREF _Toc225478197 \h </w:instrText>
             </w:r>
             <w:r>
               <w:rPr>
@@ -2631,7 +2777,7 @@
                 <w:noProof/>
                 <w:webHidden/>
               </w:rPr>
-              <w:t>37</w:t>
+              <w:t>38</w:t>
             </w:r>
             <w:r>
               <w:rPr>
@@ -2657,7 +2803,7 @@
               <w14:ligatures w14:val="standardContextual"/>
             </w:rPr>
           </w:pPr>
-          <w:hyperlink w:anchor="_Toc225437732" w:history="1">
+          <w:hyperlink w:anchor="_Toc225478198" w:history="1">
             <w:r>
               <w:rPr>
                 <w:rStyle w:val="Hiperhivatkozs"/>
@@ -2684,7 +2830,7 @@
                 <w:noProof/>
                 <w:webHidden/>
               </w:rPr>
-              <w:instrText xml:space="preserve"> PAGEREF _Toc225437732 \h </w:instrText>
+              <w:instrText xml:space="preserve"> PAGEREF _Toc225478198 \h </w:instrText>
             </w:r>
             <w:r>
               <w:rPr>
@@ -2704,7 +2850,7 @@
                 <w:noProof/>
                 <w:webHidden/>
               </w:rPr>
-              <w:t>38</w:t>
+              <w:t>39</w:t>
             </w:r>
             <w:r>
               <w:rPr>
@@ -2730,7 +2876,7 @@
               <w14:ligatures w14:val="standardContextual"/>
             </w:rPr>
           </w:pPr>
-          <w:hyperlink w:anchor="_Toc225437733" w:history="1">
+          <w:hyperlink w:anchor="_Toc225478199" w:history="1">
             <w:r>
               <w:rPr>
                 <w:rStyle w:val="Hiperhivatkozs"/>
@@ -2757,7 +2903,7 @@
                 <w:noProof/>
                 <w:webHidden/>
               </w:rPr>
-              <w:instrText xml:space="preserve"> PAGEREF _Toc225437733 \h </w:instrText>
+              <w:instrText xml:space="preserve"> PAGEREF _Toc225478199 \h </w:instrText>
             </w:r>
             <w:r>
               <w:rPr>
@@ -2777,7 +2923,7 @@
                 <w:noProof/>
                 <w:webHidden/>
               </w:rPr>
-              <w:t>39</w:t>
+              <w:t>40</w:t>
             </w:r>
             <w:r>
               <w:rPr>
@@ -2803,7 +2949,7 @@
               <w14:ligatures w14:val="standardContextual"/>
             </w:rPr>
           </w:pPr>
-          <w:hyperlink w:anchor="_Toc225437734" w:history="1">
+          <w:hyperlink w:anchor="_Toc225478200" w:history="1">
             <w:r>
               <w:rPr>
                 <w:rStyle w:val="Hiperhivatkozs"/>
@@ -2830,7 +2976,7 @@
                 <w:noProof/>
                 <w:webHidden/>
               </w:rPr>
-              <w:instrText xml:space="preserve"> PAGEREF _Toc225437734 \h </w:instrText>
+              <w:instrText xml:space="preserve"> PAGEREF _Toc225478200 \h </w:instrText>
             </w:r>
             <w:r>
               <w:rPr>
@@ -2850,7 +2996,7 @@
                 <w:noProof/>
                 <w:webHidden/>
               </w:rPr>
-              <w:t>40</w:t>
+              <w:t>41</w:t>
             </w:r>
             <w:r>
               <w:rPr>
@@ -2876,7 +3022,7 @@
               <w14:ligatures w14:val="standardContextual"/>
             </w:rPr>
           </w:pPr>
-          <w:hyperlink w:anchor="_Toc225437735" w:history="1">
+          <w:hyperlink w:anchor="_Toc225478201" w:history="1">
             <w:r>
               <w:rPr>
                 <w:rStyle w:val="Hiperhivatkozs"/>
@@ -2903,7 +3049,7 @@
                 <w:noProof/>
                 <w:webHidden/>
               </w:rPr>
-              <w:instrText xml:space="preserve"> PAGEREF _Toc225437735 \h </w:instrText>
+              <w:instrText xml:space="preserve"> PAGEREF _Toc225478201 \h </w:instrText>
             </w:r>
             <w:r>
               <w:rPr>
@@ -2923,7 +3069,7 @@
                 <w:noProof/>
                 <w:webHidden/>
               </w:rPr>
-              <w:t>41</w:t>
+              <w:t>42</w:t>
             </w:r>
             <w:r>
               <w:rPr>
@@ -2949,7 +3095,7 @@
               <w14:ligatures w14:val="standardContextual"/>
             </w:rPr>
           </w:pPr>
-          <w:hyperlink w:anchor="_Toc225437736" w:history="1">
+          <w:hyperlink w:anchor="_Toc225478202" w:history="1">
             <w:r>
               <w:rPr>
                 <w:rStyle w:val="Hiperhivatkozs"/>
@@ -2976,7 +3122,7 @@
                 <w:noProof/>
                 <w:webHidden/>
               </w:rPr>
-              <w:instrText xml:space="preserve"> PAGEREF _Toc225437736 \h </w:instrText>
+              <w:instrText xml:space="preserve"> PAGEREF _Toc225478202 \h </w:instrText>
             </w:r>
             <w:r>
               <w:rPr>
@@ -2996,7 +3142,7 @@
                 <w:noProof/>
                 <w:webHidden/>
               </w:rPr>
-              <w:t>42</w:t>
+              <w:t>43</w:t>
             </w:r>
             <w:r>
               <w:rPr>
@@ -3022,7 +3168,7 @@
               <w14:ligatures w14:val="standardContextual"/>
             </w:rPr>
           </w:pPr>
-          <w:hyperlink w:anchor="_Toc225437737" w:history="1">
+          <w:hyperlink w:anchor="_Toc225478203" w:history="1">
             <w:r>
               <w:rPr>
                 <w:rStyle w:val="Hiperhivatkozs"/>
@@ -3049,7 +3195,7 @@
                 <w:noProof/>
                 <w:webHidden/>
               </w:rPr>
-              <w:instrText xml:space="preserve"> PAGEREF _Toc225437737 \h </w:instrText>
+              <w:instrText xml:space="preserve"> PAGEREF _Toc225478203 \h </w:instrText>
             </w:r>
             <w:r>
               <w:rPr>
@@ -3069,7 +3215,7 @@
                 <w:noProof/>
                 <w:webHidden/>
               </w:rPr>
-              <w:t>43</w:t>
+              <w:t>44</w:t>
             </w:r>
             <w:r>
               <w:rPr>
@@ -3095,7 +3241,7 @@
               <w14:ligatures w14:val="standardContextual"/>
             </w:rPr>
           </w:pPr>
-          <w:hyperlink w:anchor="_Toc225437738" w:history="1">
+          <w:hyperlink w:anchor="_Toc225478204" w:history="1">
             <w:r>
               <w:rPr>
                 <w:rStyle w:val="Hiperhivatkozs"/>
@@ -3122,7 +3268,7 @@
                 <w:noProof/>
                 <w:webHidden/>
               </w:rPr>
-              <w:instrText xml:space="preserve"> PAGEREF _Toc225437738 \h </w:instrText>
+              <w:instrText xml:space="preserve"> PAGEREF _Toc225478204 \h </w:instrText>
             </w:r>
             <w:r>
               <w:rPr>
@@ -3142,7 +3288,7 @@
                 <w:noProof/>
                 <w:webHidden/>
               </w:rPr>
-              <w:t>44</w:t>
+              <w:t>45</w:t>
             </w:r>
             <w:r>
               <w:rPr>
@@ -3168,7 +3314,7 @@
               <w14:ligatures w14:val="standardContextual"/>
             </w:rPr>
           </w:pPr>
-          <w:hyperlink w:anchor="_Toc225437739" w:history="1">
+          <w:hyperlink w:anchor="_Toc225478205" w:history="1">
             <w:r>
               <w:rPr>
                 <w:rStyle w:val="Hiperhivatkozs"/>
@@ -3195,7 +3341,7 @@
                 <w:noProof/>
                 <w:webHidden/>
               </w:rPr>
-              <w:instrText xml:space="preserve"> PAGEREF _Toc225437739 \h </w:instrText>
+              <w:instrText xml:space="preserve"> PAGEREF _Toc225478205 \h </w:instrText>
             </w:r>
             <w:r>
               <w:rPr>
@@ -3215,7 +3361,7 @@
                 <w:noProof/>
                 <w:webHidden/>
               </w:rPr>
-              <w:t>45</w:t>
+              <w:t>46</w:t>
             </w:r>
             <w:r>
               <w:rPr>
@@ -3241,7 +3387,7 @@
               <w14:ligatures w14:val="standardContextual"/>
             </w:rPr>
           </w:pPr>
-          <w:hyperlink w:anchor="_Toc225437740" w:history="1">
+          <w:hyperlink w:anchor="_Toc225478206" w:history="1">
             <w:r>
               <w:rPr>
                 <w:rStyle w:val="Hiperhivatkozs"/>
@@ -3268,7 +3414,7 @@
                 <w:noProof/>
                 <w:webHidden/>
               </w:rPr>
-              <w:instrText xml:space="preserve"> PAGEREF _Toc225437740 \h </w:instrText>
+              <w:instrText xml:space="preserve"> PAGEREF _Toc225478206 \h </w:instrText>
             </w:r>
             <w:r>
               <w:rPr>
@@ -3288,7 +3434,7 @@
                 <w:noProof/>
                 <w:webHidden/>
               </w:rPr>
-              <w:t>46</w:t>
+              <w:t>47</w:t>
             </w:r>
             <w:r>
               <w:rPr>
@@ -3314,7 +3460,7 @@
               <w14:ligatures w14:val="standardContextual"/>
             </w:rPr>
           </w:pPr>
-          <w:hyperlink w:anchor="_Toc225437741" w:history="1">
+          <w:hyperlink w:anchor="_Toc225478207" w:history="1">
             <w:r>
               <w:rPr>
                 <w:rStyle w:val="Hiperhivatkozs"/>
@@ -3341,7 +3487,7 @@
                 <w:noProof/>
                 <w:webHidden/>
               </w:rPr>
-              <w:instrText xml:space="preserve"> PAGEREF _Toc225437741 \h </w:instrText>
+              <w:instrText xml:space="preserve"> PAGEREF _Toc225478207 \h </w:instrText>
             </w:r>
             <w:r>
               <w:rPr>
@@ -3361,7 +3507,7 @@
                 <w:noProof/>
                 <w:webHidden/>
               </w:rPr>
-              <w:t>48</w:t>
+              <w:t>49</w:t>
             </w:r>
             <w:r>
               <w:rPr>
@@ -3387,7 +3533,7 @@
               <w14:ligatures w14:val="standardContextual"/>
             </w:rPr>
           </w:pPr>
-          <w:hyperlink w:anchor="_Toc225437742" w:history="1">
+          <w:hyperlink w:anchor="_Toc225478208" w:history="1">
             <w:r>
               <w:rPr>
                 <w:rStyle w:val="Hiperhivatkozs"/>
@@ -3414,7 +3560,7 @@
                 <w:noProof/>
                 <w:webHidden/>
               </w:rPr>
-              <w:instrText xml:space="preserve"> PAGEREF _Toc225437742 \h </w:instrText>
+              <w:instrText xml:space="preserve"> PAGEREF _Toc225478208 \h </w:instrText>
             </w:r>
             <w:r>
               <w:rPr>
@@ -3434,7 +3580,7 @@
                 <w:noProof/>
                 <w:webHidden/>
               </w:rPr>
-              <w:t>49</w:t>
+              <w:t>50</w:t>
             </w:r>
             <w:r>
               <w:rPr>
@@ -3460,7 +3606,7 @@
               <w14:ligatures w14:val="standardContextual"/>
             </w:rPr>
           </w:pPr>
-          <w:hyperlink w:anchor="_Toc225437743" w:history="1">
+          <w:hyperlink w:anchor="_Toc225478209" w:history="1">
             <w:r>
               <w:rPr>
                 <w:rStyle w:val="Hiperhivatkozs"/>
@@ -3487,7 +3633,7 @@
                 <w:noProof/>
                 <w:webHidden/>
               </w:rPr>
-              <w:instrText xml:space="preserve"> PAGEREF _Toc225437743 \h </w:instrText>
+              <w:instrText xml:space="preserve"> PAGEREF _Toc225478209 \h </w:instrText>
             </w:r>
             <w:r>
               <w:rPr>
@@ -3507,7 +3653,7 @@
                 <w:noProof/>
                 <w:webHidden/>
               </w:rPr>
-              <w:t>50</w:t>
+              <w:t>51</w:t>
             </w:r>
             <w:r>
               <w:rPr>
@@ -3533,7 +3679,7 @@
               <w14:ligatures w14:val="standardContextual"/>
             </w:rPr>
           </w:pPr>
-          <w:hyperlink w:anchor="_Toc225437744" w:history="1">
+          <w:hyperlink w:anchor="_Toc225478210" w:history="1">
             <w:r>
               <w:rPr>
                 <w:rStyle w:val="Hiperhivatkozs"/>
@@ -3560,7 +3706,7 @@
                 <w:noProof/>
                 <w:webHidden/>
               </w:rPr>
-              <w:instrText xml:space="preserve"> PAGEREF _Toc225437744 \h </w:instrText>
+              <w:instrText xml:space="preserve"> PAGEREF _Toc225478210 \h </w:instrText>
             </w:r>
             <w:r>
               <w:rPr>
@@ -3580,7 +3726,7 @@
                 <w:noProof/>
                 <w:webHidden/>
               </w:rPr>
-              <w:t>50</w:t>
+              <w:t>51</w:t>
             </w:r>
             <w:r>
               <w:rPr>
@@ -3606,7 +3752,7 @@
               <w14:ligatures w14:val="standardContextual"/>
             </w:rPr>
           </w:pPr>
-          <w:hyperlink w:anchor="_Toc225437745" w:history="1">
+          <w:hyperlink w:anchor="_Toc225478211" w:history="1">
             <w:r>
               <w:rPr>
                 <w:rStyle w:val="Hiperhivatkozs"/>
@@ -3633,7 +3779,7 @@
                 <w:noProof/>
                 <w:webHidden/>
               </w:rPr>
-              <w:instrText xml:space="preserve"> PAGEREF _Toc225437745 \h </w:instrText>
+              <w:instrText xml:space="preserve"> PAGEREF _Toc225478211 \h </w:instrText>
             </w:r>
             <w:r>
               <w:rPr>
@@ -3653,7 +3799,7 @@
                 <w:noProof/>
                 <w:webHidden/>
               </w:rPr>
-              <w:t>50</w:t>
+              <w:t>51</w:t>
             </w:r>
             <w:r>
               <w:rPr>
@@ -3679,7 +3825,7 @@
               <w14:ligatures w14:val="standardContextual"/>
             </w:rPr>
           </w:pPr>
-          <w:hyperlink w:anchor="_Toc225437746" w:history="1">
+          <w:hyperlink w:anchor="_Toc225478212" w:history="1">
             <w:r>
               <w:rPr>
                 <w:rStyle w:val="Hiperhivatkozs"/>
@@ -3706,7 +3852,7 @@
                 <w:noProof/>
                 <w:webHidden/>
               </w:rPr>
-              <w:instrText xml:space="preserve"> PAGEREF _Toc225437746 \h </w:instrText>
+              <w:instrText xml:space="preserve"> PAGEREF _Toc225478212 \h </w:instrText>
             </w:r>
             <w:r>
               <w:rPr>
@@ -3726,7 +3872,7 @@
                 <w:noProof/>
                 <w:webHidden/>
               </w:rPr>
-              <w:t>51</w:t>
+              <w:t>52</w:t>
             </w:r>
             <w:r>
               <w:rPr>
@@ -3752,7 +3898,7 @@
               <w14:ligatures w14:val="standardContextual"/>
             </w:rPr>
           </w:pPr>
-          <w:hyperlink w:anchor="_Toc225437747" w:history="1">
+          <w:hyperlink w:anchor="_Toc225478213" w:history="1">
             <w:r>
               <w:rPr>
                 <w:rStyle w:val="Hiperhivatkozs"/>
@@ -3788,7 +3934,7 @@
                 <w:noProof/>
                 <w:webHidden/>
               </w:rPr>
-              <w:instrText xml:space="preserve"> PAGEREF _Toc225437747 \h </w:instrText>
+              <w:instrText xml:space="preserve"> PAGEREF _Toc225478213 \h </w:instrText>
             </w:r>
             <w:r>
               <w:rPr>
@@ -3808,7 +3954,7 @@
                 <w:noProof/>
                 <w:webHidden/>
               </w:rPr>
-              <w:t>51</w:t>
+              <w:t>52</w:t>
             </w:r>
             <w:r>
               <w:rPr>
@@ -3834,7 +3980,7 @@
               <w14:ligatures w14:val="standardContextual"/>
             </w:rPr>
           </w:pPr>
-          <w:hyperlink w:anchor="_Toc225437748" w:history="1">
+          <w:hyperlink w:anchor="_Toc225478214" w:history="1">
             <w:r>
               <w:rPr>
                 <w:rStyle w:val="Hiperhivatkozs"/>
@@ -3870,7 +4016,7 @@
                 <w:noProof/>
                 <w:webHidden/>
               </w:rPr>
-              <w:instrText xml:space="preserve"> PAGEREF _Toc225437748 \h </w:instrText>
+              <w:instrText xml:space="preserve"> PAGEREF _Toc225478214 \h </w:instrText>
             </w:r>
             <w:r>
               <w:rPr>
@@ -3890,7 +4036,7 @@
                 <w:noProof/>
                 <w:webHidden/>
               </w:rPr>
-              <w:t>52</w:t>
+              <w:t>53</w:t>
             </w:r>
             <w:r>
               <w:rPr>
@@ -3916,7 +4062,7 @@
               <w14:ligatures w14:val="standardContextual"/>
             </w:rPr>
           </w:pPr>
-          <w:hyperlink w:anchor="_Toc225437749" w:history="1">
+          <w:hyperlink w:anchor="_Toc225478215" w:history="1">
             <w:r>
               <w:rPr>
                 <w:rStyle w:val="Hiperhivatkozs"/>
@@ -3943,7 +4089,7 @@
                 <w:noProof/>
                 <w:webHidden/>
               </w:rPr>
-              <w:instrText xml:space="preserve"> PAGEREF _Toc225437749 \h </w:instrText>
+              <w:instrText xml:space="preserve"> PAGEREF _Toc225478215 \h </w:instrText>
             </w:r>
             <w:r>
               <w:rPr>
@@ -3963,7 +4109,7 @@
                 <w:noProof/>
                 <w:webHidden/>
               </w:rPr>
-              <w:t>53</w:t>
+              <w:t>54</w:t>
             </w:r>
             <w:r>
               <w:rPr>
@@ -3989,7 +4135,7 @@
               <w14:ligatures w14:val="standardContextual"/>
             </w:rPr>
           </w:pPr>
-          <w:hyperlink w:anchor="_Toc225437750" w:history="1">
+          <w:hyperlink w:anchor="_Toc225478216" w:history="1">
             <w:r>
               <w:rPr>
                 <w:rStyle w:val="Hiperhivatkozs"/>
@@ -4016,7 +4162,7 @@
                 <w:noProof/>
                 <w:webHidden/>
               </w:rPr>
-              <w:instrText xml:space="preserve"> PAGEREF _Toc225437750 \h </w:instrText>
+              <w:instrText xml:space="preserve"> PAGEREF _Toc225478216 \h </w:instrText>
             </w:r>
             <w:r>
               <w:rPr>
@@ -4036,7 +4182,7 @@
                 <w:noProof/>
                 <w:webHidden/>
               </w:rPr>
-              <w:t>54</w:t>
+              <w:t>55</w:t>
             </w:r>
             <w:r>
               <w:rPr>
@@ -4062,7 +4208,7 @@
               <w14:ligatures w14:val="standardContextual"/>
             </w:rPr>
           </w:pPr>
-          <w:hyperlink w:anchor="_Toc225437751" w:history="1">
+          <w:hyperlink w:anchor="_Toc225478217" w:history="1">
             <w:r>
               <w:rPr>
                 <w:rStyle w:val="Hiperhivatkozs"/>
@@ -4089,7 +4235,7 @@
                 <w:noProof/>
                 <w:webHidden/>
               </w:rPr>
-              <w:instrText xml:space="preserve"> PAGEREF _Toc225437751 \h </w:instrText>
+              <w:instrText xml:space="preserve"> PAGEREF _Toc225478217 \h </w:instrText>
             </w:r>
             <w:r>
               <w:rPr>
@@ -4109,7 +4255,7 @@
                 <w:noProof/>
                 <w:webHidden/>
               </w:rPr>
-              <w:t>55</w:t>
+              <w:t>56</w:t>
             </w:r>
             <w:r>
               <w:rPr>
@@ -4135,7 +4281,7 @@
               <w14:ligatures w14:val="standardContextual"/>
             </w:rPr>
           </w:pPr>
-          <w:hyperlink w:anchor="_Toc225437752" w:history="1">
+          <w:hyperlink w:anchor="_Toc225478218" w:history="1">
             <w:r>
               <w:rPr>
                 <w:rStyle w:val="Hiperhivatkozs"/>
@@ -4162,7 +4308,7 @@
                 <w:noProof/>
                 <w:webHidden/>
               </w:rPr>
-              <w:instrText xml:space="preserve"> PAGEREF _Toc225437752 \h </w:instrText>
+              <w:instrText xml:space="preserve"> PAGEREF _Toc225478218 \h </w:instrText>
             </w:r>
             <w:r>
               <w:rPr>
@@ -4182,7 +4328,7 @@
                 <w:noProof/>
                 <w:webHidden/>
               </w:rPr>
-              <w:t>56</w:t>
+              <w:t>57</w:t>
             </w:r>
             <w:r>
               <w:rPr>
@@ -4208,7 +4354,7 @@
               <w14:ligatures w14:val="standardContextual"/>
             </w:rPr>
           </w:pPr>
-          <w:hyperlink w:anchor="_Toc225437753" w:history="1">
+          <w:hyperlink w:anchor="_Toc225478219" w:history="1">
             <w:r>
               <w:rPr>
                 <w:rStyle w:val="Hiperhivatkozs"/>
@@ -4235,7 +4381,7 @@
                 <w:noProof/>
                 <w:webHidden/>
               </w:rPr>
-              <w:instrText xml:space="preserve"> PAGEREF _Toc225437753 \h </w:instrText>
+              <w:instrText xml:space="preserve"> PAGEREF _Toc225478219 \h </w:instrText>
             </w:r>
             <w:r>
               <w:rPr>
@@ -4255,7 +4401,7 @@
                 <w:noProof/>
                 <w:webHidden/>
               </w:rPr>
-              <w:t>57</w:t>
+              <w:t>58</w:t>
             </w:r>
             <w:r>
               <w:rPr>
@@ -4289,7 +4435,7 @@
       <w:pPr>
         <w:pStyle w:val="Cmsor1"/>
       </w:pPr>
-      <w:bookmarkStart w:id="0" w:name="_Toc225437700"/>
+      <w:bookmarkStart w:id="0" w:name="_Toc225478164"/>
       <w:r>
         <w:lastRenderedPageBreak/>
         <w:t>1. BEVEZETÉS</w:t>
@@ -4338,7 +4484,7 @@
       <w:pPr>
         <w:pStyle w:val="Cmsor2"/>
       </w:pPr>
-      <w:bookmarkStart w:id="1" w:name="_Toc225437701"/>
+      <w:bookmarkStart w:id="1" w:name="_Toc225478165"/>
       <w:r>
         <w:lastRenderedPageBreak/>
         <w:t>1.2 TÉMAVÁLASZTÁS INDOKLÁSA</w:t>
@@ -4500,7 +4646,7 @@
       <w:pPr>
         <w:pStyle w:val="Cmsor2"/>
       </w:pPr>
-      <w:bookmarkStart w:id="2" w:name="_Toc225437702"/>
+      <w:bookmarkStart w:id="2" w:name="_Toc225478166"/>
       <w:r>
         <w:lastRenderedPageBreak/>
         <w:t>1</w:t>
@@ -4619,7 +4765,7 @@
           <w:noProof/>
         </w:rPr>
         <w:drawing>
-          <wp:anchor distT="0" distB="0" distL="114300" distR="114300" simplePos="0" relativeHeight="251675648" behindDoc="0" locked="0" layoutInCell="1" allowOverlap="1" wp14:anchorId="4A622A8E" wp14:editId="70AF321D">
+          <wp:anchor distT="0" distB="0" distL="114300" distR="114300" simplePos="0" relativeHeight="251675648" behindDoc="0" locked="0" layoutInCell="1" allowOverlap="1" wp14:anchorId="4A622A8E" wp14:editId="51AD3547">
             <wp:simplePos x="0" y="0"/>
             <wp:positionH relativeFrom="margin">
               <wp:posOffset>413468</wp:posOffset>
@@ -5592,7 +5738,7 @@
       <w:pPr>
         <w:pStyle w:val="Cmsor1"/>
       </w:pPr>
-      <w:bookmarkStart w:id="3" w:name="_Toc225437703"/>
+      <w:bookmarkStart w:id="3" w:name="_Toc225478167"/>
       <w:r>
         <w:lastRenderedPageBreak/>
         <w:t>2. A PROJEKT CÉLJA</w:t>
@@ -5777,7 +5923,7 @@
       <w:pPr>
         <w:pStyle w:val="Cmsor1"/>
       </w:pPr>
-      <w:bookmarkStart w:id="4" w:name="_Toc225437704"/>
+      <w:bookmarkStart w:id="4" w:name="_Toc225478168"/>
       <w:r>
         <w:lastRenderedPageBreak/>
         <w:t>3. AZ ALKALMAZÁS BEMUTATÁSA</w:t>
@@ -5970,7 +6116,7 @@
       <w:pPr>
         <w:pStyle w:val="Cmsor2"/>
       </w:pPr>
-      <w:bookmarkStart w:id="5" w:name="_Toc225437705"/>
+      <w:bookmarkStart w:id="5" w:name="_Toc225478169"/>
       <w:r>
         <w:t>3.1 FELHASZNÁLÓI MŰKÖDÉS (AUTÓS OLDAL)</w:t>
       </w:r>
@@ -6126,7 +6272,7 @@
       <w:pPr>
         <w:pStyle w:val="Cmsor2"/>
       </w:pPr>
-      <w:bookmarkStart w:id="6" w:name="_Toc225437706"/>
+      <w:bookmarkStart w:id="6" w:name="_Toc225478170"/>
       <w:r>
         <w:lastRenderedPageBreak/>
         <w:t>3.2 SZOLGÁLTATÓI MŰKÖDÉS (AUTÓMENTŐ OLDAL)</w:t>
@@ -6324,7 +6470,7 @@
       <w:pPr>
         <w:pStyle w:val="Cmsor2"/>
       </w:pPr>
-      <w:bookmarkStart w:id="7" w:name="_Toc225437707"/>
+      <w:bookmarkStart w:id="7" w:name="_Toc225478171"/>
       <w:r>
         <w:lastRenderedPageBreak/>
         <w:t>3.3 ADMINISZTRÁCIÓ ÉS TÁMOGATÁS</w:t>
@@ -6457,7 +6603,7 @@
       <w:pPr>
         <w:pStyle w:val="Cmsor1"/>
       </w:pPr>
-      <w:bookmarkStart w:id="8" w:name="_Toc225437708"/>
+      <w:bookmarkStart w:id="8" w:name="_Toc225478172"/>
       <w:r>
         <w:lastRenderedPageBreak/>
         <w:t>4. AZ ALKALMAZÁS MŰKÖDÉSE</w:t>
@@ -6564,7 +6710,7 @@
       <w:pPr>
         <w:pStyle w:val="Cmsor2"/>
       </w:pPr>
-      <w:bookmarkStart w:id="9" w:name="_Toc225437709"/>
+      <w:bookmarkStart w:id="9" w:name="_Toc225478173"/>
       <w:r>
         <w:lastRenderedPageBreak/>
         <w:t>4.1 AUTÓMENTŐK OLDALA</w:t>
@@ -6665,7 +6811,7 @@
       <w:pPr>
         <w:pStyle w:val="Cmsor2"/>
       </w:pPr>
-      <w:bookmarkStart w:id="10" w:name="_Toc225437710"/>
+      <w:bookmarkStart w:id="10" w:name="_Toc225478174"/>
       <w:r>
         <w:lastRenderedPageBreak/>
         <w:t>4.2 FELHASZNÁLÓK OLDALA</w:t>
@@ -6787,7 +6933,7 @@
       <w:pPr>
         <w:pStyle w:val="Cmsor1"/>
       </w:pPr>
-      <w:bookmarkStart w:id="11" w:name="_Toc225437711"/>
+      <w:bookmarkStart w:id="11" w:name="_Toc225478175"/>
       <w:r>
         <w:lastRenderedPageBreak/>
         <w:t>5. FELHASZNÁLT TECHNOLÓGIÁK</w:t>
@@ -6989,7 +7135,7 @@
       <w:pPr>
         <w:pStyle w:val="Cmsor1"/>
       </w:pPr>
-      <w:bookmarkStart w:id="12" w:name="_Toc225437712"/>
+      <w:bookmarkStart w:id="12" w:name="_Toc225478176"/>
       <w:r>
         <w:lastRenderedPageBreak/>
         <w:t>6. ADATBÁZIS FELÉPÍTÉSE</w:t>
@@ -7083,7 +7229,7 @@
       <w:pPr>
         <w:pStyle w:val="Cmsor2"/>
       </w:pPr>
-      <w:bookmarkStart w:id="13" w:name="_Toc225437713"/>
+      <w:bookmarkStart w:id="13" w:name="_Toc225478177"/>
       <w:r>
         <w:lastRenderedPageBreak/>
         <w:t xml:space="preserve">6.2 </w:t>
@@ -7154,7 +7300,7 @@
           </wp:anchor>
         </w:drawing>
       </w:r>
-      <w:bookmarkStart w:id="14" w:name="_Toc225437714"/>
+      <w:bookmarkStart w:id="14" w:name="_Toc225478178"/>
       <w:r>
         <w:rPr>
           <w:rStyle w:val="Cmsor3Char"/>
@@ -7350,7 +7496,7 @@
           </wp:anchor>
         </w:drawing>
       </w:r>
-      <w:bookmarkStart w:id="15" w:name="_Toc225437715"/>
+      <w:bookmarkStart w:id="15" w:name="_Toc225478179"/>
       <w:r>
         <w:rPr>
           <w:rStyle w:val="Cmsor3Char"/>
@@ -7611,7 +7757,7 @@
       <w:pPr>
         <w:pStyle w:val="Cmsor3"/>
       </w:pPr>
-      <w:bookmarkStart w:id="16" w:name="_Toc225437716"/>
+      <w:bookmarkStart w:id="16" w:name="_Toc225478180"/>
       <w:r>
         <w:t xml:space="preserve">6.2.3 </w:t>
       </w:r>
@@ -7833,7 +7979,7 @@
         <w:pStyle w:val="Cmsor3"/>
         <w:spacing w:before="360" w:after="0"/>
       </w:pPr>
-      <w:bookmarkStart w:id="17" w:name="_Toc225437717"/>
+      <w:bookmarkStart w:id="17" w:name="_Toc225478181"/>
       <w:r>
         <w:lastRenderedPageBreak/>
         <w:t xml:space="preserve">6.2.4 </w:t>
@@ -8077,7 +8223,7 @@
       <w:pPr>
         <w:pStyle w:val="Cmsor3"/>
       </w:pPr>
-      <w:bookmarkStart w:id="18" w:name="_Toc225437718"/>
+      <w:bookmarkStart w:id="18" w:name="_Toc225478182"/>
       <w:r>
         <w:lastRenderedPageBreak/>
         <w:t xml:space="preserve">6.2.4 </w:t>
@@ -8323,7 +8469,7 @@
       <w:pPr>
         <w:pStyle w:val="Cmsor3"/>
       </w:pPr>
-      <w:bookmarkStart w:id="19" w:name="_Toc225437719"/>
+      <w:bookmarkStart w:id="19" w:name="_Toc225478183"/>
       <w:r>
         <w:t xml:space="preserve">6.2.5 </w:t>
       </w:r>
@@ -8536,7 +8682,7 @@
       <w:pPr>
         <w:pStyle w:val="Cmsor3"/>
       </w:pPr>
-      <w:bookmarkStart w:id="20" w:name="_Toc225437720"/>
+      <w:bookmarkStart w:id="20" w:name="_Toc225478184"/>
       <w:r>
         <w:lastRenderedPageBreak/>
         <w:t xml:space="preserve">6.2.6 </w:t>
@@ -8719,8 +8865,9 @@
       <w:r>
         <w:t> pedig az utolsó aktivitás idejét rögzíti.</w:t>
       </w:r>
-    </w:p>
-    <w:p>
+      <w:r>
+        <w:t xml:space="preserve"> </w:t>
+      </w:r>
       <w:r>
         <w:t xml:space="preserve">Ez a tábla a </w:t>
       </w:r>
@@ -8731,6 +8878,459 @@
       <w:proofErr w:type="spellEnd"/>
       <w:r>
         <w:t xml:space="preserve"> modul központi eleme, mert erre épül az ügyek nyilvántartása, a beszélgetések listázása és az adminisztratív ügykezelés teljes folyamata.</w:t>
+      </w:r>
+    </w:p>
+    <w:p>
+      <w:pPr>
+        <w:pStyle w:val="Cmsor3"/>
+      </w:pPr>
+      <w:bookmarkStart w:id="21" w:name="_Toc225478185"/>
+      <w:r>
+        <w:t xml:space="preserve">6.2.7 </w:t>
+      </w:r>
+      <w:proofErr w:type="spellStart"/>
+      <w:r>
+        <w:t>RequestMessages</w:t>
+      </w:r>
+      <w:proofErr w:type="spellEnd"/>
+      <w:r>
+        <w:t> </w:t>
+      </w:r>
+      <w:r>
+        <w:t>tábla</w:t>
+      </w:r>
+      <w:bookmarkEnd w:id="21"/>
+    </w:p>
+    <w:p>
+      <w:r>
+        <w:rPr>
+          <w:noProof/>
+          <w14:ligatures w14:val="standardContextual"/>
+        </w:rPr>
+        <w:drawing>
+          <wp:anchor distT="0" distB="0" distL="114300" distR="114300" simplePos="0" relativeHeight="251688960" behindDoc="0" locked="0" layoutInCell="1" allowOverlap="1" wp14:anchorId="6C218B0C" wp14:editId="73FFB2C5">
+            <wp:simplePos x="0" y="0"/>
+            <wp:positionH relativeFrom="margin">
+              <wp:align>left</wp:align>
+            </wp:positionH>
+            <wp:positionV relativeFrom="paragraph">
+              <wp:posOffset>65709</wp:posOffset>
+            </wp:positionV>
+            <wp:extent cx="2113915" cy="1570990"/>
+            <wp:effectExtent l="0" t="0" r="635" b="0"/>
+            <wp:wrapSquare wrapText="bothSides"/>
+            <wp:docPr id="9" name="Kép 9"/>
+            <wp:cNvGraphicFramePr>
+              <a:graphicFrameLocks xmlns:a="http://schemas.openxmlformats.org/drawingml/2006/main" noChangeAspect="1"/>
+            </wp:cNvGraphicFramePr>
+            <a:graphic xmlns:a="http://schemas.openxmlformats.org/drawingml/2006/main">
+              <a:graphicData uri="http://schemas.openxmlformats.org/drawingml/2006/picture">
+                <pic:pic xmlns:pic="http://schemas.openxmlformats.org/drawingml/2006/picture">
+                  <pic:nvPicPr>
+                    <pic:cNvPr id="1" name=""/>
+                    <pic:cNvPicPr/>
+                  </pic:nvPicPr>
+                  <pic:blipFill>
+                    <a:blip r:embed="rId32">
+                      <a:extLst>
+                        <a:ext uri="{28A0092B-C50C-407E-A947-70E740481C1C}">
+                          <a14:useLocalDpi xmlns:a14="http://schemas.microsoft.com/office/drawing/2010/main" val="0"/>
+                        </a:ext>
+                      </a:extLst>
+                    </a:blip>
+                    <a:stretch>
+                      <a:fillRect/>
+                    </a:stretch>
+                  </pic:blipFill>
+                  <pic:spPr>
+                    <a:xfrm>
+                      <a:off x="0" y="0"/>
+                      <a:ext cx="2113915" cy="1570990"/>
+                    </a:xfrm>
+                    <a:prstGeom prst="rect">
+                      <a:avLst/>
+                    </a:prstGeom>
+                  </pic:spPr>
+                </pic:pic>
+              </a:graphicData>
+            </a:graphic>
+          </wp:anchor>
+        </w:drawing>
+      </w:r>
+      <w:r>
+        <w:t>Ebben a </w:t>
+      </w:r>
+      <w:proofErr w:type="spellStart"/>
+      <w:r>
+        <w:t>RequestMessages</w:t>
+      </w:r>
+      <w:proofErr w:type="spellEnd"/>
+      <w:r>
+        <w:t> táblában tároljuk a mentési kérelmekhez kapcsolódó chatüzeneteket.</w:t>
+      </w:r>
+      <w:r>
+        <w:br/>
+      </w:r>
+      <w:r>
+        <w:t xml:space="preserve"> </w:t>
+      </w:r>
+      <w:r>
+        <w:t>A tábla célja, hogy a felhasználó és a kijelölt autómentő közötti kommunikáció minden eleme naplózva, időrendben visszakereshetően legyen elmentve.</w:t>
+      </w:r>
+    </w:p>
+    <w:p>
+      <w:r>
+        <w:t>Az </w:t>
+      </w:r>
+      <w:proofErr w:type="spellStart"/>
+      <w:r>
+        <w:t>Id</w:t>
+      </w:r>
+      <w:proofErr w:type="spellEnd"/>
+      <w:r>
+        <w:t> mező az elsődleges kulcs, amely egyedileg azonosít minden üzenetet.</w:t>
+      </w:r>
+      <w:r>
+        <w:br/>
+        <w:t>A </w:t>
+      </w:r>
+      <w:proofErr w:type="spellStart"/>
+      <w:r>
+        <w:t>RequestId</w:t>
+      </w:r>
+      <w:proofErr w:type="spellEnd"/>
+      <w:r>
+        <w:t> idegen kulcs a </w:t>
+      </w:r>
+      <w:proofErr w:type="spellStart"/>
+      <w:r>
+        <w:t>ServiceRequests</w:t>
+      </w:r>
+      <w:proofErr w:type="spellEnd"/>
+      <w:r>
+        <w:t> táblára mutat, így egyértelműen meghatározható, hogy az üzenet melyik mentési ügyhöz tartozik.</w:t>
+      </w:r>
+      <w:r>
+        <w:br/>
+        <w:t>A </w:t>
+      </w:r>
+      <w:proofErr w:type="spellStart"/>
+      <w:r>
+        <w:t>SenderUserId</w:t>
+      </w:r>
+      <w:proofErr w:type="spellEnd"/>
+      <w:r>
+        <w:t> mező a küldő felhasználó azonosítóját tárolja (</w:t>
+      </w:r>
+      <w:proofErr w:type="spellStart"/>
+      <w:r>
+        <w:t>Users</w:t>
+      </w:r>
+      <w:proofErr w:type="spellEnd"/>
+      <w:r>
+        <w:t> tábla), ezért pontosan nyomon követhető, hogy az üzenetet a segítséget kérő felhasználó vagy a szolgáltató küldte.</w:t>
+      </w:r>
+    </w:p>
+    <w:p>
+      <w:r>
+        <w:t>A Body mező tartalmazza az üzenet szövegét, a </w:t>
+      </w:r>
+      <w:proofErr w:type="spellStart"/>
+      <w:r>
+        <w:t>CreatedAt</w:t>
+      </w:r>
+      <w:proofErr w:type="spellEnd"/>
+      <w:r>
+        <w:t> pedig az üzenet létrehozásának időpontját rögzíti.</w:t>
+      </w:r>
+      <w:r>
+        <w:br/>
+        <w:t>Ez lehetővé teszi, hogy a beszélgetések a felületen helyes időrendben jelenjenek meg, és vitás helyzetekben visszaellenőrizhetők legyenek.</w:t>
+      </w:r>
+    </w:p>
+    <w:p>
+      <w:r>
+        <w:t>A </w:t>
+      </w:r>
+      <w:proofErr w:type="spellStart"/>
+      <w:r>
+        <w:t>RequestMessages</w:t>
+      </w:r>
+      <w:proofErr w:type="spellEnd"/>
+      <w:r>
+        <w:t> tábla fontos része a mentési folyamatnak, mert ezen keresztül valósul meg a gyors, közvetlen és dokumentált kommunikáció az érintett felek között.</w:t>
+      </w:r>
+    </w:p>
+    <w:p>
+      <w:pPr>
+        <w:pStyle w:val="Cmsor3"/>
+      </w:pPr>
+      <w:bookmarkStart w:id="22" w:name="_Toc225478186"/>
+      <w:r>
+        <w:lastRenderedPageBreak/>
+        <w:t xml:space="preserve">6.2.8 </w:t>
+      </w:r>
+      <w:proofErr w:type="spellStart"/>
+      <w:r>
+        <w:t>PasswordResetTokens</w:t>
+      </w:r>
+      <w:proofErr w:type="spellEnd"/>
+      <w:r>
+        <w:t> </w:t>
+      </w:r>
+      <w:r>
+        <w:t>tábla</w:t>
+      </w:r>
+      <w:bookmarkEnd w:id="22"/>
+    </w:p>
+    <w:p>
+      <w:r>
+        <w:rPr>
+          <w:noProof/>
+          <w14:ligatures w14:val="standardContextual"/>
+        </w:rPr>
+        <w:drawing>
+          <wp:anchor distT="0" distB="0" distL="114300" distR="114300" simplePos="0" relativeHeight="251689984" behindDoc="0" locked="0" layoutInCell="1" allowOverlap="1" wp14:anchorId="063DA9FA" wp14:editId="609510AA">
+            <wp:simplePos x="0" y="0"/>
+            <wp:positionH relativeFrom="margin">
+              <wp:align>left</wp:align>
+            </wp:positionH>
+            <wp:positionV relativeFrom="paragraph">
+              <wp:posOffset>80010</wp:posOffset>
+            </wp:positionV>
+            <wp:extent cx="2321781" cy="1949933"/>
+            <wp:effectExtent l="0" t="0" r="2540" b="0"/>
+            <wp:wrapSquare wrapText="bothSides"/>
+            <wp:docPr id="17" name="Kép 17"/>
+            <wp:cNvGraphicFramePr>
+              <a:graphicFrameLocks xmlns:a="http://schemas.openxmlformats.org/drawingml/2006/main" noChangeAspect="1"/>
+            </wp:cNvGraphicFramePr>
+            <a:graphic xmlns:a="http://schemas.openxmlformats.org/drawingml/2006/main">
+              <a:graphicData uri="http://schemas.openxmlformats.org/drawingml/2006/picture">
+                <pic:pic xmlns:pic="http://schemas.openxmlformats.org/drawingml/2006/picture">
+                  <pic:nvPicPr>
+                    <pic:cNvPr id="1" name=""/>
+                    <pic:cNvPicPr/>
+                  </pic:nvPicPr>
+                  <pic:blipFill>
+                    <a:blip r:embed="rId33">
+                      <a:extLst>
+                        <a:ext uri="{28A0092B-C50C-407E-A947-70E740481C1C}">
+                          <a14:useLocalDpi xmlns:a14="http://schemas.microsoft.com/office/drawing/2010/main" val="0"/>
+                        </a:ext>
+                      </a:extLst>
+                    </a:blip>
+                    <a:stretch>
+                      <a:fillRect/>
+                    </a:stretch>
+                  </pic:blipFill>
+                  <pic:spPr>
+                    <a:xfrm>
+                      <a:off x="0" y="0"/>
+                      <a:ext cx="2321781" cy="1949933"/>
+                    </a:xfrm>
+                    <a:prstGeom prst="rect">
+                      <a:avLst/>
+                    </a:prstGeom>
+                  </pic:spPr>
+                </pic:pic>
+              </a:graphicData>
+            </a:graphic>
+          </wp:anchor>
+        </w:drawing>
+      </w:r>
+      <w:r>
+        <w:t>Ebben a </w:t>
+      </w:r>
+      <w:proofErr w:type="spellStart"/>
+      <w:r>
+        <w:t>PasswordResetTokens</w:t>
+      </w:r>
+      <w:proofErr w:type="spellEnd"/>
+      <w:r>
+        <w:t xml:space="preserve"> táblában tároljuk a jelszó-visszaállításhoz kapcsolódó ideiglenes </w:t>
+      </w:r>
+      <w:proofErr w:type="spellStart"/>
+      <w:r>
+        <w:t>tokeneket</w:t>
+      </w:r>
+      <w:proofErr w:type="spellEnd"/>
+      <w:r>
+        <w:t>.</w:t>
+      </w:r>
+      <w:r>
+        <w:br/>
+        <w:t xml:space="preserve">A tábla célja, hogy a „Elfelejtett jelszó” folyamat biztonságosan, időkorláttal és egyszeri felhasználással </w:t>
+      </w:r>
+      <w:proofErr w:type="spellStart"/>
+      <w:r>
+        <w:t>működjön</w:t>
+      </w:r>
+      <w:proofErr w:type="spellEnd"/>
+      <w:r>
+        <w:t>.</w:t>
+      </w:r>
+    </w:p>
+    <w:p>
+      <w:r>
+        <w:t xml:space="preserve"> </w:t>
+      </w:r>
+      <w:r>
+        <w:t>Az </w:t>
+      </w:r>
+      <w:proofErr w:type="spellStart"/>
+      <w:r>
+        <w:t>Id</w:t>
+      </w:r>
+      <w:proofErr w:type="spellEnd"/>
+      <w:r>
+        <w:t xml:space="preserve"> mező az elsődleges kulcs, amely egyedileg azonosít minden </w:t>
+      </w:r>
+      <w:proofErr w:type="spellStart"/>
+      <w:r>
+        <w:t>reset</w:t>
+      </w:r>
+      <w:proofErr w:type="spellEnd"/>
+      <w:r>
+        <w:t xml:space="preserve"> </w:t>
+      </w:r>
+      <w:proofErr w:type="spellStart"/>
+      <w:r>
+        <w:t>tokent</w:t>
+      </w:r>
+      <w:proofErr w:type="spellEnd"/>
+      <w:r>
+        <w:t>.</w:t>
+      </w:r>
+      <w:r>
+        <w:br/>
+        <w:t>A </w:t>
+      </w:r>
+      <w:proofErr w:type="spellStart"/>
+      <w:r>
+        <w:t>UserId</w:t>
+      </w:r>
+      <w:proofErr w:type="spellEnd"/>
+      <w:r>
+        <w:t> idegen kulcs a </w:t>
+      </w:r>
+      <w:proofErr w:type="spellStart"/>
+      <w:r>
+        <w:t>Users</w:t>
+      </w:r>
+      <w:proofErr w:type="spellEnd"/>
+      <w:r>
+        <w:t> táblára mutat, így látható, melyik felhasználóhoz tartozik az adott visszaállítási kérés.</w:t>
+      </w:r>
+      <w:r>
+        <w:br/>
+        <w:t>A </w:t>
+      </w:r>
+      <w:proofErr w:type="spellStart"/>
+      <w:r>
+        <w:t>TokenHash</w:t>
+      </w:r>
+      <w:proofErr w:type="spellEnd"/>
+      <w:r>
+        <w:t xml:space="preserve"> mezőben a </w:t>
+      </w:r>
+      <w:proofErr w:type="spellStart"/>
+      <w:r>
+        <w:t>token</w:t>
+      </w:r>
+      <w:proofErr w:type="spellEnd"/>
+      <w:r>
+        <w:t xml:space="preserve"> </w:t>
+      </w:r>
+      <w:proofErr w:type="spellStart"/>
+      <w:r>
+        <w:t>hash-elt</w:t>
+      </w:r>
+      <w:proofErr w:type="spellEnd"/>
+      <w:r>
+        <w:t xml:space="preserve"> (SHA-256) változata van eltárolva, nem a nyers </w:t>
+      </w:r>
+      <w:proofErr w:type="spellStart"/>
+      <w:r>
+        <w:t>token</w:t>
+      </w:r>
+      <w:proofErr w:type="spellEnd"/>
+      <w:r>
+        <w:t>, ami növeli a biztonságot egy esetleges adatszivárgás esetén is.</w:t>
+      </w:r>
+    </w:p>
+    <w:p>
+      <w:r>
+        <w:t>Az </w:t>
+      </w:r>
+      <w:proofErr w:type="spellStart"/>
+      <w:r>
+        <w:t>ExpiresAt</w:t>
+      </w:r>
+      <w:proofErr w:type="spellEnd"/>
+      <w:r>
+        <w:t xml:space="preserve"> mező a </w:t>
+      </w:r>
+      <w:proofErr w:type="spellStart"/>
+      <w:r>
+        <w:t>token</w:t>
+      </w:r>
+      <w:proofErr w:type="spellEnd"/>
+      <w:r>
+        <w:t xml:space="preserve"> lejárati idejét tárolja, így a rendszer csak meghatározott ideig fogadja el a visszaállítási linket.</w:t>
+      </w:r>
+      <w:r>
+        <w:br/>
+        <w:t>A </w:t>
+      </w:r>
+      <w:proofErr w:type="spellStart"/>
+      <w:r>
+        <w:t>UsedAt</w:t>
+      </w:r>
+      <w:proofErr w:type="spellEnd"/>
+      <w:r>
+        <w:t xml:space="preserve"> mező jelzi, hogy a </w:t>
+      </w:r>
+      <w:proofErr w:type="spellStart"/>
+      <w:r>
+        <w:t>token</w:t>
+      </w:r>
+      <w:proofErr w:type="spellEnd"/>
+      <w:r>
+        <w:t xml:space="preserve"> már fel lett-e használva; ha igen, ugyanaz a </w:t>
+      </w:r>
+      <w:proofErr w:type="spellStart"/>
+      <w:r>
+        <w:t>token</w:t>
+      </w:r>
+      <w:proofErr w:type="spellEnd"/>
+      <w:r>
+        <w:t xml:space="preserve"> többé nem érvényes.</w:t>
+      </w:r>
+      <w:r>
+        <w:br/>
+        <w:t>A </w:t>
+      </w:r>
+      <w:proofErr w:type="spellStart"/>
+      <w:r>
+        <w:t>CreatedAt</w:t>
+      </w:r>
+      <w:proofErr w:type="spellEnd"/>
+      <w:r>
+        <w:t xml:space="preserve"> mező a </w:t>
+      </w:r>
+      <w:proofErr w:type="spellStart"/>
+      <w:r>
+        <w:t>token</w:t>
+      </w:r>
+      <w:proofErr w:type="spellEnd"/>
+      <w:r>
+        <w:t xml:space="preserve"> létrehozásának időpontját rögzíti.</w:t>
+      </w:r>
+    </w:p>
+    <w:p>
+      <w:r>
+        <w:t>Ez a tábla kulcsszerepet játszik a fiókbiztonságban, mert biztosítja, hogy a jelszó-visszaállítás ellenőrzött, időkorlátos és visszaélés ellen védett módon történjen.</w:t>
       </w:r>
     </w:p>
     <w:p/>
@@ -8752,12 +9352,12 @@
       <w:pPr>
         <w:pStyle w:val="Cmsor2"/>
       </w:pPr>
-      <w:bookmarkStart w:id="21" w:name="_Toc225437721"/>
+      <w:bookmarkStart w:id="23" w:name="_Toc225478187"/>
       <w:r>
         <w:lastRenderedPageBreak/>
         <w:t>6.3 Adatkapcsolatok, integritás és teljesítmény</w:t>
       </w:r>
-      <w:bookmarkEnd w:id="21"/>
+      <w:bookmarkEnd w:id="23"/>
     </w:p>
     <w:p>
       <w:r>
@@ -9281,12 +9881,12 @@
       <w:pPr>
         <w:pStyle w:val="Cmsor1"/>
       </w:pPr>
-      <w:bookmarkStart w:id="22" w:name="_Toc225437722"/>
+      <w:bookmarkStart w:id="24" w:name="_Toc225478188"/>
       <w:r>
         <w:lastRenderedPageBreak/>
         <w:t>7. A PROJEKT MEGVALÓSÍTÁSA</w:t>
       </w:r>
-      <w:bookmarkEnd w:id="22"/>
+      <w:bookmarkEnd w:id="24"/>
     </w:p>
     <w:p>
       <w:r>
@@ -9776,12 +10376,12 @@
       <w:pPr>
         <w:pStyle w:val="Cmsor2"/>
       </w:pPr>
-      <w:bookmarkStart w:id="23" w:name="_Toc225437723"/>
+      <w:bookmarkStart w:id="25" w:name="_Toc225478189"/>
       <w:r>
         <w:lastRenderedPageBreak/>
         <w:t>7.1 Projektstruktúra és mappafelépítés</w:t>
       </w:r>
-      <w:bookmarkEnd w:id="23"/>
+      <w:bookmarkEnd w:id="25"/>
     </w:p>
     <w:p>
       <w:r>
@@ -10276,12 +10876,12 @@
       <w:pPr>
         <w:pStyle w:val="Cmsor1"/>
       </w:pPr>
-      <w:bookmarkStart w:id="24" w:name="_Toc225437724"/>
+      <w:bookmarkStart w:id="26" w:name="_Toc225478190"/>
       <w:r>
         <w:lastRenderedPageBreak/>
         <w:t>8. FELADATMEGOSZTÁS</w:t>
       </w:r>
-      <w:bookmarkEnd w:id="24"/>
+      <w:bookmarkEnd w:id="26"/>
     </w:p>
     <w:p>
       <w:r>
@@ -10556,12 +11156,12 @@
       <w:pPr>
         <w:pStyle w:val="Cmsor1"/>
       </w:pPr>
-      <w:bookmarkStart w:id="25" w:name="_Toc225437725"/>
+      <w:bookmarkStart w:id="27" w:name="_Toc225478191"/>
       <w:r>
         <w:lastRenderedPageBreak/>
         <w:t>9. TESZTELÉS</w:t>
       </w:r>
-      <w:bookmarkEnd w:id="25"/>
+      <w:bookmarkEnd w:id="27"/>
     </w:p>
     <w:tbl>
       <w:tblPr>
@@ -10940,12 +11540,12 @@
       <w:pPr>
         <w:pStyle w:val="Cmsor1"/>
       </w:pPr>
-      <w:bookmarkStart w:id="26" w:name="_Toc225437726"/>
+      <w:bookmarkStart w:id="28" w:name="_Toc225478192"/>
       <w:r>
         <w:lastRenderedPageBreak/>
         <w:t>10. ÖSSZEGZÉS</w:t>
       </w:r>
-      <w:bookmarkEnd w:id="26"/>
+      <w:bookmarkEnd w:id="28"/>
     </w:p>
     <w:p>
       <w:r>
@@ -11178,7 +11778,7 @@
       <w:pPr>
         <w:pStyle w:val="Cmsor1"/>
       </w:pPr>
-      <w:bookmarkStart w:id="27" w:name="_Toc225437727"/>
+      <w:bookmarkStart w:id="29" w:name="_Toc225478193"/>
       <w:r>
         <w:lastRenderedPageBreak/>
         <w:t xml:space="preserve">11. </w:t>
@@ -11186,7 +11786,7 @@
       <w:r>
         <w:t>Biztonság</w:t>
       </w:r>
-      <w:bookmarkEnd w:id="27"/>
+      <w:bookmarkEnd w:id="29"/>
     </w:p>
     <w:p>
       <w:pPr>
@@ -11414,12 +12014,12 @@
       <w:pPr>
         <w:pStyle w:val="Cmsor2"/>
       </w:pPr>
-      <w:bookmarkStart w:id="28" w:name="_Toc225437728"/>
+      <w:bookmarkStart w:id="30" w:name="_Toc225478194"/>
       <w:r>
         <w:lastRenderedPageBreak/>
         <w:t>11.1 Hitelesítés és munkamenet-kezelés</w:t>
       </w:r>
-      <w:bookmarkEnd w:id="28"/>
+      <w:bookmarkEnd w:id="30"/>
     </w:p>
     <w:p>
       <w:pPr>
@@ -11811,12 +12411,12 @@
       <w:pPr>
         <w:pStyle w:val="Cmsor2"/>
       </w:pPr>
-      <w:bookmarkStart w:id="29" w:name="_Toc225437729"/>
+      <w:bookmarkStart w:id="31" w:name="_Toc225478195"/>
       <w:r>
         <w:lastRenderedPageBreak/>
         <w:t>11.2 Jelszóbiztonság</w:t>
       </w:r>
-      <w:bookmarkEnd w:id="29"/>
+      <w:bookmarkEnd w:id="31"/>
     </w:p>
     <w:p>
       <w:r>
@@ -11997,12 +12597,12 @@
         <w:pStyle w:val="Cmsor2"/>
         <w:spacing w:before="100" w:beforeAutospacing="1"/>
       </w:pPr>
-      <w:bookmarkStart w:id="30" w:name="_Toc225437730"/>
+      <w:bookmarkStart w:id="32" w:name="_Toc225478196"/>
       <w:r>
         <w:lastRenderedPageBreak/>
         <w:t>11.3 Jogosultságkezelés (RBAC)</w:t>
       </w:r>
-      <w:bookmarkEnd w:id="30"/>
+      <w:bookmarkEnd w:id="32"/>
     </w:p>
     <w:p>
       <w:pPr>
@@ -12238,12 +12838,12 @@
       <w:pPr>
         <w:pStyle w:val="Cmsor2"/>
       </w:pPr>
-      <w:bookmarkStart w:id="31" w:name="_Toc225437731"/>
+      <w:bookmarkStart w:id="33" w:name="_Toc225478197"/>
       <w:r>
         <w:lastRenderedPageBreak/>
         <w:t>11.4 Jelszó-visszaállítás védelme</w:t>
       </w:r>
-      <w:bookmarkEnd w:id="31"/>
+      <w:bookmarkEnd w:id="33"/>
     </w:p>
     <w:p>
       <w:pPr>
@@ -12563,12 +13163,12 @@
       <w:pPr>
         <w:pStyle w:val="Cmsor2"/>
       </w:pPr>
-      <w:bookmarkStart w:id="32" w:name="_Toc225437732"/>
+      <w:bookmarkStart w:id="34" w:name="_Toc225478198"/>
       <w:r>
         <w:lastRenderedPageBreak/>
         <w:t>11.5 API-védelem és forgalomkorlát</w:t>
       </w:r>
-      <w:bookmarkEnd w:id="32"/>
+      <w:bookmarkEnd w:id="34"/>
     </w:p>
     <w:p>
       <w:r>
@@ -12729,12 +13329,12 @@
       <w:pPr>
         <w:pStyle w:val="Cmsor2"/>
       </w:pPr>
-      <w:bookmarkStart w:id="33" w:name="_Toc225437733"/>
+      <w:bookmarkStart w:id="35" w:name="_Toc225478199"/>
       <w:r>
         <w:lastRenderedPageBreak/>
         <w:t>11.6 CORS és környezeti védelem</w:t>
       </w:r>
-      <w:bookmarkEnd w:id="33"/>
+      <w:bookmarkEnd w:id="35"/>
     </w:p>
     <w:p>
       <w:pPr>
@@ -12927,12 +13527,12 @@
       <w:pPr>
         <w:pStyle w:val="Cmsor2"/>
       </w:pPr>
-      <w:bookmarkStart w:id="34" w:name="_Toc225437734"/>
+      <w:bookmarkStart w:id="36" w:name="_Toc225478200"/>
       <w:r>
         <w:lastRenderedPageBreak/>
         <w:t>11.7 Adatbázis-biztonság és lekérdezések</w:t>
       </w:r>
-      <w:bookmarkEnd w:id="34"/>
+      <w:bookmarkEnd w:id="36"/>
     </w:p>
     <w:p>
       <w:pPr>
@@ -13182,12 +13782,12 @@
       <w:pPr>
         <w:pStyle w:val="Cmsor2"/>
       </w:pPr>
-      <w:bookmarkStart w:id="35" w:name="_Toc225437735"/>
+      <w:bookmarkStart w:id="37" w:name="_Toc225478201"/>
       <w:r>
         <w:lastRenderedPageBreak/>
         <w:t>11.8 Üzleti logikai védelem</w:t>
       </w:r>
-      <w:bookmarkEnd w:id="35"/>
+      <w:bookmarkEnd w:id="37"/>
     </w:p>
     <w:p>
       <w:pPr>
@@ -13375,12 +13975,12 @@
       <w:pPr>
         <w:pStyle w:val="Cmsor2"/>
       </w:pPr>
-      <w:bookmarkStart w:id="36" w:name="_Toc225437736"/>
+      <w:bookmarkStart w:id="38" w:name="_Toc225478202"/>
       <w:r>
         <w:lastRenderedPageBreak/>
         <w:t>11.9 Üzenetek és bemenetek kezelése</w:t>
       </w:r>
-      <w:bookmarkEnd w:id="36"/>
+      <w:bookmarkEnd w:id="38"/>
     </w:p>
     <w:p>
       <w:pPr>
@@ -13543,12 +14143,12 @@
       <w:pPr>
         <w:pStyle w:val="Cmsor1"/>
       </w:pPr>
-      <w:bookmarkStart w:id="37" w:name="_Toc225437737"/>
+      <w:bookmarkStart w:id="39" w:name="_Toc225478203"/>
       <w:r>
         <w:lastRenderedPageBreak/>
         <w:t>12. API-DOKUMENTÁCIÓ ÖSSZEFOGLALÓ</w:t>
       </w:r>
-      <w:bookmarkEnd w:id="37"/>
+      <w:bookmarkEnd w:id="39"/>
     </w:p>
     <w:p>
       <w:pPr>
@@ -13824,12 +14424,12 @@
       <w:pPr>
         <w:pStyle w:val="Cmsor2"/>
       </w:pPr>
-      <w:bookmarkStart w:id="38" w:name="_Toc225437738"/>
+      <w:bookmarkStart w:id="40" w:name="_Toc225478204"/>
       <w:r>
         <w:lastRenderedPageBreak/>
         <w:t>12.1 API-csoportok áttekintése</w:t>
       </w:r>
-      <w:bookmarkEnd w:id="38"/>
+      <w:bookmarkEnd w:id="40"/>
     </w:p>
     <w:p>
       <w:pPr>
@@ -14192,12 +14792,12 @@
       <w:pPr>
         <w:pStyle w:val="Cmsor2"/>
       </w:pPr>
-      <w:bookmarkStart w:id="39" w:name="_Toc225437739"/>
+      <w:bookmarkStart w:id="41" w:name="_Toc225478205"/>
       <w:r>
         <w:lastRenderedPageBreak/>
         <w:t>12.2 Hitelesítés és szerepkörök</w:t>
       </w:r>
-      <w:bookmarkEnd w:id="39"/>
+      <w:bookmarkEnd w:id="41"/>
     </w:p>
     <w:p>
       <w:pPr>
@@ -14437,12 +15037,12 @@
       <w:pPr>
         <w:pStyle w:val="Cmsor2"/>
       </w:pPr>
-      <w:bookmarkStart w:id="40" w:name="_Toc225437740"/>
+      <w:bookmarkStart w:id="42" w:name="_Toc225478206"/>
       <w:r>
         <w:lastRenderedPageBreak/>
         <w:t>12.3 Főbb végpontok (projekt szerinti, tényleges útvonalakkal)</w:t>
       </w:r>
-      <w:bookmarkEnd w:id="40"/>
+      <w:bookmarkEnd w:id="42"/>
     </w:p>
     <w:p>
       <w:pPr>
@@ -15580,12 +16180,12 @@
         <w:pStyle w:val="Cmsor2"/>
         <w:spacing w:before="480"/>
       </w:pPr>
-      <w:bookmarkStart w:id="41" w:name="_Toc225437741"/>
+      <w:bookmarkStart w:id="43" w:name="_Toc225478207"/>
       <w:r>
         <w:lastRenderedPageBreak/>
         <w:t>12.4 Példa kérés-válasz logika</w:t>
       </w:r>
-      <w:bookmarkEnd w:id="41"/>
+      <w:bookmarkEnd w:id="43"/>
     </w:p>
     <w:p>
       <w:pPr>
@@ -16091,12 +16691,12 @@
         <w:pStyle w:val="Cmsor1"/>
         <w:spacing w:before="840"/>
       </w:pPr>
-      <w:bookmarkStart w:id="42" w:name="_Toc225437742"/>
+      <w:bookmarkStart w:id="44" w:name="_Toc225478208"/>
       <w:r>
         <w:lastRenderedPageBreak/>
         <w:t>13. JÖVŐBELI FEJLESZTÉSI LEHETŐSÉGEK</w:t>
       </w:r>
-      <w:bookmarkEnd w:id="42"/>
+      <w:bookmarkEnd w:id="44"/>
     </w:p>
     <w:p>
       <w:pPr>
@@ -16474,25 +17074,25 @@
       <w:pPr>
         <w:pStyle w:val="Cmsor1"/>
       </w:pPr>
-      <w:bookmarkStart w:id="43" w:name="_Toc225437743"/>
+      <w:bookmarkStart w:id="45" w:name="_Toc225478209"/>
       <w:r>
         <w:lastRenderedPageBreak/>
         <w:t>14. MELLÉKLETEK</w:t>
       </w:r>
-      <w:bookmarkEnd w:id="43"/>
+      <w:bookmarkEnd w:id="45"/>
     </w:p>
     <w:p>
       <w:pPr>
         <w:pStyle w:val="Cmsor2"/>
       </w:pPr>
-      <w:bookmarkStart w:id="44" w:name="_Toc225437744"/>
+      <w:bookmarkStart w:id="46" w:name="_Toc225478210"/>
       <w:r>
         <w:t xml:space="preserve">14.1 </w:t>
       </w:r>
       <w:r>
         <w:t>Bejelentkezés</w:t>
       </w:r>
-      <w:bookmarkEnd w:id="44"/>
+      <w:bookmarkEnd w:id="46"/>
     </w:p>
     <w:p>
       <w:r>
@@ -16523,7 +17123,7 @@
                     <pic:cNvPicPr/>
                   </pic:nvPicPr>
                   <pic:blipFill>
-                    <a:blip r:embed="rId32">
+                    <a:blip r:embed="rId34">
                       <a:extLst>
                         <a:ext uri="{28A0092B-C50C-407E-A947-70E740481C1C}">
                           <a14:useLocalDpi xmlns:a14="http://schemas.microsoft.com/office/drawing/2010/main" val="0"/>
@@ -16606,11 +17206,11 @@
       <w:pPr>
         <w:pStyle w:val="Cmsor3"/>
       </w:pPr>
-      <w:bookmarkStart w:id="45" w:name="_Toc225437745"/>
+      <w:bookmarkStart w:id="47" w:name="_Toc225478211"/>
       <w:r>
         <w:t>14.1.1 Bejelentkezés hibaüzenetek</w:t>
       </w:r>
-      <w:bookmarkEnd w:id="45"/>
+      <w:bookmarkEnd w:id="47"/>
     </w:p>
     <w:p>
       <w:pPr>
@@ -16636,177 +17236,6 @@
             <wp:effectExtent l="0" t="0" r="0" b="0"/>
             <wp:wrapSquare wrapText="bothSides"/>
             <wp:docPr id="12" name="Kép 12"/>
-            <wp:cNvGraphicFramePr>
-              <a:graphicFrameLocks xmlns:a="http://schemas.openxmlformats.org/drawingml/2006/main" noChangeAspect="1"/>
-            </wp:cNvGraphicFramePr>
-            <a:graphic xmlns:a="http://schemas.openxmlformats.org/drawingml/2006/main">
-              <a:graphicData uri="http://schemas.openxmlformats.org/drawingml/2006/picture">
-                <pic:pic xmlns:pic="http://schemas.openxmlformats.org/drawingml/2006/picture">
-                  <pic:nvPicPr>
-                    <pic:cNvPr id="1" name=""/>
-                    <pic:cNvPicPr/>
-                  </pic:nvPicPr>
-                  <pic:blipFill>
-                    <a:blip r:embed="rId33">
-                      <a:extLst>
-                        <a:ext uri="{28A0092B-C50C-407E-A947-70E740481C1C}">
-                          <a14:useLocalDpi xmlns:a14="http://schemas.microsoft.com/office/drawing/2010/main" val="0"/>
-                        </a:ext>
-                      </a:extLst>
-                    </a:blip>
-                    <a:stretch>
-                      <a:fillRect/>
-                    </a:stretch>
-                  </pic:blipFill>
-                  <pic:spPr>
-                    <a:xfrm>
-                      <a:off x="0" y="0"/>
-                      <a:ext cx="3511550" cy="2822575"/>
-                    </a:xfrm>
-                    <a:prstGeom prst="rect">
-                      <a:avLst/>
-                    </a:prstGeom>
-                  </pic:spPr>
-                </pic:pic>
-              </a:graphicData>
-            </a:graphic>
-          </wp:anchor>
-        </w:drawing>
-      </w:r>
-      <w:r>
-        <w:t>Ez a hibaüzenet a bejelentkezési űrlap kliensoldali validációjához tartozik.</w:t>
-      </w:r>
-      <w:r>
-        <w:br/>
-        <w:t>A rendszer ellenőrzi, hogy az email mezőben valóban érvényes email formátum szerepel-e, és ha nem, akkor a belépési folyamatot nem engedi tovább.</w:t>
-      </w:r>
-      <w:r>
-        <w:t xml:space="preserve"> </w:t>
-      </w:r>
-      <w:r>
-        <w:br/>
-      </w:r>
-      <w:r>
-        <w:t>A képen látható </w:t>
-      </w:r>
-      <w:proofErr w:type="spellStart"/>
-      <w:r>
-        <w:t>asd</w:t>
-      </w:r>
-      <w:proofErr w:type="spellEnd"/>
-      <w:r>
-        <w:t xml:space="preserve"> érték nem felel meg az elvárt formátumnak (hiányzik például a @ és a </w:t>
-      </w:r>
-      <w:proofErr w:type="spellStart"/>
-      <w:r>
-        <w:t>domain</w:t>
-      </w:r>
-      <w:proofErr w:type="spellEnd"/>
-      <w:r>
-        <w:t xml:space="preserve"> rész), ezért jelenik meg a figyelmeztetés:</w:t>
-      </w:r>
-      <w:r>
-        <w:br/>
-      </w:r>
-      <w:r>
-        <w:rPr>
-          <w:b/>
-          <w:bCs/>
-        </w:rPr>
-        <w:t>„Kérlek érvényes email címet adj meg (pl. </w:t>
-      </w:r>
-      <w:hyperlink r:id="rId34" w:tgtFrame="_blank" w:history="1">
-        <w:r>
-          <w:rPr>
-            <w:rStyle w:val="Hiperhivatkozs"/>
-            <w:b/>
-            <w:bCs/>
-          </w:rPr>
-          <w:t>nev@pelda.hu</w:t>
-        </w:r>
-      </w:hyperlink>
-      <w:r>
-        <w:rPr>
-          <w:b/>
-          <w:bCs/>
-        </w:rPr>
-        <w:t>).”</w:t>
-      </w:r>
-    </w:p>
-    <w:p>
-      <w:pPr>
-        <w:spacing w:before="480"/>
-      </w:pPr>
-      <w:r>
-        <w:lastRenderedPageBreak/>
-        <w:t>Ennek célja:</w:t>
-      </w:r>
-    </w:p>
-    <w:p>
-      <w:pPr>
-        <w:numPr>
-          <w:ilvl w:val="0"/>
-          <w:numId w:val="21"/>
-        </w:numPr>
-      </w:pPr>
-      <w:r>
-        <w:t>a hibás adatbevitel korai kiszűrése,</w:t>
-      </w:r>
-    </w:p>
-    <w:p>
-      <w:pPr>
-        <w:numPr>
-          <w:ilvl w:val="0"/>
-          <w:numId w:val="21"/>
-        </w:numPr>
-      </w:pPr>
-      <w:r>
-        <w:t>a felesleges szerverhívások csökkentése,</w:t>
-      </w:r>
-    </w:p>
-    <w:p>
-      <w:pPr>
-        <w:numPr>
-          <w:ilvl w:val="0"/>
-          <w:numId w:val="21"/>
-        </w:numPr>
-      </w:pPr>
-      <w:r>
-        <w:t>egyértelmű visszajelzés adása a felhasználónak a javításhoz.</w:t>
-      </w:r>
-    </w:p>
-    <w:p>
-      <w:pPr>
-        <w:pStyle w:val="Cmsor3"/>
-      </w:pPr>
-      <w:bookmarkStart w:id="46" w:name="_Toc225437746"/>
-      <w:r>
-        <w:t xml:space="preserve">14.1.2 </w:t>
-      </w:r>
-      <w:r>
-        <w:t>Hiányzó Jelszó a Bejelentkezésnél</w:t>
-      </w:r>
-      <w:bookmarkEnd w:id="46"/>
-    </w:p>
-    <w:p>
-      <w:r>
-        <w:rPr>
-          <w:noProof/>
-          <w14:ligatures w14:val="standardContextual"/>
-        </w:rPr>
-        <w:drawing>
-          <wp:anchor distT="0" distB="0" distL="114300" distR="114300" simplePos="0" relativeHeight="251668480" behindDoc="0" locked="0" layoutInCell="1" allowOverlap="1" wp14:anchorId="28FD0E91" wp14:editId="020154FB">
-            <wp:simplePos x="0" y="0"/>
-            <wp:positionH relativeFrom="margin">
-              <wp:align>left</wp:align>
-            </wp:positionH>
-            <wp:positionV relativeFrom="paragraph">
-              <wp:posOffset>394143</wp:posOffset>
-            </wp:positionV>
-            <wp:extent cx="3414395" cy="3010535"/>
-            <wp:effectExtent l="0" t="0" r="0" b="0"/>
-            <wp:wrapSquare wrapText="bothSides"/>
-            <wp:docPr id="13" name="Kép 13"/>
             <wp:cNvGraphicFramePr>
               <a:graphicFrameLocks xmlns:a="http://schemas.openxmlformats.org/drawingml/2006/main" noChangeAspect="1"/>
             </wp:cNvGraphicFramePr>
@@ -16832,7 +17261,7 @@
                   <pic:spPr>
                     <a:xfrm>
                       <a:off x="0" y="0"/>
-                      <a:ext cx="3414395" cy="3010535"/>
+                      <a:ext cx="3511550" cy="2822575"/>
                     </a:xfrm>
                     <a:prstGeom prst="rect">
                       <a:avLst/>
@@ -16845,57 +17274,119 @@
         </w:drawing>
       </w:r>
       <w:r>
-        <w:t>Ez a hibaüzenet akkor jelenik meg, amikor a felhasználó kitölti az email mezőt, de a jelszó mezőt üresen hagyja, és így próbál belépni. A kliensoldali validáció ellenőrzi a kötelező mezőket, ezért a rendszer nem indítja el a bejelentkezési kérést, amíg a jelszó nincs megadva.</w:t>
-      </w:r>
-    </w:p>
-    <w:p>
-      <w:r>
-        <w:t>A „</w:t>
+        <w:t>Ez a hibaüzenet a bejelentkezési űrlap kliensoldali validációjához tartozik.</w:t>
+      </w:r>
+      <w:r>
+        <w:br/>
+        <w:t>A rendszer ellenőrzi, hogy az email mezőben valóban érvényes email formátum szerepel-e, és ha nem, akkor a belépési folyamatot nem engedi tovább.</w:t>
+      </w:r>
+      <w:r>
+        <w:t xml:space="preserve"> </w:t>
+      </w:r>
+      <w:r>
+        <w:br/>
+      </w:r>
+      <w:r>
+        <w:t>A képen látható </w:t>
+      </w:r>
+      <w:proofErr w:type="spellStart"/>
+      <w:r>
+        <w:t>asd</w:t>
+      </w:r>
+      <w:proofErr w:type="spellEnd"/>
+      <w:r>
+        <w:t xml:space="preserve"> érték nem felel meg az elvárt formátumnak (hiányzik például a @ és a </w:t>
+      </w:r>
+      <w:proofErr w:type="spellStart"/>
+      <w:r>
+        <w:t>domain</w:t>
+      </w:r>
+      <w:proofErr w:type="spellEnd"/>
+      <w:r>
+        <w:t xml:space="preserve"> rész), ezért jelenik meg a figyelmeztetés:</w:t>
+      </w:r>
+      <w:r>
+        <w:br/>
       </w:r>
       <w:r>
         <w:rPr>
           <w:b/>
           <w:bCs/>
         </w:rPr>
-        <w:t xml:space="preserve">Kérlek add meg a </w:t>
-      </w:r>
-      <w:proofErr w:type="spellStart"/>
+        <w:t>„Kérlek érvényes email címet adj meg (pl. </w:t>
+      </w:r>
+      <w:hyperlink r:id="rId36" w:tgtFrame="_blank" w:history="1">
+        <w:r>
+          <w:rPr>
+            <w:rStyle w:val="Hiperhivatkozs"/>
+            <w:b/>
+            <w:bCs/>
+          </w:rPr>
+          <w:t>nev@pelda.hu</w:t>
+        </w:r>
+      </w:hyperlink>
       <w:r>
         <w:rPr>
           <w:b/>
           <w:bCs/>
         </w:rPr>
-        <w:t>jelszavadat</w:t>
-      </w:r>
-      <w:proofErr w:type="spellEnd"/>
-      <w:r>
-        <w:rPr>
-          <w:b/>
-          <w:bCs/>
-        </w:rPr>
-        <w:t>.</w:t>
-      </w:r>
-      <w:r>
-        <w:t>” üzenet célja, hogy azonnali, egyértelmű visszajelzést adjon a hiányzó adat pótlásához. Ez javítja a felhasználói élményt, csökkenti a hibás beküldések számát, és megelőzi a felesleges szerveroldali terhelést.</w:t>
-      </w:r>
-    </w:p>
-    <w:p/>
+        <w:t>).”</w:t>
+      </w:r>
+    </w:p>
+    <w:p>
+      <w:pPr>
+        <w:spacing w:before="480"/>
+      </w:pPr>
+      <w:r>
+        <w:lastRenderedPageBreak/>
+        <w:t>Ennek célja:</w:t>
+      </w:r>
+    </w:p>
+    <w:p>
+      <w:pPr>
+        <w:numPr>
+          <w:ilvl w:val="0"/>
+          <w:numId w:val="21"/>
+        </w:numPr>
+      </w:pPr>
+      <w:r>
+        <w:t>a hibás adatbevitel korai kiszűrése,</w:t>
+      </w:r>
+    </w:p>
+    <w:p>
+      <w:pPr>
+        <w:numPr>
+          <w:ilvl w:val="0"/>
+          <w:numId w:val="21"/>
+        </w:numPr>
+      </w:pPr>
+      <w:r>
+        <w:t>a felesleges szerverhívások csökkentése,</w:t>
+      </w:r>
+    </w:p>
+    <w:p>
+      <w:pPr>
+        <w:numPr>
+          <w:ilvl w:val="0"/>
+          <w:numId w:val="21"/>
+        </w:numPr>
+      </w:pPr>
+      <w:r>
+        <w:t>egyértelmű visszajelzés adása a felhasználónak a javításhoz.</w:t>
+      </w:r>
+    </w:p>
     <w:p>
       <w:pPr>
         <w:pStyle w:val="Cmsor3"/>
       </w:pPr>
-      <w:bookmarkStart w:id="47" w:name="_Toc225437747"/>
-      <w:r>
-        <w:t xml:space="preserve">14.1.3 </w:t>
-      </w:r>
-      <w:r>
-        <w:rPr>
-          <w:b/>
-          <w:bCs/>
-        </w:rPr>
-        <w:t>Nem Létező Fiók (Bejelentkezési Hiba)</w:t>
-      </w:r>
-      <w:bookmarkEnd w:id="47"/>
+      <w:bookmarkStart w:id="48" w:name="_Toc225478212"/>
+      <w:r>
+        <w:t xml:space="preserve">14.1.2 </w:t>
+      </w:r>
+      <w:r>
+        <w:t>Hiányzó Jelszó a Bejelentkezésnél</w:t>
+      </w:r>
+      <w:bookmarkEnd w:id="48"/>
     </w:p>
     <w:p>
       <w:r>
@@ -16904,174 +17395,18 @@
           <w14:ligatures w14:val="standardContextual"/>
         </w:rPr>
         <w:drawing>
-          <wp:anchor distT="0" distB="0" distL="114300" distR="114300" simplePos="0" relativeHeight="251669504" behindDoc="0" locked="0" layoutInCell="1" allowOverlap="1" wp14:anchorId="5C0B8CC3" wp14:editId="17FE4D4B">
+          <wp:anchor distT="0" distB="0" distL="114300" distR="114300" simplePos="0" relativeHeight="251668480" behindDoc="0" locked="0" layoutInCell="1" allowOverlap="1" wp14:anchorId="28FD0E91" wp14:editId="020154FB">
             <wp:simplePos x="0" y="0"/>
             <wp:positionH relativeFrom="margin">
               <wp:align>left</wp:align>
             </wp:positionH>
             <wp:positionV relativeFrom="paragraph">
-              <wp:posOffset>12975</wp:posOffset>
+              <wp:posOffset>394143</wp:posOffset>
             </wp:positionV>
-            <wp:extent cx="3056890" cy="2484120"/>
+            <wp:extent cx="3414395" cy="3010535"/>
             <wp:effectExtent l="0" t="0" r="0" b="0"/>
             <wp:wrapSquare wrapText="bothSides"/>
-            <wp:docPr id="14" name="Kép 14"/>
-            <wp:cNvGraphicFramePr>
-              <a:graphicFrameLocks xmlns:a="http://schemas.openxmlformats.org/drawingml/2006/main" noChangeAspect="1"/>
-            </wp:cNvGraphicFramePr>
-            <a:graphic xmlns:a="http://schemas.openxmlformats.org/drawingml/2006/main">
-              <a:graphicData uri="http://schemas.openxmlformats.org/drawingml/2006/picture">
-                <pic:pic xmlns:pic="http://schemas.openxmlformats.org/drawingml/2006/picture">
-                  <pic:nvPicPr>
-                    <pic:cNvPr id="1" name=""/>
-                    <pic:cNvPicPr/>
-                  </pic:nvPicPr>
-                  <pic:blipFill>
-                    <a:blip r:embed="rId36">
-                      <a:extLst>
-                        <a:ext uri="{28A0092B-C50C-407E-A947-70E740481C1C}">
-                          <a14:useLocalDpi xmlns:a14="http://schemas.microsoft.com/office/drawing/2010/main" val="0"/>
-                        </a:ext>
-                      </a:extLst>
-                    </a:blip>
-                    <a:stretch>
-                      <a:fillRect/>
-                    </a:stretch>
-                  </pic:blipFill>
-                  <pic:spPr>
-                    <a:xfrm>
-                      <a:off x="0" y="0"/>
-                      <a:ext cx="3056890" cy="2484120"/>
-                    </a:xfrm>
-                    <a:prstGeom prst="rect">
-                      <a:avLst/>
-                    </a:prstGeom>
-                  </pic:spPr>
-                </pic:pic>
-              </a:graphicData>
-            </a:graphic>
-          </wp:anchor>
-        </w:drawing>
-      </w:r>
-      <w:r>
-        <w:t>Ez a hibaüzenet akkor jelenik meg, amikor a megadott email címhez nem tartozik regisztrált felhasználói fiók a rendszerben. A backend ilyenkor nem tudja azonosítani a felhasználót, ezért a bejelentkezést elutasítja, és visszajelzi: </w:t>
-      </w:r>
-      <w:r>
-        <w:rPr>
-          <w:b/>
-          <w:bCs/>
-        </w:rPr>
-        <w:t>„A fiókját nem találtuk. Ellenőrizd az email címet.”</w:t>
-      </w:r>
-    </w:p>
-    <w:p>
-      <w:pPr>
-        <w:spacing w:before="0"/>
-      </w:pPr>
-      <w:r>
-        <w:t>A hiba célja, hogy egyértelműen jelezze: a probléma nem a jelszóval, hanem az email-címhez tartozó fiók hiányával kapcsolatos.</w:t>
-      </w:r>
-      <w:r>
-        <w:t xml:space="preserve"> </w:t>
-      </w:r>
-    </w:p>
-    <w:p>
-      <w:pPr>
-        <w:spacing w:before="0"/>
-      </w:pPr>
-    </w:p>
-    <w:p>
-      <w:pPr>
-        <w:spacing w:before="0"/>
-        <w:rPr>
-          <w:b/>
-          <w:bCs/>
-        </w:rPr>
-      </w:pPr>
-      <w:r>
-        <w:rPr>
-          <w:b/>
-          <w:bCs/>
-        </w:rPr>
-        <w:lastRenderedPageBreak/>
-        <w:t>Ilyen esetben a felhasználó:</w:t>
-      </w:r>
-    </w:p>
-    <w:p>
-      <w:pPr>
-        <w:pStyle w:val="Listaszerbekezds"/>
-        <w:numPr>
-          <w:ilvl w:val="0"/>
-          <w:numId w:val="45"/>
-        </w:numPr>
-        <w:spacing w:before="0"/>
-      </w:pPr>
-      <w:r>
-        <w:t>ellenőrizze az email cím helyesírását,</w:t>
-      </w:r>
-    </w:p>
-    <w:p>
-      <w:pPr>
-        <w:numPr>
-          <w:ilvl w:val="0"/>
-          <w:numId w:val="45"/>
-        </w:numPr>
-      </w:pPr>
-      <w:r>
-        <w:t>próbáljon másik, korábban használt email címet,</w:t>
-      </w:r>
-    </w:p>
-    <w:p>
-      <w:pPr>
-        <w:numPr>
-          <w:ilvl w:val="0"/>
-          <w:numId w:val="45"/>
-        </w:numPr>
-      </w:pPr>
-      <w:r>
-        <w:t>vagy hozza létre új fiókját a regisztrációs oldalon.</w:t>
-      </w:r>
-    </w:p>
-    <w:p>
-      <w:pPr>
-        <w:pStyle w:val="Cmsor3"/>
-        <w:rPr>
-          <w:b/>
-          <w:bCs/>
-        </w:rPr>
-      </w:pPr>
-      <w:bookmarkStart w:id="48" w:name="_Toc225437748"/>
-      <w:r>
-        <w:t xml:space="preserve">14.1.4 </w:t>
-      </w:r>
-      <w:r>
-        <w:rPr>
-          <w:b/>
-          <w:bCs/>
-        </w:rPr>
-        <w:t>Hibás Jelszó a Bejelentkezésnél</w:t>
-      </w:r>
-      <w:bookmarkEnd w:id="48"/>
-    </w:p>
-    <w:p>
-      <w:r>
-        <w:rPr>
-          <w:noProof/>
-          <w14:ligatures w14:val="standardContextual"/>
-        </w:rPr>
-        <w:drawing>
-          <wp:anchor distT="0" distB="0" distL="114300" distR="114300" simplePos="0" relativeHeight="251670528" behindDoc="0" locked="0" layoutInCell="1" allowOverlap="1" wp14:anchorId="4CC74842" wp14:editId="65BBA693">
-            <wp:simplePos x="0" y="0"/>
-            <wp:positionH relativeFrom="margin">
-              <wp:align>left</wp:align>
-            </wp:positionH>
-            <wp:positionV relativeFrom="paragraph">
-              <wp:posOffset>14569</wp:posOffset>
-            </wp:positionV>
-            <wp:extent cx="3185220" cy="2613804"/>
-            <wp:effectExtent l="0" t="0" r="0" b="0"/>
-            <wp:wrapSquare wrapText="bothSides"/>
-            <wp:docPr id="15" name="Kép 15"/>
+            <wp:docPr id="13" name="Kép 13"/>
             <wp:cNvGraphicFramePr>
               <a:graphicFrameLocks xmlns:a="http://schemas.openxmlformats.org/drawingml/2006/main" noChangeAspect="1"/>
             </wp:cNvGraphicFramePr>
@@ -17097,6 +17432,271 @@
                   <pic:spPr>
                     <a:xfrm>
                       <a:off x="0" y="0"/>
+                      <a:ext cx="3414395" cy="3010535"/>
+                    </a:xfrm>
+                    <a:prstGeom prst="rect">
+                      <a:avLst/>
+                    </a:prstGeom>
+                  </pic:spPr>
+                </pic:pic>
+              </a:graphicData>
+            </a:graphic>
+          </wp:anchor>
+        </w:drawing>
+      </w:r>
+      <w:r>
+        <w:t>Ez a hibaüzenet akkor jelenik meg, amikor a felhasználó kitölti az email mezőt, de a jelszó mezőt üresen hagyja, és így próbál belépni. A kliensoldali validáció ellenőrzi a kötelező mezőket, ezért a rendszer nem indítja el a bejelentkezési kérést, amíg a jelszó nincs megadva.</w:t>
+      </w:r>
+    </w:p>
+    <w:p>
+      <w:r>
+        <w:t>A „</w:t>
+      </w:r>
+      <w:r>
+        <w:rPr>
+          <w:b/>
+          <w:bCs/>
+        </w:rPr>
+        <w:t xml:space="preserve">Kérlek add meg a </w:t>
+      </w:r>
+      <w:proofErr w:type="spellStart"/>
+      <w:r>
+        <w:rPr>
+          <w:b/>
+          <w:bCs/>
+        </w:rPr>
+        <w:t>jelszavadat</w:t>
+      </w:r>
+      <w:proofErr w:type="spellEnd"/>
+      <w:r>
+        <w:rPr>
+          <w:b/>
+          <w:bCs/>
+        </w:rPr>
+        <w:t>.</w:t>
+      </w:r>
+      <w:r>
+        <w:t>” üzenet célja, hogy azonnali, egyértelmű visszajelzést adjon a hiányzó adat pótlásához. Ez javítja a felhasználói élményt, csökkenti a hibás beküldések számát, és megelőzi a felesleges szerveroldali terhelést.</w:t>
+      </w:r>
+    </w:p>
+    <w:p/>
+    <w:p>
+      <w:pPr>
+        <w:pStyle w:val="Cmsor3"/>
+      </w:pPr>
+      <w:bookmarkStart w:id="49" w:name="_Toc225478213"/>
+      <w:r>
+        <w:t xml:space="preserve">14.1.3 </w:t>
+      </w:r>
+      <w:r>
+        <w:rPr>
+          <w:b/>
+          <w:bCs/>
+        </w:rPr>
+        <w:t>Nem Létező Fiók (Bejelentkezési Hiba)</w:t>
+      </w:r>
+      <w:bookmarkEnd w:id="49"/>
+    </w:p>
+    <w:p>
+      <w:r>
+        <w:rPr>
+          <w:noProof/>
+          <w14:ligatures w14:val="standardContextual"/>
+        </w:rPr>
+        <w:drawing>
+          <wp:anchor distT="0" distB="0" distL="114300" distR="114300" simplePos="0" relativeHeight="251669504" behindDoc="0" locked="0" layoutInCell="1" allowOverlap="1" wp14:anchorId="5C0B8CC3" wp14:editId="17FE4D4B">
+            <wp:simplePos x="0" y="0"/>
+            <wp:positionH relativeFrom="margin">
+              <wp:align>left</wp:align>
+            </wp:positionH>
+            <wp:positionV relativeFrom="paragraph">
+              <wp:posOffset>12975</wp:posOffset>
+            </wp:positionV>
+            <wp:extent cx="3056890" cy="2484120"/>
+            <wp:effectExtent l="0" t="0" r="0" b="0"/>
+            <wp:wrapSquare wrapText="bothSides"/>
+            <wp:docPr id="14" name="Kép 14"/>
+            <wp:cNvGraphicFramePr>
+              <a:graphicFrameLocks xmlns:a="http://schemas.openxmlformats.org/drawingml/2006/main" noChangeAspect="1"/>
+            </wp:cNvGraphicFramePr>
+            <a:graphic xmlns:a="http://schemas.openxmlformats.org/drawingml/2006/main">
+              <a:graphicData uri="http://schemas.openxmlformats.org/drawingml/2006/picture">
+                <pic:pic xmlns:pic="http://schemas.openxmlformats.org/drawingml/2006/picture">
+                  <pic:nvPicPr>
+                    <pic:cNvPr id="1" name=""/>
+                    <pic:cNvPicPr/>
+                  </pic:nvPicPr>
+                  <pic:blipFill>
+                    <a:blip r:embed="rId38">
+                      <a:extLst>
+                        <a:ext uri="{28A0092B-C50C-407E-A947-70E740481C1C}">
+                          <a14:useLocalDpi xmlns:a14="http://schemas.microsoft.com/office/drawing/2010/main" val="0"/>
+                        </a:ext>
+                      </a:extLst>
+                    </a:blip>
+                    <a:stretch>
+                      <a:fillRect/>
+                    </a:stretch>
+                  </pic:blipFill>
+                  <pic:spPr>
+                    <a:xfrm>
+                      <a:off x="0" y="0"/>
+                      <a:ext cx="3056890" cy="2484120"/>
+                    </a:xfrm>
+                    <a:prstGeom prst="rect">
+                      <a:avLst/>
+                    </a:prstGeom>
+                  </pic:spPr>
+                </pic:pic>
+              </a:graphicData>
+            </a:graphic>
+          </wp:anchor>
+        </w:drawing>
+      </w:r>
+      <w:r>
+        <w:t>Ez a hibaüzenet akkor jelenik meg, amikor a megadott email címhez nem tartozik regisztrált felhasználói fiók a rendszerben. A backend ilyenkor nem tudja azonosítani a felhasználót, ezért a bejelentkezést elutasítja, és visszajelzi: </w:t>
+      </w:r>
+      <w:r>
+        <w:rPr>
+          <w:b/>
+          <w:bCs/>
+        </w:rPr>
+        <w:t>„A fiókját nem találtuk. Ellenőrizd az email címet.”</w:t>
+      </w:r>
+    </w:p>
+    <w:p>
+      <w:pPr>
+        <w:spacing w:before="0"/>
+      </w:pPr>
+      <w:r>
+        <w:t>A hiba célja, hogy egyértelműen jelezze: a probléma nem a jelszóval, hanem az email-címhez tartozó fiók hiányával kapcsolatos.</w:t>
+      </w:r>
+      <w:r>
+        <w:t xml:space="preserve"> </w:t>
+      </w:r>
+    </w:p>
+    <w:p>
+      <w:pPr>
+        <w:spacing w:before="0"/>
+      </w:pPr>
+    </w:p>
+    <w:p>
+      <w:pPr>
+        <w:spacing w:before="0"/>
+        <w:rPr>
+          <w:b/>
+          <w:bCs/>
+        </w:rPr>
+      </w:pPr>
+      <w:r>
+        <w:rPr>
+          <w:b/>
+          <w:bCs/>
+        </w:rPr>
+        <w:lastRenderedPageBreak/>
+        <w:t>Ilyen esetben a felhasználó:</w:t>
+      </w:r>
+    </w:p>
+    <w:p>
+      <w:pPr>
+        <w:pStyle w:val="Listaszerbekezds"/>
+        <w:numPr>
+          <w:ilvl w:val="0"/>
+          <w:numId w:val="45"/>
+        </w:numPr>
+        <w:spacing w:before="0"/>
+      </w:pPr>
+      <w:r>
+        <w:t>ellenőrizze az email cím helyesírását,</w:t>
+      </w:r>
+    </w:p>
+    <w:p>
+      <w:pPr>
+        <w:numPr>
+          <w:ilvl w:val="0"/>
+          <w:numId w:val="45"/>
+        </w:numPr>
+      </w:pPr>
+      <w:r>
+        <w:t>próbáljon másik, korábban használt email címet,</w:t>
+      </w:r>
+    </w:p>
+    <w:p>
+      <w:pPr>
+        <w:numPr>
+          <w:ilvl w:val="0"/>
+          <w:numId w:val="45"/>
+        </w:numPr>
+      </w:pPr>
+      <w:r>
+        <w:t>vagy hozza létre új fiókját a regisztrációs oldalon.</w:t>
+      </w:r>
+    </w:p>
+    <w:p>
+      <w:pPr>
+        <w:pStyle w:val="Cmsor3"/>
+        <w:rPr>
+          <w:b/>
+          <w:bCs/>
+        </w:rPr>
+      </w:pPr>
+      <w:bookmarkStart w:id="50" w:name="_Toc225478214"/>
+      <w:r>
+        <w:t xml:space="preserve">14.1.4 </w:t>
+      </w:r>
+      <w:r>
+        <w:rPr>
+          <w:b/>
+          <w:bCs/>
+        </w:rPr>
+        <w:t>Hibás Jelszó a Bejelentkezésnél</w:t>
+      </w:r>
+      <w:bookmarkEnd w:id="50"/>
+    </w:p>
+    <w:p>
+      <w:r>
+        <w:rPr>
+          <w:noProof/>
+          <w14:ligatures w14:val="standardContextual"/>
+        </w:rPr>
+        <w:drawing>
+          <wp:anchor distT="0" distB="0" distL="114300" distR="114300" simplePos="0" relativeHeight="251670528" behindDoc="0" locked="0" layoutInCell="1" allowOverlap="1" wp14:anchorId="4CC74842" wp14:editId="65BBA693">
+            <wp:simplePos x="0" y="0"/>
+            <wp:positionH relativeFrom="margin">
+              <wp:align>left</wp:align>
+            </wp:positionH>
+            <wp:positionV relativeFrom="paragraph">
+              <wp:posOffset>14569</wp:posOffset>
+            </wp:positionV>
+            <wp:extent cx="3185220" cy="2613804"/>
+            <wp:effectExtent l="0" t="0" r="0" b="0"/>
+            <wp:wrapSquare wrapText="bothSides"/>
+            <wp:docPr id="15" name="Kép 15"/>
+            <wp:cNvGraphicFramePr>
+              <a:graphicFrameLocks xmlns:a="http://schemas.openxmlformats.org/drawingml/2006/main" noChangeAspect="1"/>
+            </wp:cNvGraphicFramePr>
+            <a:graphic xmlns:a="http://schemas.openxmlformats.org/drawingml/2006/main">
+              <a:graphicData uri="http://schemas.openxmlformats.org/drawingml/2006/picture">
+                <pic:pic xmlns:pic="http://schemas.openxmlformats.org/drawingml/2006/picture">
+                  <pic:nvPicPr>
+                    <pic:cNvPr id="1" name=""/>
+                    <pic:cNvPicPr/>
+                  </pic:nvPicPr>
+                  <pic:blipFill>
+                    <a:blip r:embed="rId39">
+                      <a:extLst>
+                        <a:ext uri="{28A0092B-C50C-407E-A947-70E740481C1C}">
+                          <a14:useLocalDpi xmlns:a14="http://schemas.microsoft.com/office/drawing/2010/main" val="0"/>
+                        </a:ext>
+                      </a:extLst>
+                    </a:blip>
+                    <a:stretch>
+                      <a:fillRect/>
+                    </a:stretch>
+                  </pic:blipFill>
+                  <pic:spPr>
+                    <a:xfrm>
+                      <a:off x="0" y="0"/>
                       <a:ext cx="3185220" cy="2613804"/>
                     </a:xfrm>
                     <a:prstGeom prst="rect">
@@ -17200,7 +17800,7 @@
       <w:pPr>
         <w:pStyle w:val="Cmsor1"/>
       </w:pPr>
-      <w:bookmarkStart w:id="49" w:name="_Toc225437749"/>
+      <w:bookmarkStart w:id="51" w:name="_Toc225478215"/>
       <w:r>
         <w:rPr>
           <w:noProof/>
@@ -17231,7 +17831,7 @@
                     <pic:cNvPicPr/>
                   </pic:nvPicPr>
                   <pic:blipFill>
-                    <a:blip r:embed="rId38" cstate="print">
+                    <a:blip r:embed="rId40" cstate="print">
                       <a:extLst>
                         <a:ext uri="{28A0092B-C50C-407E-A947-70E740481C1C}">
                           <a14:useLocalDpi xmlns:a14="http://schemas.microsoft.com/office/drawing/2010/main" val="0"/>
@@ -17269,7 +17869,7 @@
       <w:r>
         <w:t>Szerepköralapú Regisztrációs Folyamat (Felhasználó és Autómentő)</w:t>
       </w:r>
-      <w:bookmarkEnd w:id="49"/>
+      <w:bookmarkEnd w:id="51"/>
     </w:p>
     <w:p>
       <w:pPr>
@@ -17306,7 +17906,7 @@
                     <pic:cNvPicPr/>
                   </pic:nvPicPr>
                   <pic:blipFill>
-                    <a:blip r:embed="rId39">
+                    <a:blip r:embed="rId41">
                       <a:extLst>
                         <a:ext uri="{28A0092B-C50C-407E-A947-70E740481C1C}">
                           <a14:useLocalDpi xmlns:a14="http://schemas.microsoft.com/office/drawing/2010/main" val="0"/>
@@ -17507,7 +18107,7 @@
       <w:pPr>
         <w:pStyle w:val="Cmsor3"/>
       </w:pPr>
-      <w:bookmarkStart w:id="50" w:name="_Toc225437750"/>
+      <w:bookmarkStart w:id="52" w:name="_Toc225478216"/>
       <w:r>
         <w:rPr>
           <w:noProof/>
@@ -17537,7 +18137,7 @@
                     <pic:cNvPicPr/>
                   </pic:nvPicPr>
                   <pic:blipFill>
-                    <a:blip r:embed="rId40">
+                    <a:blip r:embed="rId42">
                       <a:extLst>
                         <a:ext uri="{28A0092B-C50C-407E-A947-70E740481C1C}">
                           <a14:useLocalDpi xmlns:a14="http://schemas.microsoft.com/office/drawing/2010/main" val="0"/>
@@ -17575,7 +18175,7 @@
       <w:r>
         <w:t>Hibás Email Formátum Regisztrációnál</w:t>
       </w:r>
-      <w:bookmarkEnd w:id="50"/>
+      <w:bookmarkEnd w:id="52"/>
     </w:p>
     <w:p>
       <w:r>
@@ -17607,7 +18207,7 @@
         </w:rPr>
         <w:t>Kérlek érvényes email címet adj meg (pl. </w:t>
       </w:r>
-      <w:hyperlink r:id="rId41" w:tgtFrame="_blank" w:history="1">
+      <w:hyperlink r:id="rId43" w:tgtFrame="_blank" w:history="1">
         <w:r>
           <w:rPr>
             <w:rStyle w:val="Hiperhivatkozs"/>
@@ -17664,7 +18264,7 @@
           <w:noProof/>
         </w:rPr>
       </w:pPr>
-      <w:bookmarkStart w:id="51" w:name="_Toc225437751"/>
+      <w:bookmarkStart w:id="53" w:name="_Toc225478217"/>
       <w:r>
         <w:rPr>
           <w:noProof/>
@@ -17678,7 +18278,7 @@
         </w:rPr>
         <w:t>Hiányzó Jelszó Regisztrációnál</w:t>
       </w:r>
-      <w:bookmarkEnd w:id="51"/>
+      <w:bookmarkEnd w:id="53"/>
     </w:p>
     <w:p>
       <w:r>
@@ -17710,7 +18310,7 @@
                     <pic:cNvPicPr/>
                   </pic:nvPicPr>
                   <pic:blipFill>
-                    <a:blip r:embed="rId42">
+                    <a:blip r:embed="rId44">
                       <a:extLst>
                         <a:ext uri="{28A0092B-C50C-407E-A947-70E740481C1C}">
                           <a14:useLocalDpi xmlns:a14="http://schemas.microsoft.com/office/drawing/2010/main" val="0"/>
@@ -17803,7 +18403,7 @@
       <w:pPr>
         <w:pStyle w:val="Cmsor2"/>
       </w:pPr>
-      <w:bookmarkStart w:id="52" w:name="_Toc225437752"/>
+      <w:bookmarkStart w:id="54" w:name="_Toc225478218"/>
       <w:r>
         <w:lastRenderedPageBreak/>
         <w:t>14.</w:t>
@@ -17814,7 +18414,7 @@
       <w:r>
         <w:t xml:space="preserve"> Mentési folyamat rövid folyamatábrája (szöveges)</w:t>
       </w:r>
-      <w:bookmarkEnd w:id="52"/>
+      <w:bookmarkEnd w:id="54"/>
     </w:p>
     <w:p>
       <w:pPr>
@@ -18006,7 +18606,7 @@
       <w:pPr>
         <w:pStyle w:val="Cmsor2"/>
       </w:pPr>
-      <w:bookmarkStart w:id="53" w:name="_Toc225437753"/>
+      <w:bookmarkStart w:id="55" w:name="_Toc225478219"/>
       <w:r>
         <w:lastRenderedPageBreak/>
         <w:t>14.</w:t>
@@ -18017,7 +18617,7 @@
       <w:r>
         <w:t xml:space="preserve"> ER-diagram leírás</w:t>
       </w:r>
-      <w:bookmarkEnd w:id="53"/>
+      <w:bookmarkEnd w:id="55"/>
     </w:p>
     <w:p>
       <w:r>
@@ -18361,7 +18961,7 @@
       </w:r>
     </w:p>
     <w:sectPr>
-      <w:footerReference w:type="default" r:id="rId43"/>
+      <w:footerReference w:type="default" r:id="rId45"/>
       <w:pgSz w:w="11906" w:h="16838"/>
       <w:pgMar w:top="1417" w:right="1417" w:bottom="1417" w:left="1417" w:header="708" w:footer="708" w:gutter="0"/>
       <w:cols w:space="708"/>
@@ -28100,7 +28700,6 @@
   <w:style w:type="character" w:default="1" w:styleId="Bekezdsalapbettpusa">
     <w:name w:val="Default Paragraph Font"/>
     <w:uiPriority w:val="1"/>
-    <w:semiHidden/>
     <w:unhideWhenUsed/>
   </w:style>
   <w:style w:type="table" w:default="1" w:styleId="Normltblzat">

</xml_diff>